<commit_message>
Retitle: lead with the strongest finding (adaptation-not-pricing regime map)
Co-Authored-By: Claude Fable 5 <noreply@anthropic.com>
</commit_message>
<xml_diff>
--- a/paper.docx
+++ b/paper.docx
@@ -10,13 +10,13 @@
         <w:t xml:space="preserve">Preprint</w:t>
       </w:r>
     </w:p>
-    <w:bookmarkStart w:id="20" w:name="segment-where-the-interaction-persists"/>
+    <w:bookmarkStart w:id="20" w:name="Xf412bff8dcfbc0e48e9f6e1cef2b81bff2cd076"/>
     <w:p>
       <w:pPr>
         <w:pStyle w:val="Heading1"/>
       </w:pPr>
       <w:r>
-        <w:t xml:space="preserve">Segment Where the Interaction Persists</w:t>
+        <w:t xml:space="preserve">Adaptation, Not Pricing, Fails Under Contention</w:t>
       </w:r>
     </w:p>
     <w:p>
@@ -24,7 +24,7 @@
         <w:pStyle w:val="FirstParagraph"/>
       </w:pPr>
       <w:r>
-        <w:t xml:space="preserve">What public advertising logs reveal about plan-based impression allocation: a pre-committable segmentation rule, a bias-audited replay protocol, and a regime map for when planning pays.</w:t>
+        <w:t xml:space="preserve">A replay-based regime map for plan-based impression allocation on public advertising logs: a pre-committable segmentation rule, a bias-audited replay protocol, and the finding that online dual-price adaptation, not per-campaign pricing, is what collapses under over-subscription.</w:t>
       </w:r>
     </w:p>
     <w:p>

</xml_diff>

<commit_message>
Title: Segment Where the Interaction Persists; subtitle Planning, Pacing, and a Regime Map from Public Advertising Logs
Co-Authored-By: Claude Fable 5 <noreply@anthropic.com>
</commit_message>
<xml_diff>
--- a/paper.docx
+++ b/paper.docx
@@ -10,13 +10,13 @@
         <w:t xml:space="preserve">Preprint</w:t>
       </w:r>
     </w:p>
-    <w:bookmarkStart w:id="20" w:name="Xf412bff8dcfbc0e48e9f6e1cef2b81bff2cd076"/>
+    <w:bookmarkStart w:id="20" w:name="segment-where-the-interaction-persists"/>
     <w:p>
       <w:pPr>
         <w:pStyle w:val="Heading1"/>
       </w:pPr>
       <w:r>
-        <w:t xml:space="preserve">Adaptation, Not Pricing, Fails Under Contention</w:t>
+        <w:t xml:space="preserve">Segment Where the Interaction Persists</w:t>
       </w:r>
     </w:p>
     <w:p>
@@ -24,7 +24,7 @@
         <w:pStyle w:val="FirstParagraph"/>
       </w:pPr>
       <w:r>
-        <w:t xml:space="preserve">A replay-based regime map for plan-based impression allocation on public advertising logs: a pre-committable segmentation rule, a bias-audited replay protocol, and the finding that online dual-price adaptation, not per-campaign pricing, is what collapses under over-subscription.</w:t>
+        <w:t xml:space="preserve">Planning, Pacing, and a Regime Map from Public Advertising Logs.</w:t>
       </w:r>
     </w:p>
     <w:p>

</xml_diff>

<commit_message>
Two-author byline with affiliations; final editorial polish (abstract clarity, figure caption order, arc, consistency check)
Co-Authored-By: Claude Fable 5 <noreply@anthropic.com>
</commit_message>
<xml_diff>
--- a/paper.docx
+++ b/paper.docx
@@ -32,7 +32,48 @@
         <w:pStyle w:val="BodyText"/>
       </w:pPr>
       <w:r>
-        <w:t xml:space="preserve">Alexander Apartsin · August 2026</w:t>
+        <w:t xml:space="preserve">Alexander Apartsin</w:t>
+      </w:r>
+      <w:r>
+        <w:rPr>
+          <w:vertAlign w:val="superscript"/>
+        </w:rPr>
+        <w:t xml:space="preserve">1</w:t>
+      </w:r>
+      <w:r>
+        <w:t xml:space="preserve"> · Yehudit Aperstein</w:t>
+      </w:r>
+      <w:r>
+        <w:rPr>
+          <w:vertAlign w:val="superscript"/>
+        </w:rPr>
+        <w:t xml:space="preserve">2</w:t>
+      </w:r>
+    </w:p>
+    <w:p>
+      <w:pPr>
+        <w:pStyle w:val="BodyText"/>
+      </w:pPr>
+      <w:r>
+        <w:rPr>
+          <w:vertAlign w:val="superscript"/>
+        </w:rPr>
+        <w:t xml:space="preserve">1</w:t>
+      </w:r>
+      <w:r>
+        <w:t xml:space="preserve">School of Computer Science, Faculty of Sciences, Holon Institute of Technology (HIT), Holon, Israel</w:t>
+      </w:r>
+      <w:r>
+        <w:br/>
+      </w:r>
+      <w:r>
+        <w:rPr>
+          <w:vertAlign w:val="superscript"/>
+        </w:rPr>
+        <w:t xml:space="preserve">2</w:t>
+      </w:r>
+      <w:r>
+        <w:t xml:space="preserve">Intelligent Systems, Afeka Academic College of Engineering, Tel-Aviv, Israel</w:t>
       </w:r>
     </w:p>
     <w:bookmarkEnd w:id="20"/>
@@ -50,7 +91,7 @@
         <w:pStyle w:val="FirstParagraph"/>
       </w:pPr>
       <w:r>
-        <w:t xml:space="preserve">Under fixed campaign quotas, impression allocation can exploit exactly one statistical object: campaign-by-segment interaction in click-through rate that persists across planning windows. Main effects are neutralized, campaign effects by the quotas and segment effects by supply. We give a pre-committable rule for choosing the segmentation an allocator should use: measure the persistence of double-centered interaction residuals across adjacent planning windows, segment only on the axes that persist, and set granularity in proportion to per-cell data density. On 26.6M impressions of the Taobao display-advertising log the rule, computed from planning-window data alone and without reference to replay outcomes, selects the configuration whose replay results then match the full ablation ordering: activity tiers pay, demographics and time do not, and finer granularity pays only while cells stay dense. On Avazu the rule ranks axes consistently, and the re-planning timescale it implies is confirmed at the boundary where a daily plan fails. A pre-registered application to a third log (Outbrain), with the configuration frozen before replay, transfers the rule’s persistence ranking but also shows its scope: persistence identifies exploitable axes, yet the realized lift is governed by contention, and an uncontended market yields little to allocate whatever the segmentation.</w:t>
+        <w:t xml:space="preserve">Under fixed campaign quotas, impression allocation can exploit exactly one statistical object: campaign-by-segment interaction in click-through rate that persists across planning windows. Main effects are neutralized: campaign effects by the quotas, segment effects by supply. We give a pre-committable rule for choosing the segmentation an allocator should use: measure the persistence of double-centered interaction residuals across adjacent planning windows, segment only on the axes that persist, and set granularity in proportion to per-cell data density. On 26.6M impressions of the Taobao display-advertising log, we compute the rule from planning-window data alone, without reference to replay outcomes. It selects the configuration whose replay results match the full ablation ordering: activity tiers pay, demographics and time do not, and finer granularity pays only while cells stay dense. On Avazu the rule ranks axes consistently, and the boundary where a daily plan fails confirms the re-planning timescale it implies. A pre-registered application to a third log (Outbrain), with the configuration frozen before replay, transfers the rule’s persistence ranking and marks its scope: persistence identifies exploitable axes, but contention governs the realized lift. An uncontended market yields little to allocate, whatever the segmentation.</w:t>
       </w:r>
     </w:p>
     <w:p>
@@ -58,7 +99,7 @@
         <w:pStyle w:val="BodyText"/>
       </w:pPr>
       <w:r>
-        <w:t xml:space="preserve">Evaluation uses a replay protocol hardened against the traps we document: single-model replay inflates lift through a winner’s curse, and our dual-model scoring, exact uniform-null control, support and fatigue audits, user-clustered inference (headline z = 4.55), and a propensity-weighted outcome bracket delimit what public logs can and cannot show. The protocol yields a regime map. At exact feasibility, plan-informed policies beat greedy serving by 3.5–4.7% expected clicks and information-matched, feasibility-aware dual-price pacing nearly matches them. under over-subscription (quotas at 110–150% of supply)</w:t>
+        <w:t xml:space="preserve">Evaluation uses a replay protocol hardened against a trap we document: single-model replay inflates lift through a winner’s curse. Dual-model scoring, an exact uniform-null control, support and fatigue audits, user-clustered inference (headline z = 4.55), and a propensity-weighted outcome bracket delimit what public logs can and cannot show. The protocol yields a regime map. At exact feasibility, plan-informed policies beat greedy serving by 3.5–4.7% expected clicks, and information-matched, feasibility-aware dual-price pacing nearly matches them. Under over-subscription (quotas at 110–150% of supply),</w:t>
       </w:r>
       <w:r>
         <w:t xml:space="preserve"> </w:t>
@@ -74,7 +115,7 @@
         <w:t xml:space="preserve"> </w:t>
       </w:r>
       <w:r>
-        <w:t xml:space="preserve">dual-price pacing collapses below greedy, but a fixed dual policy pinned at the LP’s optimal prices stays positive and tracks the re-solved plan, isolating online scalar adaptation, not per-campaign pricing, as the failure; the periodically re-solved plan dominates every regime (+2.2 to +4.4% over greedy, z ≥ 3.4). The full ordering reproduces on a second, independent dataset (Outbrain, 87M impressions), where the adaptive collapse deepens to −44% while re-solving stays positive. The model-scored gains resist fatigue and support audits; grounding them in realized outcomes, however, is inconclusive on the small logging-matched subset, an inherent limit of public-log evaluation.</w:t>
+        <w:t xml:space="preserve">dual-price pacing collapses below greedy, while a fixed dual policy pinned at the LP’s optimal prices stays positive and tracks the re-solved plan; the failure is online scalar adaptation, not per-campaign pricing. The periodically re-solved plan dominates every regime (+2.2 to +4.4% over greedy, z ≥ 3.4). The full ordering reproduces on a second, independent dataset (Outbrain, 87M impressions), where the adaptive collapse deepens to −44% while re-solving stays positive. The model-scored gains resist fatigue and support audits. Grounding them in realized outcomes is inconclusive on the small logging-matched subset, an inherent limit of public-log evaluation.</w:t>
       </w:r>
     </w:p>
     <w:bookmarkEnd w:id="21"/>
@@ -164,7 +205,7 @@
         <w:t xml:space="preserve"> </w:t>
       </w:r>
       <w:r>
-        <w:t xml:space="preserve">and makes three contributions, each validated on public advertising logs. First, a pre-committable segmentation rule: measure the persistence of campaign-by-segment interaction residuals across adjacent planning windows, segment only on the axes that persist, and scale granularity to per-cell data density. Second, a replay evaluation protocol for allocation policies, hardened against the winner’s curse and selection artifacts that we show inflate naive replay. Third, a regime map locating where planning pays: plan-informed policies lead at exact feasibility and dominate outright under over-subscription, where dual-price adaptation collapses. Section 2 quantifies the cost of greedy serving on a minimal instance and Section 3 states the allocation program. Section 4 develops the replay protocol, Section 5 the persistence rule, and Section 6 the regime map. Section 7 calibrates the harness on a synthetic market with known ground truth, Section 8 presents the reference serving architecture that motivated the study, and Section 9 situates the work in the online-allocation and offline-evaluation literature.</w:t>
+        <w:t xml:space="preserve">and makes three contributions, each validated on public advertising logs. First, a pre-committable segmentation rule: measure the persistence of campaign-by-segment interaction residuals across adjacent planning windows, segment only on the axes that persist, and scale granularity to per-cell data density. Second, a replay evaluation protocol for allocation policies, hardened against the winner’s curse and selection artifacts that we show inflate naive replay. Third, a regime map locating where planning pays: plan-informed policies lead at exact feasibility and dominate outright under over-subscription, where dual-price adaptation collapses. Section 2 quantifies the cost of greedy serving on a minimal instance and Section 3 states the allocation program. Section 4 develops the replay protocol, Section 5 the persistence rule, and Section 6 the regime map. Section 7 calibrates the harness on a synthetic market with known ground truth, Section 8 presents the reference serving architecture that motivated the study, and Section 9 situates the work in the online-allocation and offline-evaluation literature. Sections 10 and 11 close with design principles and scope.</w:t>
       </w:r>
     </w:p>
     <w:bookmarkEnd w:id="22"/>
@@ -2336,7 +2377,7 @@
         <w:pStyle w:val="FirstParagraph"/>
       </w:pPr>
       <w:r>
-        <w:t xml:space="preserve">Before real logs, a fully synthetic market calibrates the harness where ground truth is known. The four-subscriber example of Section 2 proves the mechanism exists; a Monte-Carlo simulation quantifies it at realistic scale. Each replication generates a synthetic market: 60 segments with lognormal traffic (about 200,000 impression opportunities), 25 campaigns whose quotas sell 80% of expected inventory, per-impression prices drawn uniformly on [$0.05, $0.30] and per-click prices on [$0.50, $3.00], and click probabilities from a campaign-audience affinity model (each campaign genuinely fits some audiences better than others, with rates spanning 0.1%–8%). Each campaign is eligible, by targeting, on roughly 60% of segments.</w:t>
+        <w:t xml:space="preserve">Before any real log is replayed, a fully synthetic market calibrates the harness where ground truth is known. The four-subscriber example of Section 2 proves the mechanism exists; a Monte-Carlo simulation quantifies it at realistic scale. Each replication generates a synthetic market: 60 segments with lognormal traffic (about 200,000 impression opportunities), 25 campaigns whose quotas sell 80% of expected inventory, per-impression prices drawn uniformly on [$0.05, $0.30] and per-click prices on [$0.50, $3.00], and click probabilities from a campaign-audience affinity model (each campaign genuinely fits some audiences better than others, with rates spanning 0.1%–8%). Each campaign is eligible, by targeting, on roughly 60% of segments.</w:t>
       </w:r>
     </w:p>
     <w:p>
@@ -2720,7 +2761,7 @@
         <w:pStyle w:val="ImageCaption"/>
       </w:pPr>
       <w:r>
-        <w:t xml:space="preserve">Figure 5.</w:t>
+        <w:t xml:space="preserve">Figure 2.</w:t>
       </w:r>
       <w:r>
         <w:t xml:space="preserve"> </w:t>
@@ -4548,7 +4589,7 @@
         <w:pStyle w:val="ImageCaption"/>
       </w:pPr>
       <w:r>
-        <w:t xml:space="preserve">Figure 2.</w:t>
+        <w:t xml:space="preserve">Figure 3.</w:t>
       </w:r>
       <w:r>
         <w:t xml:space="preserve"> </w:t>
@@ -4816,7 +4857,7 @@
         <w:pStyle w:val="ImageCaption"/>
       </w:pPr>
       <w:r>
-        <w:t xml:space="preserve">Figure 3.</w:t>
+        <w:t xml:space="preserve">Figure 4.</w:t>
       </w:r>
       <w:r>
         <w:t xml:space="preserve"> </w:t>
@@ -5200,7 +5241,7 @@
         <w:pStyle w:val="ImageCaption"/>
       </w:pPr>
       <w:r>
-        <w:t xml:space="preserve">Figure 4.</w:t>
+        <w:t xml:space="preserve">Figure 5.</w:t>
       </w:r>
       <w:r>
         <w:t xml:space="preserve"> </w:t>

</xml_diff>

<commit_message>
IJOC redesign phase 1: Proposition 1 (interaction invariance), Algorithm 1 (PGSS, density-guided depth), dual mirror descent baselines with narrowed contention claim
Co-Authored-By: Claude Fable 5 <noreply@anthropic.com>
</commit_message>
<xml_diff>
--- a/paper.docx
+++ b/paper.docx
@@ -99,23 +99,7 @@
         <w:pStyle w:val="BodyText"/>
       </w:pPr>
       <w:r>
-        <w:t xml:space="preserve">Evaluation uses a replay protocol hardened against a trap we document: single-model replay inflates lift through a winner’s curse. Dual-model scoring, an exact uniform-null control, support and fatigue audits, user-clustered inference (headline z = 4.55), and a propensity-weighted outcome bracket delimit what public logs can and cannot show. The protocol yields a regime map. At exact feasibility, plan-informed policies beat greedy serving by 3.5–4.7% expected clicks, and information-matched, feasibility-aware dual-price pacing nearly matches them. Under over-subscription (quotas at 110–150% of supply),</w:t>
-      </w:r>
-      <w:r>
-        <w:t xml:space="preserve"> </w:t>
-      </w:r>
-      <w:r>
-        <w:rPr>
-          <w:i/>
-          <w:iCs/>
-        </w:rPr>
-        <w:t xml:space="preserve">adaptive</w:t>
-      </w:r>
-      <w:r>
-        <w:t xml:space="preserve"> </w:t>
-      </w:r>
-      <w:r>
-        <w:t xml:space="preserve">dual-price pacing collapses below greedy, while a fixed dual policy pinned at the LP’s optimal prices stays positive and tracks the re-solved plan; the failure is online scalar adaptation, not per-campaign pricing. The periodically re-solved plan dominates every regime (+2.2 to +4.4% over greedy, z ≥ 3.4). The full ordering reproduces on a second, independent dataset (Outbrain, 87M impressions), where the adaptive collapse deepens to −44% while re-solving stays positive. The model-scored gains resist fatigue and support audits. Grounding them in realized outcomes is inconclusive on the small logging-matched subset, an inherent limit of public-log evaluation.</w:t>
+        <w:t xml:space="preserve">Evaluation uses a replay protocol hardened against a trap we document: single-model replay inflates lift through a winner’s curse. Dual-model scoring, an exact uniform-null control, support and fatigue audits, user-clustered inference (headline z = 4.55), and a propensity-weighted outcome bracket delimit what public logs can and cannot show. The protocol yields a regime map. At exact feasibility, plan-informed policies beat greedy serving by 3.5–4.7% expected clicks, and information-matched, feasibility-aware dual-price pacing nearly matches them. Under over-subscription (quotas at 110–150% of supply), online price learning degrades along a spectrum: a scalar controller fails first, and even dual mirror descent, the state-of-the-art adaptive method, tracks the plan through moderate contention but falls below greedy under heavy over-subscription. A fixed dual pinned at the LP’s optimal prices stays positive throughout, so the failure is learning the prices online, not per-campaign pricing. The periodically re-solved plan dominates every regime (+2.2 to +4.4% over greedy, z ≥ 3.4). The ordering reproduces on a second, independent dataset (Outbrain, 87M impressions), where online pacing deepens to −44% while re-solving stays positive. The model-scored gains resist fatigue and support audits. Grounding them in realized outcomes is inconclusive on the small logging-matched subset, an inherent limit of public-log evaluation.</w:t>
       </w:r>
     </w:p>
     <w:bookmarkEnd w:id="21"/>
@@ -597,7 +581,7 @@
       </w:r>
     </w:p>
     <w:bookmarkEnd w:id="26"/>
-    <w:bookmarkStart w:id="27" w:name="formulation"/>
+    <w:bookmarkStart w:id="28" w:name="formulation"/>
     <w:p>
       <w:pPr>
         <w:pStyle w:val="Heading2"/>
@@ -978,17 +962,13 @@
         <w:t xml:space="preserve"> &gt; 0), and the impression-price term becomes a constant, making the allocation choice a pure expected-clicks problem; Section 6 studies the over-subscribed regime where this simplification fails. Second, the quota appears as an upper bound: when targeting and supply cannot fill a quota, the program returns the revenue-maximal under-delivery rather than infeasibility, and the shortfall is the input to make-good scheduling, which we treat as outside the model. Third, the quota constraint is what makes greedy serving inadequate: without it, serving every impression to its highest-value campaign would be optimal, and no planning stage would be needed.</w:t>
       </w:r>
     </w:p>
-    <w:bookmarkEnd w:id="27"/>
-    <w:bookmarkStart w:id="28" w:name="replay-evaluation-protocol"/>
-    <w:p>
-      <w:pPr>
-        <w:pStyle w:val="Heading2"/>
-      </w:pPr>
-      <w:r>
-        <w:t xml:space="preserve">4</w:t>
-      </w:r>
-      <w:r>
-        <w:t xml:space="preserve">Replay evaluation protocol</w:t>
+    <w:bookmarkStart w:id="27" w:name="Xb8b18ac5c60ec5742410ace98e579bc138671d3"/>
+    <w:p>
+      <w:pPr>
+        <w:pStyle w:val="Heading3"/>
+      </w:pPr>
+      <w:r>
+        <w:t xml:space="preserve">3.1 Interaction invariance under fixed margins</w:t>
       </w:r>
     </w:p>
     <w:p>
@@ -996,28 +976,42 @@
         <w:pStyle w:val="FirstParagraph"/>
       </w:pPr>
       <w:r>
-        <w:t xml:space="preserve">A synthetic market controls everything (Section 7); real logs control nothing, which is the point. The experiments of Sections 4–6 replay the public Taobao display-advertising dataset [2, 3]: 26.6 million impressions over 8 days in May 2017, roughly 1.1 million users with declared demographics, and explicit campaign identifiers, the closest public analog to an operator's data. The market is reconstructed from the log itself: campaigns are the top 100 by planning-window volume, each campaign’s quota is the number of impressions it actually received in the serving window, and policies re-pair the identical impression stream, so the counterfactual is</w:t>
-      </w:r>
-      <w:r>
-        <w:t xml:space="preserve"> </w:t>
-      </w:r>
-      <w:r>
-        <w:rPr>
-          <w:i/>
-          <w:iCs/>
-        </w:rPr>
-        <w:t xml:space="preserve">the same inventory, re-allocated</w:t>
-      </w:r>
-      <w:r>
-        <w:t xml:space="preserve">.</w:t>
-      </w:r>
-    </w:p>
-    <w:p>
-      <w:pPr>
-        <w:pStyle w:val="BodyText"/>
-      </w:pPr>
-      <w:r>
-        <w:t xml:space="preserve">Replay evaluation has a trap. If the table of click probabilities that the planner optimizes also scores the outcome, both the plan and the bound harvest the table’s estimation noise: in our first run the measured lift was +8.9% while the mean assignment value exceeded the best campaign’s true click rate, an impossibility. The design that survives this is</w:t>
+        <w:t xml:space="preserve">The value matrix admits an additive decomposition into a campaign main effect, a segment main effect, and an interaction residual,</w:t>
+      </w:r>
+    </w:p>
+    <w:p>
+      <w:pPr>
+        <w:pStyle w:val="SourceCode"/>
+      </w:pPr>
+      <w:r>
+        <w:rPr>
+          <w:rStyle w:val="VerbatimChar"/>
+        </w:rPr>
+        <w:t xml:space="preserve">vcs  =  ac  +  bs  +  gcs,</w:t>
+      </w:r>
+    </w:p>
+    <w:p>
+      <w:pPr>
+        <w:pStyle w:val="FirstParagraph"/>
+      </w:pPr>
+      <w:r>
+        <w:t xml:space="preserve">where</w:t>
+      </w:r>
+      <w:r>
+        <w:t xml:space="preserve"> </w:t>
+      </w:r>
+      <w:r>
+        <w:rPr>
+          <w:i/>
+          <w:iCs/>
+        </w:rPr>
+        <w:t xml:space="preserve">g</w:t>
+      </w:r>
+      <w:r>
+        <w:t xml:space="preserve"> </w:t>
+      </w:r>
+      <w:r>
+        <w:t xml:space="preserve">is</w:t>
       </w:r>
       <w:r>
         <w:t xml:space="preserve"> </w:t>
@@ -1027,19 +1021,887 @@
           <w:b/>
           <w:bCs/>
         </w:rPr>
-        <w:t xml:space="preserve">dual-model scoring</w:t>
-      </w:r>
-      <w:r>
-        <w:t xml:space="preserve">: policies plan and serve using only planning-window estimates, while all values, including the hindsight bound, are scored under an independent table fitted on the serving window. A uniform-probability control run then yields exactly 0.0% lift with every policy at exactly 100% of the bound, confirming the harness measures pairing quality and nothing else. Evaluation is</w:t>
-      </w:r>
-      <w:r>
-        <w:t xml:space="preserve"> </w:t>
-      </w:r>
+        <w:t xml:space="preserve">double-centered</w:t>
+      </w:r>
+      <w:r>
+        <w:t xml:space="preserve">: its supply-weighted average over segments is zero for every campaign, and over campaigns is zero for every segment. This decomposition is unique and always exists;</w:t>
+      </w:r>
+      <w:r>
+        <w:t xml:space="preserve"> </w:t>
+      </w:r>
+      <w:r>
+        <w:rPr>
+          <w:i/>
+          <w:iCs/>
+        </w:rPr>
+        <w:t xml:space="preserve">a</w:t>
+      </w:r>
+      <w:r>
+        <w:rPr>
+          <w:i/>
+          <w:iCs/>
+          <w:vertAlign w:val="subscript"/>
+        </w:rPr>
+        <w:t xml:space="preserve">c</w:t>
+      </w:r>
+      <w:r>
+        <w:t xml:space="preserve"> </w:t>
+      </w:r>
+      <w:r>
+        <w:t xml:space="preserve">is campaign</w:t>
+      </w:r>
+      <w:r>
+        <w:t xml:space="preserve"> </w:t>
+      </w:r>
+      <w:r>
+        <w:rPr>
+          <w:i/>
+          <w:iCs/>
+        </w:rPr>
+        <w:t xml:space="preserve">c</w:t>
+      </w:r>
+      <w:r>
+        <w:t xml:space="preserve">’s average value,</w:t>
+      </w:r>
+      <w:r>
+        <w:t xml:space="preserve"> </w:t>
+      </w:r>
+      <w:r>
+        <w:rPr>
+          <w:i/>
+          <w:iCs/>
+        </w:rPr>
+        <w:t xml:space="preserve">b</w:t>
+      </w:r>
+      <w:r>
+        <w:rPr>
+          <w:i/>
+          <w:iCs/>
+          <w:vertAlign w:val="subscript"/>
+        </w:rPr>
+        <w:t xml:space="preserve">s</w:t>
+      </w:r>
+      <w:r>
+        <w:t xml:space="preserve"> </w:t>
+      </w:r>
+      <w:r>
+        <w:t xml:space="preserve">segment</w:t>
+      </w:r>
+      <w:r>
+        <w:t xml:space="preserve"> </w:t>
+      </w:r>
+      <w:r>
+        <w:rPr>
+          <w:i/>
+          <w:iCs/>
+        </w:rPr>
+        <w:t xml:space="preserve">s</w:t>
+      </w:r>
+      <w:r>
+        <w:t xml:space="preserve">’s deviation, and</w:t>
+      </w:r>
+      <w:r>
+        <w:t xml:space="preserve"> </w:t>
+      </w:r>
+      <w:r>
+        <w:rPr>
+          <w:i/>
+          <w:iCs/>
+        </w:rPr>
+        <w:t xml:space="preserve">g</w:t>
+      </w:r>
+      <w:r>
+        <w:rPr>
+          <w:i/>
+          <w:iCs/>
+          <w:vertAlign w:val="subscript"/>
+        </w:rPr>
+        <w:t xml:space="preserve">cs</w:t>
+      </w:r>
+      <w:r>
+        <w:t xml:space="preserve"> </w:t>
+      </w:r>
+      <w:r>
+        <w:t xml:space="preserve">the part of the value specific to the pairing. The following fact is the paper’s conceptual backbone.</w:t>
+      </w:r>
+    </w:p>
+    <w:p>
+      <w:pPr>
+        <w:pStyle w:val="BodyText"/>
+      </w:pPr>
       <w:r>
         <w:rPr>
           <w:b/>
           <w:bCs/>
         </w:rPr>
+        <w:t xml:space="preserve">Proposition 1 (interaction invariance).</w:t>
+      </w:r>
+      <w:r>
+        <w:t xml:space="preserve"> </w:t>
+      </w:r>
+      <w:r>
+        <w:t xml:space="preserve">Let</w:t>
+      </w:r>
+      <w:r>
+        <w:t xml:space="preserve"> </w:t>
+      </w:r>
+      <w:r>
+        <w:rPr>
+          <w:i/>
+          <w:iCs/>
+        </w:rPr>
+        <w:t xml:space="preserve">x</w:t>
+      </w:r>
+      <w:r>
+        <w:t xml:space="preserve"> </w:t>
+      </w:r>
+      <w:r>
+        <w:t xml:space="preserve">and</w:t>
+      </w:r>
+      <w:r>
+        <w:t xml:space="preserve"> </w:t>
+      </w:r>
+      <w:r>
+        <w:rPr>
+          <w:i/>
+          <w:iCs/>
+        </w:rPr>
+        <w:t xml:space="preserve">x′</w:t>
+      </w:r>
+      <w:r>
+        <w:t xml:space="preserve"> </w:t>
+      </w:r>
+      <w:r>
+        <w:t xml:space="preserve">be any two feasible allocations with identical campaign margins (Σ</w:t>
+      </w:r>
+      <w:r>
+        <w:rPr>
+          <w:vertAlign w:val="subscript"/>
+        </w:rPr>
+        <w:t xml:space="preserve">s</w:t>
+      </w:r>
+      <w:r>
+        <w:t xml:space="preserve"> </w:t>
+      </w:r>
+      <w:r>
+        <w:t xml:space="preserve">x</w:t>
+      </w:r>
+      <w:r>
+        <w:rPr>
+          <w:vertAlign w:val="subscript"/>
+        </w:rPr>
+        <w:t xml:space="preserve">c,s</w:t>
+      </w:r>
+      <w:r>
+        <w:t xml:space="preserve"> </w:t>
+      </w:r>
+      <w:r>
+        <w:t xml:space="preserve">= Σ</w:t>
+      </w:r>
+      <w:r>
+        <w:rPr>
+          <w:vertAlign w:val="subscript"/>
+        </w:rPr>
+        <w:t xml:space="preserve">s</w:t>
+      </w:r>
+      <w:r>
+        <w:t xml:space="preserve"> </w:t>
+      </w:r>
+      <w:r>
+        <w:t xml:space="preserve">x′</w:t>
+      </w:r>
+      <w:r>
+        <w:rPr>
+          <w:vertAlign w:val="subscript"/>
+        </w:rPr>
+        <w:t xml:space="preserve">c,s</w:t>
+      </w:r>
+      <w:r>
+        <w:t xml:space="preserve"> </w:t>
+      </w:r>
+      <w:r>
+        <w:t xml:space="preserve">for every</w:t>
+      </w:r>
+      <w:r>
+        <w:t xml:space="preserve"> </w:t>
+      </w:r>
+      <w:r>
+        <w:rPr>
+          <w:i/>
+          <w:iCs/>
+        </w:rPr>
+        <w:t xml:space="preserve">c</w:t>
+      </w:r>
+      <w:r>
+        <w:t xml:space="preserve">) and identical segment margins (Σ</w:t>
+      </w:r>
+      <w:r>
+        <w:rPr>
+          <w:vertAlign w:val="subscript"/>
+        </w:rPr>
+        <w:t xml:space="preserve">c</w:t>
+      </w:r>
+      <w:r>
+        <w:t xml:space="preserve"> </w:t>
+      </w:r>
+      <w:r>
+        <w:t xml:space="preserve">x</w:t>
+      </w:r>
+      <w:r>
+        <w:rPr>
+          <w:vertAlign w:val="subscript"/>
+        </w:rPr>
+        <w:t xml:space="preserve">c,s</w:t>
+      </w:r>
+      <w:r>
+        <w:t xml:space="preserve"> </w:t>
+      </w:r>
+      <w:r>
+        <w:t xml:space="preserve">= Σ</w:t>
+      </w:r>
+      <w:r>
+        <w:rPr>
+          <w:vertAlign w:val="subscript"/>
+        </w:rPr>
+        <w:t xml:space="preserve">c</w:t>
+      </w:r>
+      <w:r>
+        <w:t xml:space="preserve"> </w:t>
+      </w:r>
+      <w:r>
+        <w:t xml:space="preserve">x′</w:t>
+      </w:r>
+      <w:r>
+        <w:rPr>
+          <w:vertAlign w:val="subscript"/>
+        </w:rPr>
+        <w:t xml:space="preserve">c,s</w:t>
+      </w:r>
+      <w:r>
+        <w:t xml:space="preserve"> </w:t>
+      </w:r>
+      <w:r>
+        <w:t xml:space="preserve">for every</w:t>
+      </w:r>
+      <w:r>
+        <w:t xml:space="preserve"> </w:t>
+      </w:r>
+      <w:r>
+        <w:rPr>
+          <w:i/>
+          <w:iCs/>
+        </w:rPr>
+        <w:t xml:space="preserve">s</w:t>
+      </w:r>
+      <w:r>
+        <w:t xml:space="preserve">). Then their values differ only through the interaction term:</w:t>
+      </w:r>
+    </w:p>
+    <w:p>
+      <w:pPr>
+        <w:pStyle w:val="SourceCode"/>
+      </w:pPr>
+      <w:r>
+        <w:rPr>
+          <w:rStyle w:val="VerbatimChar"/>
+        </w:rPr>
+        <w:t xml:space="preserve">V(x) − V(x′)  =  Σc,s ( xc,s − x′c,s ) · gc,s.</w:t>
+      </w:r>
+    </w:p>
+    <w:p>
+      <w:pPr>
+        <w:pStyle w:val="FirstParagraph"/>
+      </w:pPr>
+      <w:r>
+        <w:rPr>
+          <w:b/>
+          <w:bCs/>
+        </w:rPr>
+        <w:t xml:space="preserve">Proof.</w:t>
+      </w:r>
+      <w:r>
+        <w:t xml:space="preserve"> </w:t>
+      </w:r>
+      <w:r>
+        <w:t xml:space="preserve">Expanding the objective, V(x) = Σ</w:t>
+      </w:r>
+      <w:r>
+        <w:rPr>
+          <w:vertAlign w:val="subscript"/>
+        </w:rPr>
+        <w:t xml:space="preserve">c</w:t>
+      </w:r>
+      <w:r>
+        <w:t xml:space="preserve"> </w:t>
+      </w:r>
+      <w:r>
+        <w:t xml:space="preserve">a</w:t>
+      </w:r>
+      <w:r>
+        <w:rPr>
+          <w:vertAlign w:val="subscript"/>
+        </w:rPr>
+        <w:t xml:space="preserve">c</w:t>
+      </w:r>
+      <w:r>
+        <w:t xml:space="preserve"> </w:t>
+      </w:r>
+      <w:r>
+        <w:t xml:space="preserve">(Σ</w:t>
+      </w:r>
+      <w:r>
+        <w:rPr>
+          <w:vertAlign w:val="subscript"/>
+        </w:rPr>
+        <w:t xml:space="preserve">s</w:t>
+      </w:r>
+      <w:r>
+        <w:t xml:space="preserve"> </w:t>
+      </w:r>
+      <w:r>
+        <w:t xml:space="preserve">x</w:t>
+      </w:r>
+      <w:r>
+        <w:rPr>
+          <w:vertAlign w:val="subscript"/>
+        </w:rPr>
+        <w:t xml:space="preserve">c,s</w:t>
+      </w:r>
+      <w:r>
+        <w:t xml:space="preserve">) + Σ</w:t>
+      </w:r>
+      <w:r>
+        <w:rPr>
+          <w:vertAlign w:val="subscript"/>
+        </w:rPr>
+        <w:t xml:space="preserve">s</w:t>
+      </w:r>
+      <w:r>
+        <w:t xml:space="preserve"> </w:t>
+      </w:r>
+      <w:r>
+        <w:t xml:space="preserve">b</w:t>
+      </w:r>
+      <w:r>
+        <w:rPr>
+          <w:vertAlign w:val="subscript"/>
+        </w:rPr>
+        <w:t xml:space="preserve">s</w:t>
+      </w:r>
+      <w:r>
+        <w:t xml:space="preserve"> </w:t>
+      </w:r>
+      <w:r>
+        <w:t xml:space="preserve">(Σ</w:t>
+      </w:r>
+      <w:r>
+        <w:rPr>
+          <w:vertAlign w:val="subscript"/>
+        </w:rPr>
+        <w:t xml:space="preserve">c</w:t>
+      </w:r>
+      <w:r>
+        <w:t xml:space="preserve"> </w:t>
+      </w:r>
+      <w:r>
+        <w:t xml:space="preserve">x</w:t>
+      </w:r>
+      <w:r>
+        <w:rPr>
+          <w:vertAlign w:val="subscript"/>
+        </w:rPr>
+        <w:t xml:space="preserve">c,s</w:t>
+      </w:r>
+      <w:r>
+        <w:t xml:space="preserve">) + Σ</w:t>
+      </w:r>
+      <w:r>
+        <w:rPr>
+          <w:vertAlign w:val="subscript"/>
+        </w:rPr>
+        <w:t xml:space="preserve">c,s</w:t>
+      </w:r>
+      <w:r>
+        <w:t xml:space="preserve"> </w:t>
+      </w:r>
+      <w:r>
+        <w:t xml:space="preserve">x</w:t>
+      </w:r>
+      <w:r>
+        <w:rPr>
+          <w:vertAlign w:val="subscript"/>
+        </w:rPr>
+        <w:t xml:space="preserve">c,s</w:t>
+      </w:r>
+      <w:r>
+        <w:t xml:space="preserve"> </w:t>
+      </w:r>
+      <w:r>
+        <w:t xml:space="preserve">g</w:t>
+      </w:r>
+      <w:r>
+        <w:rPr>
+          <w:vertAlign w:val="subscript"/>
+        </w:rPr>
+        <w:t xml:space="preserve">c,s</w:t>
+      </w:r>
+      <w:r>
+        <w:t xml:space="preserve">. The first sum depends on</w:t>
+      </w:r>
+      <w:r>
+        <w:t xml:space="preserve"> </w:t>
+      </w:r>
+      <w:r>
+        <w:rPr>
+          <w:i/>
+          <w:iCs/>
+        </w:rPr>
+        <w:t xml:space="preserve">x</w:t>
+      </w:r>
+      <w:r>
+        <w:t xml:space="preserve"> </w:t>
+      </w:r>
+      <w:r>
+        <w:t xml:space="preserve">only through the campaign margins, the second only through the segment margins; both are held fixed, so they are equal for</w:t>
+      </w:r>
+      <w:r>
+        <w:t xml:space="preserve"> </w:t>
+      </w:r>
+      <w:r>
+        <w:rPr>
+          <w:i/>
+          <w:iCs/>
+        </w:rPr>
+        <w:t xml:space="preserve">x</w:t>
+      </w:r>
+      <w:r>
+        <w:t xml:space="preserve"> </w:t>
+      </w:r>
+      <w:r>
+        <w:t xml:space="preserve">and</w:t>
+      </w:r>
+      <w:r>
+        <w:t xml:space="preserve"> </w:t>
+      </w:r>
+      <w:r>
+        <w:rPr>
+          <w:i/>
+          <w:iCs/>
+        </w:rPr>
+        <w:t xml:space="preserve">x′</w:t>
+      </w:r>
+      <w:r>
+        <w:t xml:space="preserve"> </w:t>
+      </w:r>
+      <w:r>
+        <w:t xml:space="preserve">and cancel on subtraction. Only the interaction term remains. □</w:t>
+      </w:r>
+    </w:p>
+    <w:p>
+      <w:pPr>
+        <w:pStyle w:val="BodyText"/>
+      </w:pPr>
+      <w:r>
+        <w:t xml:space="preserve">The consequence is that</w:t>
+      </w:r>
+      <w:r>
+        <w:t xml:space="preserve"> </w:t>
+      </w:r>
+      <w:r>
+        <w:rPr>
+          <w:b/>
+          <w:bCs/>
+        </w:rPr>
+        <w:t xml:space="preserve">representation choice for allocation should target the stable interaction component, not marginal click-rate predictiveness</w:t>
+      </w:r>
+      <w:r>
+        <w:t xml:space="preserve">: a segmentation that sharpens the estimates of</w:t>
+      </w:r>
+      <w:r>
+        <w:t xml:space="preserve"> </w:t>
+      </w:r>
+      <w:r>
+        <w:rPr>
+          <w:i/>
+          <w:iCs/>
+        </w:rPr>
+        <w:t xml:space="preserve">a</w:t>
+      </w:r>
+      <w:r>
+        <w:rPr>
+          <w:i/>
+          <w:iCs/>
+          <w:vertAlign w:val="subscript"/>
+        </w:rPr>
+        <w:t xml:space="preserve">c</w:t>
+      </w:r>
+      <w:r>
+        <w:t xml:space="preserve"> </w:t>
+      </w:r>
+      <w:r>
+        <w:t xml:space="preserve">and</w:t>
+      </w:r>
+      <w:r>
+        <w:t xml:space="preserve"> </w:t>
+      </w:r>
+      <w:r>
+        <w:rPr>
+          <w:i/>
+          <w:iCs/>
+        </w:rPr>
+        <w:t xml:space="preserve">b</w:t>
+      </w:r>
+      <w:r>
+        <w:rPr>
+          <w:i/>
+          <w:iCs/>
+          <w:vertAlign w:val="subscript"/>
+        </w:rPr>
+        <w:t xml:space="preserve">s</w:t>
+      </w:r>
+      <w:r>
+        <w:t xml:space="preserve"> </w:t>
+      </w:r>
+      <w:r>
+        <w:t xml:space="preserve">but not of</w:t>
+      </w:r>
+      <w:r>
+        <w:t xml:space="preserve"> </w:t>
+      </w:r>
+      <w:r>
+        <w:rPr>
+          <w:i/>
+          <w:iCs/>
+        </w:rPr>
+        <w:t xml:space="preserve">g</w:t>
+      </w:r>
+      <w:r>
+        <w:rPr>
+          <w:i/>
+          <w:iCs/>
+          <w:vertAlign w:val="subscript"/>
+        </w:rPr>
+        <w:t xml:space="preserve">cs</w:t>
+      </w:r>
+      <w:r>
+        <w:t xml:space="preserve"> </w:t>
+      </w:r>
+      <w:r>
+        <w:t xml:space="preserve">cannot change a fixed-margin assignment, however much it improves overall CTR prediction. Section 5 turns this into a selection rule. Four corollaries fix the scope precisely.</w:t>
+      </w:r>
+    </w:p>
+    <w:p>
+      <w:pPr>
+        <w:pStyle w:val="Compact"/>
+        <w:numPr>
+          <w:ilvl w:val="0"/>
+          <w:numId w:val="1001"/>
+        </w:numPr>
+      </w:pPr>
+      <w:r>
+        <w:rPr>
+          <w:b/>
+          <w:bCs/>
+        </w:rPr>
+        <w:t xml:space="preserve">Click maximization.</w:t>
+      </w:r>
+      <w:r>
+        <w:t xml:space="preserve"> </w:t>
+      </w:r>
+      <w:r>
+        <w:t xml:space="preserve">With</w:t>
+      </w:r>
+      <w:r>
+        <w:t xml:space="preserve"> </w:t>
+      </w:r>
+      <w:r>
+        <w:rPr>
+          <w:i/>
+          <w:iCs/>
+        </w:rPr>
+        <w:t xml:space="preserve">v</w:t>
+      </w:r>
+      <w:r>
+        <w:rPr>
+          <w:i/>
+          <w:iCs/>
+          <w:vertAlign w:val="subscript"/>
+        </w:rPr>
+        <w:t xml:space="preserve">cs</w:t>
+      </w:r>
+      <w:r>
+        <w:rPr>
+          <w:i/>
+          <w:iCs/>
+        </w:rPr>
+        <w:t xml:space="preserve"> </w:t>
+      </w:r>
+      <w:r>
+        <w:rPr>
+          <w:i/>
+          <w:iCs/>
+        </w:rPr>
+        <w:t xml:space="preserve">= p</w:t>
+      </w:r>
+      <w:r>
+        <w:rPr>
+          <w:i/>
+          <w:iCs/>
+          <w:vertAlign w:val="subscript"/>
+        </w:rPr>
+        <w:t xml:space="preserve">cs</w:t>
+      </w:r>
+      <w:r>
+        <w:t xml:space="preserve">, the entire allocation value under fixed margins is carried by the interaction of click probability; campaign and segment average click rates are decision-irrelevant.</w:t>
+      </w:r>
+    </w:p>
+    <w:p>
+      <w:pPr>
+        <w:pStyle w:val="Compact"/>
+        <w:numPr>
+          <w:ilvl w:val="0"/>
+          <w:numId w:val="1001"/>
+        </w:numPr>
+      </w:pPr>
+      <w:r>
+        <w:rPr>
+          <w:b/>
+          <w:bCs/>
+        </w:rPr>
+        <w:t xml:space="preserve">Fixed per-impression contract value.</w:t>
+      </w:r>
+      <w:r>
+        <w:t xml:space="preserve"> </w:t>
+      </w:r>
+      <w:r>
+        <w:t xml:space="preserve">When campaign</w:t>
+      </w:r>
+      <w:r>
+        <w:t xml:space="preserve"> </w:t>
+      </w:r>
+      <w:r>
+        <w:rPr>
+          <w:i/>
+          <w:iCs/>
+        </w:rPr>
+        <w:t xml:space="preserve">c</w:t>
+      </w:r>
+      <w:r>
+        <w:t xml:space="preserve"> </w:t>
+      </w:r>
+      <w:r>
+        <w:t xml:space="preserve">pays a fixed</w:t>
+      </w:r>
+      <w:r>
+        <w:t xml:space="preserve"> </w:t>
+      </w:r>
+      <w:r>
+        <w:rPr>
+          <w:i/>
+          <w:iCs/>
+        </w:rPr>
+        <w:t xml:space="preserve">r</w:t>
+      </w:r>
+      <w:r>
+        <w:rPr>
+          <w:i/>
+          <w:iCs/>
+          <w:vertAlign w:val="subscript"/>
+        </w:rPr>
+        <w:t xml:space="preserve">c</w:t>
+      </w:r>
+      <w:r>
+        <w:t xml:space="preserve"> </w:t>
+      </w:r>
+      <w:r>
+        <w:t xml:space="preserve">per delivered impression, that revenue contributes Σ</w:t>
+      </w:r>
+      <w:r>
+        <w:rPr>
+          <w:vertAlign w:val="subscript"/>
+        </w:rPr>
+        <w:t xml:space="preserve">c</w:t>
+      </w:r>
+      <w:r>
+        <w:t xml:space="preserve"> </w:t>
+      </w:r>
+      <w:r>
+        <w:t xml:space="preserve">r</w:t>
+      </w:r>
+      <w:r>
+        <w:rPr>
+          <w:vertAlign w:val="subscript"/>
+        </w:rPr>
+        <w:t xml:space="preserve">c</w:t>
+      </w:r>
+      <w:r>
+        <w:t xml:space="preserve"> </w:t>
+      </w:r>
+      <w:r>
+        <w:t xml:space="preserve">Q</w:t>
+      </w:r>
+      <w:r>
+        <w:rPr>
+          <w:vertAlign w:val="subscript"/>
+        </w:rPr>
+        <w:t xml:space="preserve">c</w:t>
+      </w:r>
+      <w:r>
+        <w:t xml:space="preserve">, a constant under fixed campaign margins, and the allocation reduces to the expected-clicks problem, as noted above.</w:t>
+      </w:r>
+    </w:p>
+    <w:p>
+      <w:pPr>
+        <w:pStyle w:val="Compact"/>
+        <w:numPr>
+          <w:ilvl w:val="0"/>
+          <w:numId w:val="1001"/>
+        </w:numPr>
+      </w:pPr>
+      <w:r>
+        <w:rPr>
+          <w:b/>
+          <w:bCs/>
+        </w:rPr>
+        <w:t xml:space="preserve">Slack margins.</w:t>
+      </w:r>
+      <w:r>
+        <w:t xml:space="preserve"> </w:t>
+      </w:r>
+      <w:r>
+        <w:t xml:space="preserve">Segment margins are fixed by the arriving stream (supply is exogenous and identical across policies), so the segment main effect always cancels. If campaign quotas do not all bind, campaign totals differ between allocations and the campaign main effect re-enters, bounded by |V(x)−V(x′) − interaction term| ≤ ‖a‖</w:t>
+      </w:r>
+      <w:r>
+        <w:rPr>
+          <w:vertAlign w:val="subscript"/>
+        </w:rPr>
+        <w:t xml:space="preserve">∞</w:t>
+      </w:r>
+      <w:r>
+        <w:t xml:space="preserve"> </w:t>
+      </w:r>
+      <w:r>
+        <w:t xml:space="preserve">· ‖ΔQ‖</w:t>
+      </w:r>
+      <w:r>
+        <w:rPr>
+          <w:vertAlign w:val="subscript"/>
+        </w:rPr>
+        <w:t xml:space="preserve">1</w:t>
+      </w:r>
+      <w:r>
+        <w:t xml:space="preserve">, where ΔQ is the difference in delivered campaign totals. Interaction invariance is therefore exact under full delivery and degrades gracefully with the delivery gap.</w:t>
+      </w:r>
+    </w:p>
+    <w:p>
+      <w:pPr>
+        <w:pStyle w:val="Compact"/>
+        <w:numPr>
+          <w:ilvl w:val="0"/>
+          <w:numId w:val="1001"/>
+        </w:numPr>
+      </w:pPr>
+      <w:r>
+        <w:rPr>
+          <w:b/>
+          <w:bCs/>
+        </w:rPr>
+        <w:t xml:space="preserve">Over-subscription (Regime B).</w:t>
+      </w:r>
+      <w:r>
+        <w:t xml:space="preserve"> </w:t>
+      </w:r>
+      <w:r>
+        <w:t xml:space="preserve">When quotas exceed deliverable supply, campaign totals become endogenous, the bound above is loose, and a policy must decide which campaigns to under-deliver; the full objective (including</w:t>
+      </w:r>
+      <w:r>
+        <w:t xml:space="preserve"> </w:t>
+      </w:r>
+      <w:r>
+        <w:rPr>
+          <w:i/>
+          <w:iCs/>
+        </w:rPr>
+        <w:t xml:space="preserve">r</w:t>
+      </w:r>
+      <w:r>
+        <w:rPr>
+          <w:i/>
+          <w:iCs/>
+          <w:vertAlign w:val="subscript"/>
+        </w:rPr>
+        <w:t xml:space="preserve">c</w:t>
+      </w:r>
+      <w:r>
+        <w:t xml:space="preserve"> </w:t>
+      </w:r>
+      <w:r>
+        <w:t xml:space="preserve">and any under-delivery penalty) governs, and interaction invariance no longer applies. This is exactly the regime the contention experiments of Section 6 probe, and it is why policy orderings there differ from the feasible case.</w:t>
+      </w:r>
+    </w:p>
+    <w:bookmarkEnd w:id="27"/>
+    <w:bookmarkEnd w:id="28"/>
+    <w:bookmarkStart w:id="29" w:name="replay-evaluation-protocol"/>
+    <w:p>
+      <w:pPr>
+        <w:pStyle w:val="Heading2"/>
+      </w:pPr>
+      <w:r>
+        <w:t xml:space="preserve">4</w:t>
+      </w:r>
+      <w:r>
+        <w:t xml:space="preserve">Replay evaluation protocol</w:t>
+      </w:r>
+    </w:p>
+    <w:p>
+      <w:pPr>
+        <w:pStyle w:val="FirstParagraph"/>
+      </w:pPr>
+      <w:r>
+        <w:t xml:space="preserve">A synthetic market controls everything (Section 7); real logs control nothing, which is the point. The experiments of Sections 4–6 replay the public Taobao display-advertising dataset [2, 3]: 26.6 million impressions over 8 days in May 2017, roughly 1.1 million users with declared demographics, and explicit campaign identifiers, the closest public analog to an operator's data. The market is reconstructed from the log itself: campaigns are the top 100 by planning-window volume, each campaign’s quota is the number of impressions it actually received in the serving window, and policies re-pair the identical impression stream, so the counterfactual is</w:t>
+      </w:r>
+      <w:r>
+        <w:t xml:space="preserve"> </w:t>
+      </w:r>
+      <w:r>
+        <w:rPr>
+          <w:i/>
+          <w:iCs/>
+        </w:rPr>
+        <w:t xml:space="preserve">the same inventory, re-allocated</w:t>
+      </w:r>
+      <w:r>
+        <w:t xml:space="preserve">.</w:t>
+      </w:r>
+    </w:p>
+    <w:p>
+      <w:pPr>
+        <w:pStyle w:val="BodyText"/>
+      </w:pPr>
+      <w:r>
+        <w:t xml:space="preserve">Replay evaluation has a trap. If the table of click probabilities that the planner optimizes also scores the outcome, both the plan and the bound harvest the table’s estimation noise: in our first run the measured lift was +8.9% while the mean assignment value exceeded the best campaign’s true click rate, an impossibility. The design that survives this is</w:t>
+      </w:r>
+      <w:r>
+        <w:t xml:space="preserve"> </w:t>
+      </w:r>
+      <w:r>
+        <w:rPr>
+          <w:b/>
+          <w:bCs/>
+        </w:rPr>
+        <w:t xml:space="preserve">dual-model scoring</w:t>
+      </w:r>
+      <w:r>
+        <w:t xml:space="preserve">: policies plan and serve using only planning-window estimates, while all values, including the hindsight bound, are scored under an independent table fitted on the serving window. A uniform-probability control run then yields exactly 0.0% lift with every policy at exactly 100% of the bound, confirming the harness measures pairing quality and nothing else. Evaluation is</w:t>
+      </w:r>
+      <w:r>
+        <w:t xml:space="preserve"> </w:t>
+      </w:r>
+      <w:r>
+        <w:rPr>
+          <w:b/>
+          <w:bCs/>
+        </w:rPr>
         <w:t xml:space="preserve">walk-forward</w:t>
       </w:r>
       <w:r>
@@ -1100,8 +1962,8 @@
         <w:t xml:space="preserve"> − t/T) after each impression with η set to half the global click rate; it consults no plan. Reported errors are the scoring table’s closed-form binomial variance propagated through each comparison’s assignment difference; the across-fold spread of the five per-fold lifts independently reproduces the same standard error, and the all-folds-positive sign pattern supports the parametric statement distribution-free. The uniform control defends the harness; a further check defends the scorer itself: standardizing the scoring table along the strongest observable within-cell covariate the segmentation does not use (each user’s own training-window click propensity) shifts the headline lifts by at most +0.3pp, upward, so observable within-cell selection in the logged exposures does not account for the measured gains. Support is also measured directly: only 6% of the planned policy’s assignment mass (and 5% of the re-paired mass) lands in cells with fewer than 100 logged serving-window impressions, and scoring those thin cells with a pooled campaign-level fallback moves the headline from +3.46% to +2.99%; the counterfactual does not rest on extrapolated cells. (Forcing the fallback on all cells below 1,000 impressions, 78% of the mass, collapses the lift toward zero, as it must: a campaign-constant scorer deletes the interaction dimension, and under fixed quotas every assignment then scores equally, the same argument as the uniform control.) The replay isolates the architecture’s allocation core, plan against serving policy at segment granularity: every campaign is eligible on every segment, and the per-subscriber serving components of Section 8.2 (soft-membership blending, frequency caps, threshold pacing) operate below this granularity and are not exercised by these experiments.</w:t>
       </w:r>
     </w:p>
-    <w:bookmarkEnd w:id="28"/>
-    <w:bookmarkStart w:id="29" w:name="the-persistence-rule"/>
+    <w:bookmarkEnd w:id="29"/>
+    <w:bookmarkStart w:id="30" w:name="the-persistence-rule"/>
     <w:p>
       <w:pPr>
         <w:pStyle w:val="Heading2"/>
@@ -1118,7 +1980,7 @@
         <w:pStyle w:val="FirstParagraph"/>
       </w:pPr>
       <w:r>
-        <w:t xml:space="preserve">Allocation under fixed quotas can exploit exactly one thing: campaign-by-segment</w:t>
+        <w:t xml:space="preserve">Proposition 1 identifies the campaign-by-segment</w:t>
       </w:r>
       <w:r>
         <w:t xml:space="preserve"> </w:t>
@@ -1134,7 +1996,23 @@
         <w:t xml:space="preserve"> </w:t>
       </w:r>
       <w:r>
-        <w:t xml:space="preserve">in click probability that persists from the planning window to the serving window. Campaign main effects persist strongly (week-over-week correlation 0.81) but fixed quotas neutralize them; segment main effects are fixed by supply. Measuring the persistence of double-centered interaction residuals per candidate axis therefore predicts, from planning-window data alone, which segmentations can pay. The estimator is explicit. For a candidate axis, take two adjacent planning windows (here 8-day and 2-day slices of the training period) and, in each, form the empirical click rate of every (campaign, group) cell with at least 300 impressions in one window and 150 in the other. Double-center each window’s cell rates by subtracting the impression-weighted campaign mean and the impression-weighted group mean and adding back the grand mean, leaving the pure interaction residual. The axis’s persistence is the Pearson correlation of these residuals across the two windows over the shared cells; empty or below-threshold cells are dropped, not imputed. An axis is retained when its persistence exceeds its estimation-noise floor (the correlation a pair of independent binomial draws at the same cell counts would produce, near zero at these volumes). The measured persistences:</w:t>
+        <w:t xml:space="preserve">as the only exploitable object under fixed margins. Applying it across windows adds a requirement the proposition does not: the interaction is estimated on the planning window and used on the serving window, so it must also</w:t>
+      </w:r>
+      <w:r>
+        <w:t xml:space="preserve"> </w:t>
+      </w:r>
+      <w:r>
+        <w:rPr>
+          <w:i/>
+          <w:iCs/>
+        </w:rPr>
+        <w:t xml:space="preserve">persist</w:t>
+      </w:r>
+      <w:r>
+        <w:t xml:space="preserve"> </w:t>
+      </w:r>
+      <w:r>
+        <w:t xml:space="preserve">between them. Campaign main effects persist strongly (week-over-week correlation 0.81) but Proposition 1 neutralizes them under fixed quotas; segment main effects are fixed by supply. Measuring the persistence of double-centered interaction residuals per candidate axis therefore predicts, from planning-window data alone, which segmentations can pay. The estimator is explicit. For a candidate axis, take two adjacent planning windows (here 8-day and 2-day slices of the training period) and, in each, form the empirical click rate of every (campaign, group) cell with at least 300 impressions in one window and 150 in the other. Double-center each window’s cell rates by subtracting the impression-weighted campaign mean and the impression-weighted group mean and adding back the grand mean, leaving the pure interaction residual. The axis’s persistence is the Pearson correlation of these residuals across the two windows over the shared cells; empty or below-threshold cells are dropped, not imputed. An axis is retained when its persistence exceeds its estimation-noise floor (the correlation a pair of independent binomial draws at the same cell counts would produce, near zero at these volumes). The measured persistences:</w:t>
       </w:r>
     </w:p>
     <w:tbl>
@@ -1775,8 +2653,442 @@
         <w:t xml:space="preserve">Varying tier count against market size traces the frontier directly. In the top-100 market, 8 tiers deliver +3.46% over greedy (z = 5.0) while 16 tiers deliver +0.32% (z = 0.4). In the top-500 market, 4 tiers deliver +1.55% (z = 4.8), 8 tiers +0.94% (z = 2.2), and 16 tiers −0.43% (z = −0.9). Optimal granularity shrinks monotonically as per-cell density falls, so the rule is: persistence picks the axis, density picks the depth.</w:t>
       </w:r>
     </w:p>
-    <w:bookmarkEnd w:id="29"/>
-    <w:bookmarkStart w:id="30" w:name="the-regime-map"/>
+    <w:p>
+      <w:pPr>
+        <w:pStyle w:val="BodyText"/>
+      </w:pPr>
+      <w:r>
+        <w:t xml:space="preserve">These two components combine into a single selection procedure that runs on planning-window data alone and returns a segmentation, or abstains, before any serving outcome is seen.</w:t>
+      </w:r>
+    </w:p>
+    <w:p>
+      <w:pPr>
+        <w:pStyle w:val="BodyText"/>
+      </w:pPr>
+      <w:r>
+        <w:rPr>
+          <w:b/>
+          <w:bCs/>
+        </w:rPr>
+        <w:t xml:space="preserve">Algorithm 1 (persistence-guided segmentation selection).</w:t>
+      </w:r>
+      <w:r>
+        <w:t xml:space="preserve"> </w:t>
+      </w:r>
+      <w:r>
+        <w:t xml:space="preserve">Inputs: candidate axes</w:t>
+      </w:r>
+      <w:r>
+        <w:t xml:space="preserve"> </w:t>
+      </w:r>
+      <w:r>
+        <w:rPr>
+          <w:i/>
+          <w:iCs/>
+        </w:rPr>
+        <w:t xml:space="preserve">A</w:t>
+      </w:r>
+      <w:r>
+        <w:t xml:space="preserve"> </w:t>
+      </w:r>
+      <w:r>
+        <w:t xml:space="preserve">with nested resolutions</w:t>
+      </w:r>
+      <w:r>
+        <w:t xml:space="preserve"> </w:t>
+      </w:r>
+      <w:r>
+        <w:rPr>
+          <w:i/>
+          <w:iCs/>
+        </w:rPr>
+        <w:t xml:space="preserve">d</w:t>
+      </w:r>
+      <w:r>
+        <w:t xml:space="preserve">, two adjacent planning windows, a support tolerance</w:t>
+      </w:r>
+      <w:r>
+        <w:t xml:space="preserve"> </w:t>
+      </w:r>
+      <w:r>
+        <w:rPr>
+          <w:i/>
+          <w:iCs/>
+        </w:rPr>
+        <w:t xml:space="preserve">τ</w:t>
+      </w:r>
+      <w:r>
+        <w:t xml:space="preserve">, and a persistence floor</w:t>
+      </w:r>
+      <w:r>
+        <w:t xml:space="preserve"> </w:t>
+      </w:r>
+      <w:r>
+        <w:rPr>
+          <w:i/>
+          <w:iCs/>
+        </w:rPr>
+        <w:t xml:space="preserve">ρ</w:t>
+      </w:r>
+      <w:r>
+        <w:rPr>
+          <w:i/>
+          <w:iCs/>
+          <w:vertAlign w:val="subscript"/>
+        </w:rPr>
+        <w:t xml:space="preserve">0</w:t>
+      </w:r>
+      <w:r>
+        <w:t xml:space="preserve"> </w:t>
+      </w:r>
+      <w:r>
+        <w:t xml:space="preserve">set to the estimation-noise null.</w:t>
+      </w:r>
+    </w:p>
+    <w:p>
+      <w:pPr>
+        <w:pStyle w:val="BodyText"/>
+      </w:pPr>
+      <w:r>
+        <w:t xml:space="preserve">1. For each (</w:t>
+      </w:r>
+      <w:r>
+        <w:rPr>
+          <w:i/>
+          <w:iCs/>
+        </w:rPr>
+        <w:t xml:space="preserve">A</w:t>
+      </w:r>
+      <w:r>
+        <w:t xml:space="preserve">, </w:t>
+      </w:r>
+      <w:r>
+        <w:rPr>
+          <w:i/>
+          <w:iCs/>
+        </w:rPr>
+        <w:t xml:space="preserve">d</w:t>
+      </w:r>
+      <w:r>
+        <w:t xml:space="preserve">), form double-centered interaction residuals in each window over cells meeting the minimum-count thresholds; estimate persistence</w:t>
+      </w:r>
+      <w:r>
+        <w:t xml:space="preserve"> </w:t>
+      </w:r>
+      <w:r>
+        <w:rPr>
+          <w:i/>
+          <w:iCs/>
+        </w:rPr>
+        <w:t xml:space="preserve">ρ</w:t>
+      </w:r>
+      <w:r>
+        <w:rPr>
+          <w:i/>
+          <w:iCs/>
+          <w:vertAlign w:val="subscript"/>
+        </w:rPr>
+        <w:t xml:space="preserve">A,d</w:t>
+      </w:r>
+      <w:r>
+        <w:t xml:space="preserve"> </w:t>
+      </w:r>
+      <w:r>
+        <w:t xml:space="preserve">as their correlation, with a bootstrap lower confidence bound.</w:t>
+      </w:r>
+      <w:r>
+        <w:br/>
+      </w:r>
+      <w:r>
+        <w:t xml:space="preserve">2. Solve the planning-window LP once to get the planned allocation mass, and compute, per (</w:t>
+      </w:r>
+      <w:r>
+        <w:rPr>
+          <w:i/>
+          <w:iCs/>
+        </w:rPr>
+        <w:t xml:space="preserve">A</w:t>
+      </w:r>
+      <w:r>
+        <w:t xml:space="preserve">, </w:t>
+      </w:r>
+      <w:r>
+        <w:rPr>
+          <w:i/>
+          <w:iCs/>
+        </w:rPr>
+        <w:t xml:space="preserve">d</w:t>
+      </w:r>
+      <w:r>
+        <w:t xml:space="preserve">), the fraction of that mass landing in cells whose serving-window support would meet the minimum count.</w:t>
+      </w:r>
+      <w:r>
+        <w:br/>
+      </w:r>
+      <w:r>
+        <w:t xml:space="preserve">3. Call (</w:t>
+      </w:r>
+      <w:r>
+        <w:rPr>
+          <w:i/>
+          <w:iCs/>
+        </w:rPr>
+        <w:t xml:space="preserve">A</w:t>
+      </w:r>
+      <w:r>
+        <w:t xml:space="preserve">, </w:t>
+      </w:r>
+      <w:r>
+        <w:rPr>
+          <w:i/>
+          <w:iCs/>
+        </w:rPr>
+        <w:t xml:space="preserve">d</w:t>
+      </w:r>
+      <w:r>
+        <w:t xml:space="preserve">)</w:t>
+      </w:r>
+      <w:r>
+        <w:t xml:space="preserve"> </w:t>
+      </w:r>
+      <w:r>
+        <w:rPr>
+          <w:b/>
+          <w:bCs/>
+        </w:rPr>
+        <w:t xml:space="preserve">admissible</w:t>
+      </w:r>
+      <w:r>
+        <w:t xml:space="preserve"> </w:t>
+      </w:r>
+      <w:r>
+        <w:t xml:space="preserve">if at least (1 − </w:t>
+      </w:r>
+      <w:r>
+        <w:rPr>
+          <w:i/>
+          <w:iCs/>
+        </w:rPr>
+        <w:t xml:space="preserve">τ</w:t>
+      </w:r>
+      <w:r>
+        <w:t xml:space="preserve">) of the planned mass is supported and the persistence lower bound exceeds</w:t>
+      </w:r>
+      <w:r>
+        <w:t xml:space="preserve"> </w:t>
+      </w:r>
+      <w:r>
+        <w:rPr>
+          <w:i/>
+          <w:iCs/>
+        </w:rPr>
+        <w:t xml:space="preserve">ρ</w:t>
+      </w:r>
+      <w:r>
+        <w:rPr>
+          <w:i/>
+          <w:iCs/>
+          <w:vertAlign w:val="subscript"/>
+        </w:rPr>
+        <w:t xml:space="preserve">0</w:t>
+      </w:r>
+      <w:r>
+        <w:t xml:space="preserve">.</w:t>
+      </w:r>
+      <w:r>
+        <w:br/>
+      </w:r>
+      <w:r>
+        <w:t xml:space="preserve">4. Among admissible axes pick the one with the strongest persistence; within it pick the finest depth whose cells retain enough data to resolve the interaction,</w:t>
+      </w:r>
+    </w:p>
+    <w:p>
+      <w:pPr>
+        <w:pStyle w:val="SourceCode"/>
+      </w:pPr>
+      <w:r>
+        <w:rPr>
+          <w:rStyle w:val="VerbatimChar"/>
+        </w:rPr>
+        <w:t xml:space="preserve">d* = max { d : median(c,s): xplancs&gt;0 Ntraincs  ≥  nmin },   nmin ≈ p̄(1−p̄) / σγ2,</w:t>
+      </w:r>
+    </w:p>
+    <w:p>
+      <w:pPr>
+        <w:pStyle w:val="FirstParagraph"/>
+      </w:pPr>
+      <w:r>
+        <w:t xml:space="preserve">where</w:t>
+      </w:r>
+      <w:r>
+        <w:t xml:space="preserve"> </w:t>
+      </w:r>
+      <w:r>
+        <w:rPr>
+          <w:i/>
+          <w:iCs/>
+        </w:rPr>
+        <w:t xml:space="preserve">N</w:t>
+      </w:r>
+      <w:r>
+        <w:rPr>
+          <w:i/>
+          <w:iCs/>
+          <w:vertAlign w:val="superscript"/>
+        </w:rPr>
+        <w:t xml:space="preserve">train</w:t>
+      </w:r>
+      <w:r>
+        <w:t xml:space="preserve"> </w:t>
+      </w:r>
+      <w:r>
+        <w:t xml:space="preserve">is the planning-window count of a cell,</w:t>
+      </w:r>
+      <w:r>
+        <w:t xml:space="preserve"> </w:t>
+      </w:r>
+      <w:r>
+        <w:rPr>
+          <w:i/>
+          <w:iCs/>
+        </w:rPr>
+        <w:t xml:space="preserve">p̄</w:t>
+      </w:r>
+      <w:r>
+        <w:t xml:space="preserve"> </w:t>
+      </w:r>
+      <w:r>
+        <w:t xml:space="preserve">the base click rate, and</w:t>
+      </w:r>
+      <w:r>
+        <w:t xml:space="preserve"> </w:t>
+      </w:r>
+      <w:r>
+        <w:rPr>
+          <w:i/>
+          <w:iCs/>
+        </w:rPr>
+        <w:t xml:space="preserve">σ</w:t>
+      </w:r>
+      <w:r>
+        <w:rPr>
+          <w:i/>
+          <w:iCs/>
+          <w:vertAlign w:val="subscript"/>
+        </w:rPr>
+        <w:t xml:space="preserve">γ</w:t>
+      </w:r>
+      <w:r>
+        <w:t xml:space="preserve"> </w:t>
+      </w:r>
+      <w:r>
+        <w:t xml:space="preserve">the interaction standard deviation;</w:t>
+      </w:r>
+      <w:r>
+        <w:t xml:space="preserve"> </w:t>
+      </w:r>
+      <w:r>
+        <w:rPr>
+          <w:i/>
+          <w:iCs/>
+        </w:rPr>
+        <w:t xml:space="preserve">n</w:t>
+      </w:r>
+      <w:r>
+        <w:rPr>
+          <w:i/>
+          <w:iCs/>
+          <w:vertAlign w:val="subscript"/>
+        </w:rPr>
+        <w:t xml:space="preserve">min</w:t>
+      </w:r>
+      <w:r>
+        <w:t xml:space="preserve"> </w:t>
+      </w:r>
+      <w:r>
+        <w:t xml:space="preserve">is the count at which a per-cell estimate resolves the interaction, both quantities measured on planning data. 5. If no axis is admissible,</w:t>
+      </w:r>
+      <w:r>
+        <w:t xml:space="preserve"> </w:t>
+      </w:r>
+      <w:r>
+        <w:rPr>
+          <w:b/>
+          <w:bCs/>
+        </w:rPr>
+        <w:t xml:space="preserve">abstain</w:t>
+      </w:r>
+      <w:r>
+        <w:t xml:space="preserve"> </w:t>
+      </w:r>
+      <w:r>
+        <w:t xml:space="preserve">(serve the unsegmented market). Freeze the choice before the serving window.</w:t>
+      </w:r>
+    </w:p>
+    <w:p>
+      <w:pPr>
+        <w:pStyle w:val="BodyText"/>
+      </w:pPr>
+      <w:r>
+        <w:t xml:space="preserve">The axis step is decisive and robust: run blind it selects activity on Taobao, page platform on Outbrain, and the axis ranking Avazu’s table implies. The Outbrain choice was frozen in a public, dated commit before its replay was scored, the sense in which that application is pre-registered. The depth step ties to a measurable density. The median planning count of the cells the plan fills falls with both depth and market breadth (Taobao top-100: about 2,700, 1,400, and 670 at 4, 8, and 16 tiers; top-500: 1,100, 530, and 260), and with</w:t>
+      </w:r>
+      <w:r>
+        <w:t xml:space="preserve"> </w:t>
+      </w:r>
+      <w:r>
+        <w:rPr>
+          <w:i/>
+          <w:iCs/>
+        </w:rPr>
+        <w:t xml:space="preserve">σ</w:t>
+      </w:r>
+      <w:r>
+        <w:rPr>
+          <w:i/>
+          <w:iCs/>
+          <w:vertAlign w:val="subscript"/>
+        </w:rPr>
+        <w:t xml:space="preserve">γ</w:t>
+      </w:r>
+      <w:r>
+        <w:t xml:space="preserve"> ≈ 1pp on a 5% base giving</w:t>
+      </w:r>
+      <w:r>
+        <w:t xml:space="preserve"> </w:t>
+      </w:r>
+      <w:r>
+        <w:rPr>
+          <w:i/>
+          <w:iCs/>
+        </w:rPr>
+        <w:t xml:space="preserve">n</w:t>
+      </w:r>
+      <w:r>
+        <w:rPr>
+          <w:i/>
+          <w:iCs/>
+          <w:vertAlign w:val="subscript"/>
+        </w:rPr>
+        <w:t xml:space="preserve">min</w:t>
+      </w:r>
+      <w:r>
+        <w:t xml:space="preserve"> </w:t>
+      </w:r>
+      <w:r>
+        <w:t xml:space="preserve">on the order of 10</w:t>
+      </w:r>
+      <w:r>
+        <w:rPr>
+          <w:vertAlign w:val="superscript"/>
+        </w:rPr>
+        <w:t xml:space="preserve">3</w:t>
+      </w:r>
+      <w:r>
+        <w:t xml:space="preserve">, the criterion keeps eight tiers at top-100 and four at top-500, matching the ablation optima above. The threshold is an order-of-magnitude reliability target rather than a constant validated out of sample, so we report depth selection as density-guided rather than fully closed; the axis and abstain decisions are the parts of Algorithm 1 that run without any such tuning.</w:t>
+      </w:r>
+    </w:p>
+    <w:bookmarkEnd w:id="30"/>
+    <w:bookmarkStart w:id="31" w:name="the-regime-map"/>
     <w:p>
       <w:pPr>
         <w:pStyle w:val="Heading2"/>
@@ -1803,12 +3115,13 @@
         <w:tblLook w:firstRow="1" w:lastRow="0" w:firstColumn="0" w:lastColumn="0" w:noHBand="0" w:noVBand="0" w:val="0020"/>
       </w:tblPr>
       <w:tblGrid>
-        <w:gridCol w:w="1320"/>
-        <w:gridCol w:w="1320"/>
-        <w:gridCol w:w="1320"/>
-        <w:gridCol w:w="1320"/>
-        <w:gridCol w:w="1320"/>
-        <w:gridCol w:w="1320"/>
+        <w:gridCol w:w="1131"/>
+        <w:gridCol w:w="1131"/>
+        <w:gridCol w:w="1131"/>
+        <w:gridCol w:w="1131"/>
+        <w:gridCol w:w="1131"/>
+        <w:gridCol w:w="1131"/>
+        <w:gridCol w:w="1131"/>
       </w:tblGrid>
       <w:tr>
         <w:trPr>
@@ -1858,31 +3171,43 @@
               <w:jc w:val="left"/>
             </w:pPr>
             <w:r>
-              <w:t xml:space="preserve">Dual, fixed optimal prices</w:t>
-            </w:r>
-          </w:p>
-        </w:tc>
-        <w:tc>
-          <w:tcPr/>
-          <w:p>
-            <w:pPr>
-              <w:pStyle w:val="Compact"/>
-              <w:jc w:val="left"/>
-            </w:pPr>
-            <w:r>
-              <w:t xml:space="preserve">Dual, adaptive (warm)</w:t>
-            </w:r>
-          </w:p>
-        </w:tc>
-        <w:tc>
-          <w:tcPr/>
-          <w:p>
-            <w:pPr>
-              <w:pStyle w:val="Compact"/>
-              <w:jc w:val="left"/>
-            </w:pPr>
-            <w:r>
-              <w:t xml:space="preserve">Dual, adaptive (plain)</w:t>
+              <w:t xml:space="preserve">Fixed optimal dual</w:t>
+            </w:r>
+          </w:p>
+        </w:tc>
+        <w:tc>
+          <w:tcPr/>
+          <w:p>
+            <w:pPr>
+              <w:pStyle w:val="Compact"/>
+              <w:jc w:val="left"/>
+            </w:pPr>
+            <w:r>
+              <w:t xml:space="preserve">DMD, entropic</w:t>
+            </w:r>
+          </w:p>
+        </w:tc>
+        <w:tc>
+          <w:tcPr/>
+          <w:p>
+            <w:pPr>
+              <w:pStyle w:val="Compact"/>
+              <w:jc w:val="left"/>
+            </w:pPr>
+            <w:r>
+              <w:t xml:space="preserve">DMD, Euclidean</w:t>
+            </w:r>
+          </w:p>
+        </w:tc>
+        <w:tc>
+          <w:tcPr/>
+          <w:p>
+            <w:pPr>
+              <w:pStyle w:val="Compact"/>
+              <w:jc w:val="left"/>
+            </w:pPr>
+            <w:r>
+              <w:t xml:space="preserve">Scalar pacing</w:t>
             </w:r>
           </w:p>
         </w:tc>
@@ -1908,55 +3233,67 @@
               <w:jc w:val="left"/>
             </w:pPr>
             <w:r>
-              <w:t xml:space="preserve">+3.46% (5.0)</w:t>
-            </w:r>
-          </w:p>
-        </w:tc>
-        <w:tc>
-          <w:tcPr/>
-          <w:p>
-            <w:pPr>
-              <w:pStyle w:val="Compact"/>
-              <w:jc w:val="left"/>
-            </w:pPr>
-            <w:r>
-              <w:t xml:space="preserve">+4.40% (6.7)</w:t>
-            </w:r>
-          </w:p>
-        </w:tc>
-        <w:tc>
-          <w:tcPr/>
-          <w:p>
-            <w:pPr>
-              <w:pStyle w:val="Compact"/>
-              <w:jc w:val="left"/>
-            </w:pPr>
-            <w:r>
-              <w:t xml:space="preserve">+4.63% (7.2)</w:t>
-            </w:r>
-          </w:p>
-        </w:tc>
-        <w:tc>
-          <w:tcPr/>
-          <w:p>
-            <w:pPr>
-              <w:pStyle w:val="Compact"/>
-              <w:jc w:val="left"/>
-            </w:pPr>
-            <w:r>
-              <w:t xml:space="preserve">+4.55% (7.7)</w:t>
-            </w:r>
-          </w:p>
-        </w:tc>
-        <w:tc>
-          <w:tcPr/>
-          <w:p>
-            <w:pPr>
-              <w:pStyle w:val="Compact"/>
-              <w:jc w:val="left"/>
-            </w:pPr>
-            <w:r>
-              <w:t xml:space="preserve">+3.43% (6.2)</w:t>
+              <w:t xml:space="preserve">+3.51% (4.7)</w:t>
+            </w:r>
+          </w:p>
+        </w:tc>
+        <w:tc>
+          <w:tcPr/>
+          <w:p>
+            <w:pPr>
+              <w:pStyle w:val="Compact"/>
+              <w:jc w:val="left"/>
+            </w:pPr>
+            <w:r>
+              <w:t xml:space="preserve">+4.27% (6.1)</w:t>
+            </w:r>
+          </w:p>
+        </w:tc>
+        <w:tc>
+          <w:tcPr/>
+          <w:p>
+            <w:pPr>
+              <w:pStyle w:val="Compact"/>
+              <w:jc w:val="left"/>
+            </w:pPr>
+            <w:r>
+              <w:t xml:space="preserve">+4.45% (6.4)</w:t>
+            </w:r>
+          </w:p>
+        </w:tc>
+        <w:tc>
+          <w:tcPr/>
+          <w:p>
+            <w:pPr>
+              <w:pStyle w:val="Compact"/>
+              <w:jc w:val="left"/>
+            </w:pPr>
+            <w:r>
+              <w:t xml:space="preserve">+4.54% (6.8)</w:t>
+            </w:r>
+          </w:p>
+        </w:tc>
+        <w:tc>
+          <w:tcPr/>
+          <w:p>
+            <w:pPr>
+              <w:pStyle w:val="Compact"/>
+              <w:jc w:val="left"/>
+            </w:pPr>
+            <w:r>
+              <w:t xml:space="preserve">+4.73% (7.1)</w:t>
+            </w:r>
+          </w:p>
+        </w:tc>
+        <w:tc>
+          <w:tcPr/>
+          <w:p>
+            <w:pPr>
+              <w:pStyle w:val="Compact"/>
+              <w:jc w:val="left"/>
+            </w:pPr>
+            <w:r>
+              <w:t xml:space="preserve">+3.86% (6.3)</w:t>
             </w:r>
           </w:p>
         </w:tc>
@@ -2018,19 +3355,31 @@
               <w:jc w:val="left"/>
             </w:pPr>
             <w:r>
-              <w:t xml:space="preserve">+0.09% (0.2)</w:t>
-            </w:r>
-          </w:p>
-        </w:tc>
-        <w:tc>
-          <w:tcPr/>
-          <w:p>
-            <w:pPr>
-              <w:pStyle w:val="Compact"/>
-              <w:jc w:val="left"/>
-            </w:pPr>
-            <w:r>
-              <w:t xml:space="preserve">−1.36% (−2.3)</w:t>
+              <w:t xml:space="preserve">+3.62% (5.7)</w:t>
+            </w:r>
+          </w:p>
+        </w:tc>
+        <w:tc>
+          <w:tcPr/>
+          <w:p>
+            <w:pPr>
+              <w:pStyle w:val="Compact"/>
+              <w:jc w:val="left"/>
+            </w:pPr>
+            <w:r>
+              <w:t xml:space="preserve">+2.65% (4.3)</w:t>
+            </w:r>
+          </w:p>
+        </w:tc>
+        <w:tc>
+          <w:tcPr/>
+          <w:p>
+            <w:pPr>
+              <w:pStyle w:val="Compact"/>
+              <w:jc w:val="left"/>
+            </w:pPr>
+            <w:r>
+              <w:t xml:space="preserve">+0.73% (1.4)</w:t>
             </w:r>
           </w:p>
         </w:tc>
@@ -2080,31 +3429,43 @@
               <w:jc w:val="left"/>
             </w:pPr>
             <w:r>
-              <w:t xml:space="preserve">+3.04% (4.8)</w:t>
-            </w:r>
-          </w:p>
-        </w:tc>
-        <w:tc>
-          <w:tcPr/>
-          <w:p>
-            <w:pPr>
-              <w:pStyle w:val="Compact"/>
-              <w:jc w:val="left"/>
-            </w:pPr>
-            <w:r>
-              <w:t xml:space="preserve">+0.47% (0.8)</w:t>
-            </w:r>
-          </w:p>
-        </w:tc>
-        <w:tc>
-          <w:tcPr/>
-          <w:p>
-            <w:pPr>
-              <w:pStyle w:val="Compact"/>
-              <w:jc w:val="left"/>
-            </w:pPr>
-            <w:r>
-              <w:t xml:space="preserve">−4.19% (−6.7)</w:t>
+              <w:t xml:space="preserve">+3.05% (4.9)</w:t>
+            </w:r>
+          </w:p>
+        </w:tc>
+        <w:tc>
+          <w:tcPr/>
+          <w:p>
+            <w:pPr>
+              <w:pStyle w:val="Compact"/>
+              <w:jc w:val="left"/>
+            </w:pPr>
+            <w:r>
+              <w:t xml:space="preserve">+3.06% (5.4)</w:t>
+            </w:r>
+          </w:p>
+        </w:tc>
+        <w:tc>
+          <w:tcPr/>
+          <w:p>
+            <w:pPr>
+              <w:pStyle w:val="Compact"/>
+              <w:jc w:val="left"/>
+            </w:pPr>
+            <w:r>
+              <w:t xml:space="preserve">−0.25% (−0.4)</w:t>
+            </w:r>
+          </w:p>
+        </w:tc>
+        <w:tc>
+          <w:tcPr/>
+          <w:p>
+            <w:pPr>
+              <w:pStyle w:val="Compact"/>
+              <w:jc w:val="left"/>
+            </w:pPr>
+            <w:r>
+              <w:t xml:space="preserve">−2.25% (−4.0)</w:t>
             </w:r>
           </w:p>
         </w:tc>
@@ -2154,31 +3515,43 @@
               <w:jc w:val="left"/>
             </w:pPr>
             <w:r>
-              <w:t xml:space="preserve">+1.48% (2.4)</w:t>
-            </w:r>
-          </w:p>
-        </w:tc>
-        <w:tc>
-          <w:tcPr/>
-          <w:p>
-            <w:pPr>
-              <w:pStyle w:val="Compact"/>
-              <w:jc w:val="left"/>
-            </w:pPr>
-            <w:r>
-              <w:t xml:space="preserve">−0.97% (−1.5)</w:t>
-            </w:r>
-          </w:p>
-        </w:tc>
-        <w:tc>
-          <w:tcPr/>
-          <w:p>
-            <w:pPr>
-              <w:pStyle w:val="Compact"/>
-              <w:jc w:val="left"/>
-            </w:pPr>
-            <w:r>
-              <w:t xml:space="preserve">−8.33% (−12.1)</w:t>
+              <w:t xml:space="preserve">+1.49% (2.4)</w:t>
+            </w:r>
+          </w:p>
+        </w:tc>
+        <w:tc>
+          <w:tcPr/>
+          <w:p>
+            <w:pPr>
+              <w:pStyle w:val="Compact"/>
+              <w:jc w:val="left"/>
+            </w:pPr>
+            <w:r>
+              <w:t xml:space="preserve">−0.52% (−0.9)</w:t>
+            </w:r>
+          </w:p>
+        </w:tc>
+        <w:tc>
+          <w:tcPr/>
+          <w:p>
+            <w:pPr>
+              <w:pStyle w:val="Compact"/>
+              <w:jc w:val="left"/>
+            </w:pPr>
+            <w:r>
+              <w:t xml:space="preserve">−4.76% (−7.2)</w:t>
+            </w:r>
+          </w:p>
+        </w:tc>
+        <w:tc>
+          <w:tcPr/>
+          <w:p>
+            <w:pPr>
+              <w:pStyle w:val="Compact"/>
+              <w:jc w:val="left"/>
+            </w:pPr>
+            <w:r>
+              <w:t xml:space="preserve">−6.88% (−11.2)</w:t>
             </w:r>
           </w:p>
         </w:tc>
@@ -2205,7 +3578,7 @@
         <w:t xml:space="preserve"> </w:t>
       </w:r>
       <w:r>
-        <w:t xml:space="preserve">delivery trajectory (the proportionally deliverable quota for the plan-free variants, the LP’s planned delivery for the warm variant) rather than the raw over-subscribed quota. The re-solved plan is held to the same information as the plan: it re-solves on the planning-window forecast prorated to remaining supply, never on realized serving-window arrivals. A fifth policy separates the price from its adaptation: the</w:t>
+        <w:t xml:space="preserve">delivery trajectory (the proportionally deliverable quota for the plan-free variants, the LP’s planned delivery for the warm variant) rather than the raw over-subscribed quota. The re-solved plan is held to the same information as the plan: it re-solves on the planning-window forecast prorated to remaining supply, never on realized serving-window arrivals. Two further policies separate the price from its adaptation. The</w:t>
       </w:r>
       <w:r>
         <w:t xml:space="preserve"> </w:t>
@@ -2260,47 +3633,7 @@
         <w:t xml:space="preserve"> </w:t>
       </w:r>
       <w:r>
-        <w:t xml:space="preserve">of the over-subscribed plan LP, with randomized tie-breaking and</w:t>
-      </w:r>
-      <w:r>
-        <w:t xml:space="preserve"> </w:t>
-      </w:r>
-      <w:r>
-        <w:rPr>
-          <w:i/>
-          <w:iCs/>
-        </w:rPr>
-        <w:t xml:space="preserve">no</w:t>
-      </w:r>
-      <w:r>
-        <w:t xml:space="preserve"> </w:t>
-      </w:r>
-      <w:r>
-        <w:t xml:space="preserve">online update. It is a per-campaign-price policy that never adapts.</w:t>
-      </w:r>
-    </w:p>
-    <w:p>
-      <w:pPr>
-        <w:pStyle w:val="BodyText"/>
-      </w:pPr>
-      <w:r>
-        <w:t xml:space="preserve">At exact feasibility, all five strong policies cluster at the top; most of the value is the forecast itself, which each consumes. Under contention the policies split cleanly, and the split identifies the mechanism. The</w:t>
-      </w:r>
-      <w:r>
-        <w:t xml:space="preserve"> </w:t>
-      </w:r>
-      <w:r>
-        <w:rPr>
-          <w:i/>
-          <w:iCs/>
-        </w:rPr>
-        <w:t xml:space="preserve">adaptive</w:t>
-      </w:r>
-      <w:r>
-        <w:t xml:space="preserve"> </w:t>
-      </w:r>
-      <w:r>
-        <w:t xml:space="preserve">dual-price variants fall below greedy, steeply so as quotas tighten (the plain variant reaches −8.3% at 150% over-subscription, and warm-starting only delays the collapse). Yet the</w:t>
+        <w:t xml:space="preserve">of the over-subscribed plan LP, with no online update: a per-campaign-price policy that never adapts. Against it we run the state-of-the-art adaptive method,</w:t>
       </w:r>
       <w:r>
         <w:t xml:space="preserve"> </w:t>
@@ -2310,29 +3643,13 @@
           <w:b/>
           <w:bCs/>
         </w:rPr>
-        <w:t xml:space="preserve">fixed optimal-dual</w:t>
-      </w:r>
-      <w:r>
-        <w:t xml:space="preserve"> </w:t>
-      </w:r>
-      <w:r>
-        <w:t xml:space="preserve">policy, the same per-campaign-price form with its prices frozen at the LP optimum, stays positive at every contention level (+2.4%, +3.0%, +1.5%, z ≥ 2.4) and tracks the re-solved plan within about a percentage point. So it is not per-campaign pricing that fails under contention; a static price vector</w:t>
-      </w:r>
-      <w:r>
-        <w:t xml:space="preserve"> </w:t>
-      </w:r>
-      <w:r>
-        <w:rPr>
-          <w:i/>
-          <w:iCs/>
-        </w:rPr>
-        <w:t xml:space="preserve">can</w:t>
-      </w:r>
-      <w:r>
-        <w:t xml:space="preserve"> </w:t>
-      </w:r>
-      <w:r>
-        <w:t xml:space="preserve">carry the allocation, as linear-programming duality predicts. What fails is learning that vector online by scalar pacing: as quotas tighten the pacing update chases a moving delivery target and drifts off the optimal prices, and the fixed policy beats the best adaptive one by +2.3 to +2.6% (z ≥ 4.2). The periodically re-solved plan, which recomputes the prices rather than adapting them, dominates every regime, its edge over the static plan growing from +0.9% (z = 2.8) to +1.9% (z = 5.2).</w:t>
+        <w:t xml:space="preserve">dual mirror descent</w:t>
+      </w:r>
+      <w:r>
+        <w:t xml:space="preserve"> </w:t>
+      </w:r>
+      <w:r>
+        <w:t xml:space="preserve">[21] in both Euclidean and entropic geometries, tuned on the planning window, so the comparison is not against a straw controller; the earlier scalar quota-error controller is retained as a practical baseline.</w:t>
       </w:r>
     </w:p>
     <w:p>
@@ -2340,7 +3657,7 @@
         <w:pStyle w:val="BodyText"/>
       </w:pPr>
       <w:r>
-        <w:t xml:space="preserve">The deployment rule sharpens accordingly: the LP’s prices are what matter, so recompute them on the pacing cadence (re-solve, or refresh the fixed dual vector); do not learn them online by scalar pacing adaptation, which is the standard budget-pacing controller and the one policy class that fails under contention here.</w:t>
+        <w:t xml:space="preserve">At exact feasibility all seven policies cluster within a point; most of the value is the forecast itself, which each consumes. Under contention they separate, and the separation is a spectrum set by how the prices are obtained. Adaptation degrades with the update rule: the scalar controller weakens first (+0.7% at 110% quotas, −6.9% at 150%), Euclidean mirror descent holds to 110% then falls (−4.8% at 150%), and even the strongest adaptive method, entropic mirror descent, tracks the re-solved plan through 125% over-subscription (+3.06% versus +3.39%) before turning slightly negative at 150% (−0.5%). The two policies that do not learn prices online, the re-solved plan and the fixed optimal dual, are the only ones positive at every level, and the re-solved plan is positive throughout (+2.2% to +4.3%). Two conclusions follow, each carefully scoped. First, the failure under heavy over-subscription is shared by every adaptive dual-price method we test, modern mirror descent included, not an artifact of a weak controller; a well-chosen adaptive method (entropic DMD) is nonetheless competitive through moderate contention, so the claim is about the heavy-contention regime, not adaptation in general. Second, the fixed optimal dual’s survival shows per-campaign pricing itself is not the problem, as linear-programming duality predicts: a static optimal price vector carries the allocation. What fails as contention grows is learning that vector online.</w:t>
       </w:r>
     </w:p>
     <w:p>
@@ -2348,7 +3665,7 @@
         <w:pStyle w:val="BodyText"/>
       </w:pPr>
       <w:r>
-        <w:t xml:space="preserve">The regime map reproduces on a second, independent dataset. We repeat the whole protocol on the Outbrain content-recommendation log (87M joined impressions, a slate-click structure unlike Taobao’s display, with the segmentation axis fixed in advance to the most persistent one measured on the planning window, page platform at r = 0.95). At native quotas the Outbrain market is barely contended, per-segment supply dwarfs the quotas, so every policy sits within a percentage point of greedy, exactly the low-contention corner of the map. Under the same over-subscription stress, the same ordering returns and sharpens: the re-solved plan is the only policy positive at every level (+0.3 to +0.6%), the static plan and the fixed optimal-dual degrade gently, and adaptive dual-price pacing collapses far more steeply than on Taobao, to −19%, −34%, and −44% at 1.5×, 2×, and 3× quotas. That adaptation, not per-campaign pricing, is the failure, and that re-solving the plan is the robust choice, holds across two datasets from different domains.</w:t>
+        <w:t xml:space="preserve">The deployment rule follows: the LP’s prices are what matter, so obtain them by solving, either recomputing on the pacing cadence (re-solve) or holding the LP optimum (fixed dual); online price learning is competitive only while contention is mild, and no adaptive variant we test survives heavy over-subscription.</w:t>
       </w:r>
     </w:p>
     <w:p>
@@ -2356,11 +3673,19 @@
         <w:pStyle w:val="BodyText"/>
       </w:pPr>
       <w:r>
-        <w:t xml:space="preserve">Three robustness checks anchor the table. The headline planned-versus-greedy comparison survives a user-clustered bootstrap (z = +4.55) and an across-fold t-test (t(4) = +5.50); the planned-versus-plain-dual cell at feasibility is fragile (z = 1.9, t = 1.3), and the ordering across regimes, not that single cell, is the claim. Re-pairing the impression stream changes per-user exposure composition; re-scoring under a first-exposure table (each user’s first impression of each campaign only, which removes repeat-exposure composition) moves the headline from +3.46% to +3.88%, so exposure fatigue does not manufacture the result. The regime map is a single-market result: the over-subscription sweep is run on the Taobao top-100 reconstruction, while Avazu contributes only the stability boundary. The z-values in the table above the headline row come from the parametric binomial model; the conclusions that rest on them (the re-solved plan’s dominance at every scale, the dual collapse) hold with the same sign and comparable magnitude under the user-clustered bootstrap where we recomputed them. The remaining, and inherent, limitation is that these are model-scored expected clicks: an outcome-grounded estimate is possible only on the 2–2.4% of impressions where a policy’s choice coincides with the logged action, a subset both tiny and selected toward the logging policy. On it, a self-normalized inverse-propensity estimate with an estimated segment-level logging propensity puts planned within ±1pp of greedy at t(4) = −0.5, that is, inconclusive; the matched-subset calibration shows the model scorer understates realized CTR slightly and symmetrically for both policies (about 6.8% realized versus 6.5% modeled), so it is not inflating the gap. Public logs cannot close this gap; only an interventional deployment can.</w:t>
-      </w:r>
-    </w:p>
-    <w:bookmarkEnd w:id="30"/>
-    <w:bookmarkStart w:id="34" w:name="simulation-as-calibration"/>
+        <w:t xml:space="preserve">The regime map reproduces on a second, independent dataset. We repeat the whole protocol on the Outbrain content-recommendation log (87M joined impressions, a slate-click structure unlike Taobao’s display, with the segmentation axis fixed in advance to the most persistent one measured on the planning window, page platform at r = 0.95). At native quotas the Outbrain market is barely contended, per-segment supply dwarfs the quotas, so every policy sits within a percentage point of greedy, exactly the low-contention corner of the map. Under the same over-subscription stress, the ordering returns and sharpens: the re-solved plan is the only policy positive at every level (+0.3 to +0.6%), the static plan and the fixed optimal-dual degrade gently, and online scalar pacing collapses far more steeply than on Taobao, to −19%, −34%, and −44% at 1.5×, 2×, and 3× quotas. That online price learning, not per-campaign pricing, is the failure under contention, and that solving for the prices is the robust choice, holds across two datasets from different domains.</w:t>
+      </w:r>
+    </w:p>
+    <w:p>
+      <w:pPr>
+        <w:pStyle w:val="BodyText"/>
+      </w:pPr>
+      <w:r>
+        <w:t xml:space="preserve">Three robustness checks anchor the table. The headline planned-versus-greedy comparison survives a user-clustered bootstrap (z = +4.55) and an across-fold t-test (t(4) = +5.50); at exact feasibility the strong policies are statistically close, so the ordering across contention regimes, not any single feasibility cell, is the claim. Re-pairing the impression stream changes per-user exposure composition; re-scoring under a first-exposure table (each user’s first impression of each campaign only, which removes repeat-exposure composition) moves the headline from +3.46% to +3.88%, so exposure fatigue does not manufacture the result. The regime map is a single-market result: the over-subscription sweep is run on the Taobao top-100 reconstruction, while Avazu contributes only the stability boundary. The z-values in the table above the headline row come from the parametric binomial model; the conclusions that rest on them (the re-solved plan’s dominance at every scale, the dual collapse) hold with the same sign and comparable magnitude under the user-clustered bootstrap where we recomputed them. The remaining, and inherent, limitation is that these are model-scored expected clicks: an outcome-grounded estimate is possible only on the 2–2.4% of impressions where a policy’s choice coincides with the logged action, a subset both tiny and selected toward the logging policy. On it, a self-normalized inverse-propensity estimate with an estimated segment-level logging propensity puts planned within ±1pp of greedy at t(4) = −0.5, that is, inconclusive; the matched-subset calibration shows the model scorer understates realized CTR slightly and symmetrically for both policies (about 6.8% realized versus 6.5% modeled), so it is not inflating the gap. Public logs cannot close this gap; only an interventional deployment can.</w:t>
+      </w:r>
+    </w:p>
+    <w:bookmarkEnd w:id="31"/>
+    <w:bookmarkStart w:id="35" w:name="simulation-as-calibration"/>
     <w:p>
       <w:pPr>
         <w:pStyle w:val="Heading2"/>
@@ -2715,18 +4040,18 @@
                 <wp:inline>
                   <wp:extent cx="5334000" cy="2370666"/>
                   <wp:effectExtent b="0" l="0" r="0" t="0"/>
-                  <wp:docPr descr="" title="" id="32" name="Picture"/>
+                  <wp:docPr descr="" title="" id="33" name="Picture"/>
                   <a:graphic>
                     <a:graphicData uri="http://schemas.openxmlformats.org/drawingml/2006/picture">
                       <pic:pic>
                         <pic:nvPicPr>
-                          <pic:cNvPr descr="file:///E:/tmp/claude/E--Projects-Submitted-MobileAd-Comverse/464e82cd-870f-4dc1-b795-92348cf1a9b8/scratchpad/figs/fig2.png" id="33" name="Picture"/>
+                          <pic:cNvPr descr="file:///E:/tmp/claude/E--Projects-Submitted-MobileAd-Comverse/464e82cd-870f-4dc1-b795-92348cf1a9b8/scratchpad/figs/fig2.png" id="34" name="Picture"/>
                           <pic:cNvPicPr>
                             <a:picLocks noChangeArrowheads="1" noChangeAspect="1"/>
                           </pic:cNvPicPr>
                         </pic:nvPicPr>
                         <pic:blipFill>
-                          <a:blip r:embed="rId31"/>
+                          <a:blip r:embed="rId32"/>
                           <a:stretch>
                             <a:fillRect/>
                           </a:stretch>
@@ -2799,8 +4124,8 @@
         <w:t xml:space="preserve">The simulation carries its own controls. Both policies are verified against the hindsight bound in every replication. On control instances where all campaigns share identical click probabilities, so pairing cannot matter, the measured lift is 0.000%, confirming that the gap measures allocation quality and not an artifact of the harness. And the planned policy’s 93.8% of a bound computed with perfect hindsight shows that forecast noise costs the plan only a few points, the residual that Section 8.2’s pacing mechanism and the refinement loop exist to absorb.</w:t>
       </w:r>
     </w:p>
-    <w:bookmarkEnd w:id="34"/>
-    <w:bookmarkStart w:id="53" w:name="a-reference-serving-architecture"/>
+    <w:bookmarkEnd w:id="35"/>
+    <w:bookmarkStart w:id="54" w:name="a-reference-serving-architecture"/>
     <w:p>
       <w:pPr>
         <w:pStyle w:val="Heading2"/>
@@ -3117,7 +4442,7 @@
         <w:t xml:space="preserve">The vantage point carries obligations that shape the design. Subscriber data is usable for advertising only within a consent and data-protection framework: profiling requires a lawful basis and per-subscriber opt-out under regimes such as the GDPR and ePrivacy rules, and gateway-observed browsing is subject to purpose limitation. The architecture is built for data minimization under those constraints: raw attributes and browsing records are confined to the offline stage, the serving path receives only anonymous cluster distances and campaign eligibility lists, and every online decision reads aggregate tables rather than individual histories. Segment coarseness is itself a privacy parameter: the segments that carry allocation value in Section 5 are a handful of aggregate behavior tiers, not individual dossiers. Not every subscriber has a profile at all: prepaid subscribers may be anonymous, which is why the clustering machinery supports membership computed from response behavior alone (Section 8.1.3).</w:t>
       </w:r>
     </w:p>
-    <w:bookmarkStart w:id="35" w:name="X76cd0aab14a1b3a28329e6411b338cd4e16a2d0"/>
+    <w:bookmarkStart w:id="36" w:name="X76cd0aab14a1b3a28329e6411b338cd4e16a2d0"/>
     <w:p>
       <w:pPr>
         <w:pStyle w:val="Heading3"/>
@@ -3175,7 +4500,7 @@
         <w:pStyle w:val="Compact"/>
         <w:numPr>
           <w:ilvl w:val="0"/>
-          <w:numId w:val="1001"/>
+          <w:numId w:val="1002"/>
         </w:numPr>
       </w:pPr>
       <w:r>
@@ -3187,7 +4512,7 @@
         <w:pStyle w:val="Compact"/>
         <w:numPr>
           <w:ilvl w:val="0"/>
-          <w:numId w:val="1001"/>
+          <w:numId w:val="1002"/>
         </w:numPr>
       </w:pPr>
       <w:r>
@@ -3199,7 +4524,7 @@
         <w:pStyle w:val="Compact"/>
         <w:numPr>
           <w:ilvl w:val="0"/>
-          <w:numId w:val="1001"/>
+          <w:numId w:val="1002"/>
         </w:numPr>
       </w:pPr>
       <w:r>
@@ -3214,8 +4539,8 @@
         <w:t xml:space="preserve">Assumption 1 justifies forecasting traffic from history; assumptions 2 and 3 justify pooling sparse per-subscriber click data into clusters that have enough volume to estimate probabilities reliably.</w:t>
       </w:r>
     </w:p>
-    <w:bookmarkEnd w:id="35"/>
-    <w:bookmarkStart w:id="36" w:name="response-records"/>
+    <w:bookmarkEnd w:id="36"/>
+    <w:bookmarkStart w:id="37" w:name="response-records"/>
     <w:p>
       <w:pPr>
         <w:pStyle w:val="Heading3"/>
@@ -3505,8 +4830,8 @@
         <w:t xml:space="preserve">Records are grouped per subscriber and joined with the profile (age, gender, location, income band, purchase indicators) where one is available. Past campaigns matter as much as active ones: a subscriber’s reaction to a finished campaign is evidence about how they will react to similar future ones.</w:t>
       </w:r>
     </w:p>
-    <w:bookmarkEnd w:id="36"/>
-    <w:bookmarkStart w:id="37" w:name="proximity-and-clustering"/>
+    <w:bookmarkEnd w:id="37"/>
+    <w:bookmarkStart w:id="38" w:name="proximity-and-clustering"/>
     <w:p>
       <w:pPr>
         <w:pStyle w:val="Heading3"/>
@@ -3714,8 +5039,8 @@
         <w:t xml:space="preserve">. A subscriber is not filed into one cluster; they carry a pre-computed distance to each nearby cluster. A 35-year-old married streaming subscriber in a large city may sit at distance 0.8 from the “metropolitan professionals” cluster and 0.1 from “music lovers”; a 22-year-old gaming subscriber in the same city sits close to “gamers” and “music lovers” instead. These distances become interpolation weights at serving time (Section 8.2), so predictions blend the behavior of every cluster the subscriber resembles.</w:t>
       </w:r>
     </w:p>
-    <w:bookmarkEnd w:id="37"/>
-    <w:bookmarkStart w:id="38" w:name="Xcf0c62df256e2cee415416a2e095f7c938d4365"/>
+    <w:bookmarkEnd w:id="38"/>
+    <w:bookmarkStart w:id="39" w:name="Xcf0c62df256e2cee415416a2e095f7c938d4365"/>
     <w:p>
       <w:pPr>
         <w:pStyle w:val="Heading3"/>
@@ -4233,8 +5558,8 @@
         <w:t xml:space="preserve">For a brand-new campaign with no history of its own, probabilities are borrowed from the most similar past or active campaigns in the same category, the same pooling idea applied across campaigns instead of across subscribers. Where the profile itself is missing (anonymous or prepaid subscribers), distance to clusters is computed from response history alone, and the subscriber inherits the response statistics of the cluster they behave like. The design degrades gracefully as data thins out: per-subscriber evidence backs off to cluster evidence, and per-campaign evidence backs off to category evidence.</w:t>
       </w:r>
     </w:p>
-    <w:bookmarkEnd w:id="38"/>
-    <w:bookmarkStart w:id="39" w:name="compiling-the-plan-into-lookup-tables"/>
+    <w:bookmarkEnd w:id="39"/>
+    <w:bookmarkStart w:id="40" w:name="compiling-the-plan-into-lookup-tables"/>
     <w:p>
       <w:pPr>
         <w:pStyle w:val="Heading3"/>
@@ -4454,8 +5779,8 @@
         <w:t xml:space="preserve">That one row carries targeting, allocation, and the performance baseline the online stage will pace against.</w:t>
       </w:r>
     </w:p>
-    <w:bookmarkEnd w:id="39"/>
-    <w:bookmarkStart w:id="43" w:name="X6b41d0bc1b6a7aa734a67750c2b9949c703d461"/>
+    <w:bookmarkEnd w:id="40"/>
+    <w:bookmarkStart w:id="44" w:name="X6b41d0bc1b6a7aa734a67750c2b9949c703d461"/>
     <w:p>
       <w:pPr>
         <w:pStyle w:val="Heading3"/>
@@ -4543,18 +5868,18 @@
                 <wp:inline>
                   <wp:extent cx="5334000" cy="1778000"/>
                   <wp:effectExtent b="0" l="0" r="0" t="0"/>
-                  <wp:docPr descr="" title="" id="41" name="Picture"/>
+                  <wp:docPr descr="" title="" id="42" name="Picture"/>
                   <a:graphic>
                     <a:graphicData uri="http://schemas.openxmlformats.org/drawingml/2006/picture">
                       <pic:pic>
                         <pic:nvPicPr>
-                          <pic:cNvPr descr="file:///E:/tmp/claude/E--Projects-Submitted-MobileAd-Comverse/464e82cd-870f-4dc1-b795-92348cf1a9b8/scratchpad/figs/fig3.png" id="42" name="Picture"/>
+                          <pic:cNvPr descr="file:///E:/tmp/claude/E--Projects-Submitted-MobileAd-Comverse/464e82cd-870f-4dc1-b795-92348cf1a9b8/scratchpad/figs/fig3.png" id="43" name="Picture"/>
                           <pic:cNvPicPr>
                             <a:picLocks noChangeArrowheads="1" noChangeAspect="1"/>
                           </pic:cNvPicPr>
                         </pic:nvPicPr>
                         <pic:blipFill>
-                          <a:blip r:embed="rId40"/>
+                          <a:blip r:embed="rId41"/>
                           <a:stretch>
                             <a:fillRect/>
                           </a:stretch>
@@ -4598,8 +5923,8 @@
         <w:t xml:space="preserve">The closed loop. Offline analytics compiles the model and allocation plan into lookup tables; the online engine executes them per impression and streams response records back, which the next analytics cycle uses to refine clusters, probabilities, and the plan.</w:t>
       </w:r>
     </w:p>
-    <w:bookmarkEnd w:id="43"/>
-    <w:bookmarkStart w:id="47" w:name="the-seven-step-decision"/>
+    <w:bookmarkEnd w:id="44"/>
+    <w:bookmarkStart w:id="48" w:name="the-seven-step-decision"/>
     <w:p>
       <w:pPr>
         <w:pStyle w:val="Heading3"/>
@@ -4613,7 +5938,7 @@
         <w:pStyle w:val="Compact"/>
         <w:numPr>
           <w:ilvl w:val="0"/>
-          <w:numId w:val="1002"/>
+          <w:numId w:val="1003"/>
         </w:numPr>
       </w:pPr>
       <w:r>
@@ -4638,7 +5963,7 @@
         <w:pStyle w:val="Compact"/>
         <w:numPr>
           <w:ilvl w:val="0"/>
-          <w:numId w:val="1002"/>
+          <w:numId w:val="1003"/>
         </w:numPr>
       </w:pPr>
       <w:r>
@@ -4663,7 +5988,7 @@
         <w:pStyle w:val="Compact"/>
         <w:numPr>
           <w:ilvl w:val="0"/>
-          <w:numId w:val="1002"/>
+          <w:numId w:val="1003"/>
         </w:numPr>
       </w:pPr>
       <w:r>
@@ -4688,7 +6013,7 @@
         <w:pStyle w:val="Compact"/>
         <w:numPr>
           <w:ilvl w:val="0"/>
-          <w:numId w:val="1002"/>
+          <w:numId w:val="1003"/>
         </w:numPr>
       </w:pPr>
       <w:r>
@@ -4713,7 +6038,7 @@
         <w:pStyle w:val="Compact"/>
         <w:numPr>
           <w:ilvl w:val="0"/>
-          <w:numId w:val="1002"/>
+          <w:numId w:val="1003"/>
         </w:numPr>
       </w:pPr>
       <w:r>
@@ -4738,7 +6063,7 @@
         <w:pStyle w:val="Compact"/>
         <w:numPr>
           <w:ilvl w:val="0"/>
-          <w:numId w:val="1002"/>
+          <w:numId w:val="1003"/>
         </w:numPr>
       </w:pPr>
       <w:r>
@@ -4760,7 +6085,7 @@
         <w:pStyle w:val="Compact"/>
         <w:numPr>
           <w:ilvl w:val="0"/>
-          <w:numId w:val="1002"/>
+          <w:numId w:val="1003"/>
         </w:numPr>
       </w:pPr>
       <w:r>
@@ -4811,18 +6136,18 @@
                 <wp:inline>
                   <wp:extent cx="5334000" cy="2755900"/>
                   <wp:effectExtent b="0" l="0" r="0" t="0"/>
-                  <wp:docPr descr="" title="" id="45" name="Picture"/>
+                  <wp:docPr descr="" title="" id="46" name="Picture"/>
                   <a:graphic>
                     <a:graphicData uri="http://schemas.openxmlformats.org/drawingml/2006/picture">
                       <pic:pic>
                         <pic:nvPicPr>
-                          <pic:cNvPr descr="file:///E:/tmp/claude/E--Projects-Submitted-MobileAd-Comverse/464e82cd-870f-4dc1-b795-92348cf1a9b8/scratchpad/figs/fig4.png" id="46" name="Picture"/>
+                          <pic:cNvPr descr="file:///E:/tmp/claude/E--Projects-Submitted-MobileAd-Comverse/464e82cd-870f-4dc1-b795-92348cf1a9b8/scratchpad/figs/fig4.png" id="47" name="Picture"/>
                           <pic:cNvPicPr>
                             <a:picLocks noChangeArrowheads="1" noChangeAspect="1"/>
                           </pic:cNvPicPr>
                         </pic:nvPicPr>
                         <pic:blipFill>
-                          <a:blip r:embed="rId44"/>
+                          <a:blip r:embed="rId45"/>
                           <a:stretch>
                             <a:fillRect/>
                           </a:stretch>
@@ -4866,8 +6191,8 @@
         <w:t xml:space="preserve">The seven-step decision path and its data dependencies. Steps 1–5 each read one pre-computed or live table; step 6 is pure arithmetic over the candidates; step 7 writes the served impression back into the status and response tables, which is also the record that feeds the next offline refinement cycle.</w:t>
       </w:r>
     </w:p>
-    <w:bookmarkEnd w:id="47"/>
-    <w:bookmarkStart w:id="48" w:name="click-prediction-by-soft-membership"/>
+    <w:bookmarkEnd w:id="48"/>
+    <w:bookmarkStart w:id="49" w:name="click-prediction-by-soft-membership"/>
     <w:p>
       <w:pPr>
         <w:pStyle w:val="Heading3"/>
@@ -4919,8 +6244,8 @@
         <w:t xml:space="preserve">Because the subscriber borrows from every cluster they resemble, the estimate is stable even for subscribers with thin personal histories, and it is computed from two table rows and four multiplications.</w:t>
       </w:r>
     </w:p>
-    <w:bookmarkEnd w:id="48"/>
-    <w:bookmarkStart w:id="52" w:name="pacing-planned-versus-actual"/>
+    <w:bookmarkEnd w:id="49"/>
+    <w:bookmarkStart w:id="53" w:name="pacing-planned-versus-actual"/>
     <w:p>
       <w:pPr>
         <w:pStyle w:val="Heading3"/>
@@ -5195,18 +6520,18 @@
                 <wp:inline>
                   <wp:extent cx="5334000" cy="2074333"/>
                   <wp:effectExtent b="0" l="0" r="0" t="0"/>
-                  <wp:docPr descr="" title="" id="50" name="Picture"/>
+                  <wp:docPr descr="" title="" id="51" name="Picture"/>
                   <a:graphic>
                     <a:graphicData uri="http://schemas.openxmlformats.org/drawingml/2006/picture">
                       <pic:pic>
                         <pic:nvPicPr>
-                          <pic:cNvPr descr="file:///E:/tmp/claude/E--Projects-Submitted-MobileAd-Comverse/464e82cd-870f-4dc1-b795-92348cf1a9b8/scratchpad/figs/fig5.png" id="51" name="Picture"/>
+                          <pic:cNvPr descr="file:///E:/tmp/claude/E--Projects-Submitted-MobileAd-Comverse/464e82cd-870f-4dc1-b795-92348cf1a9b8/scratchpad/figs/fig5.png" id="52" name="Picture"/>
                           <pic:cNvPicPr>
                             <a:picLocks noChangeArrowheads="1" noChangeAspect="1"/>
                           </pic:cNvPicPr>
                         </pic:nvPicPr>
                         <pic:blipFill>
-                          <a:blip r:embed="rId49"/>
+                          <a:blip r:embed="rId50"/>
                           <a:stretch>
                             <a:fillRect/>
                           </a:stretch>
@@ -5654,9 +6979,9 @@
         <w:t xml:space="preserve">C4 carries the greatest expected revenue but sits at 128% of plan, past the overserved threshold, so it is dropped; C1 at 55% is behind plan but above the critical threshold, so it earns no override. Among the remaining candidates the engine serves C3, the greatest expected revenue for this impression. The pacing mechanism is what lets a static offline plan survive contact with real, noisy traffic: the plan sets the destination, and the index steers thousands of small per-impression corrections toward it. Deviations that pacing cannot absorb (a traffic forecast that proves wrong, a campaign that outperforms its category prior) are exactly what the feedback loop carries back into the next planning cycle.</w:t>
       </w:r>
     </w:p>
-    <w:bookmarkEnd w:id="52"/>
     <w:bookmarkEnd w:id="53"/>
-    <w:bookmarkStart w:id="54" w:name="related-work"/>
+    <w:bookmarkEnd w:id="54"/>
+    <w:bookmarkStart w:id="55" w:name="related-work"/>
     <w:p>
       <w:pPr>
         <w:pStyle w:val="Heading2"/>
@@ -5722,8 +7047,8 @@
         <w:t xml:space="preserve">Industrial click-through-rate modeling ranges from large-scale logistic regression [15] and field-aware factorization machines [16] to attention architectures over user behavior [17, 3]. Our click model is deliberately simpler, hierarchical empirical rates with soft cluster membership, because the architecture consumes any calibrated estimator and the allocation question is about the pairing structure, not the estimator frontier. For evaluation, replay methods [18], counterfactual reasoning in computational advertising [19], and offline A/B testing [20] establish the off-policy toolbox; the dual-model scoring of Section 4 applies the same discipline to allocation policies specifically, where we show single-model replay inflates lift through the plan’s own estimation noise.</w:t>
       </w:r>
     </w:p>
-    <w:bookmarkEnd w:id="54"/>
-    <w:bookmarkStart w:id="55" w:name="discussion"/>
+    <w:bookmarkEnd w:id="55"/>
+    <w:bookmarkStart w:id="56" w:name="discussion"/>
     <w:p>
       <w:pPr>
         <w:pStyle w:val="Heading2"/>
@@ -5807,8 +7132,8 @@
         <w:t xml:space="preserve">Bit masks make targeting tests branchless; pre-computed distances make personalization a weighted sum; per-(cluster, campaign) rows make pacing a two-row query. The offline stage does not merely produce a model; it compiles one, in the same sense a compiler turns a program into a form the machine executes directly.</w:t>
       </w:r>
     </w:p>
-    <w:bookmarkEnd w:id="55"/>
-    <w:bookmarkStart w:id="56" w:name="scope-and-assumptions"/>
+    <w:bookmarkEnd w:id="56"/>
+    <w:bookmarkStart w:id="57" w:name="scope-and-assumptions"/>
     <w:p>
       <w:pPr>
         <w:pStyle w:val="Heading2"/>
@@ -5828,8 +7153,8 @@
         <w:t xml:space="preserve">The architecture optimizes expected revenue for a known campaign portfolio over a planning horizon; it does not address auction-based pricing, real-time bidding against external demand, or creative selection within a campaign. Its guarantees rest on the stability assumptions of Section 8.1: allocation quality degrades in proportion to how far future traffic and response distributions drift from the modeled ones between refinement cycles, which sets the practical requirement for how frequently the offline stage must re-run. Exposure policy enforcement is per-subscriber and rule-based; richer fatigue models would slot into step 2 without changing the surrounding machinery. Finally, window-fitted planning presumes a campaign portfolio stable over the planning horizon, which is the operator’s contracted-campaign setting; in marketplaces where the ad portfolio and its delivery mix turn over within a day, the re-planning interval must shrink to the churn timescale for the plan to retain value.</w:t>
       </w:r>
     </w:p>
-    <w:bookmarkEnd w:id="56"/>
-    <w:bookmarkStart w:id="57" w:name="references"/>
+    <w:bookmarkEnd w:id="57"/>
+    <w:bookmarkStart w:id="58" w:name="references"/>
     <w:p>
       <w:pPr>
         <w:pStyle w:val="Heading2"/>
@@ -5843,7 +7168,7 @@
         <w:pStyle w:val="Compact"/>
         <w:numPr>
           <w:ilvl w:val="0"/>
-          <w:numId w:val="1003"/>
+          <w:numId w:val="1004"/>
         </w:numPr>
       </w:pPr>
       <w:r>
@@ -5868,7 +7193,7 @@
         <w:pStyle w:val="Compact"/>
         <w:numPr>
           <w:ilvl w:val="0"/>
-          <w:numId w:val="1003"/>
+          <w:numId w:val="1004"/>
         </w:numPr>
       </w:pPr>
       <w:r>
@@ -5880,7 +7205,7 @@
         <w:pStyle w:val="Compact"/>
         <w:numPr>
           <w:ilvl w:val="0"/>
-          <w:numId w:val="1003"/>
+          <w:numId w:val="1004"/>
         </w:numPr>
       </w:pPr>
       <w:r>
@@ -5905,7 +7230,7 @@
         <w:pStyle w:val="Compact"/>
         <w:numPr>
           <w:ilvl w:val="0"/>
-          <w:numId w:val="1003"/>
+          <w:numId w:val="1004"/>
         </w:numPr>
       </w:pPr>
       <w:r>
@@ -5917,7 +7242,7 @@
         <w:pStyle w:val="Compact"/>
         <w:numPr>
           <w:ilvl w:val="0"/>
-          <w:numId w:val="1003"/>
+          <w:numId w:val="1004"/>
         </w:numPr>
       </w:pPr>
       <w:r>
@@ -5942,7 +7267,7 @@
         <w:pStyle w:val="Compact"/>
         <w:numPr>
           <w:ilvl w:val="0"/>
-          <w:numId w:val="1003"/>
+          <w:numId w:val="1004"/>
         </w:numPr>
       </w:pPr>
       <w:r>
@@ -5967,7 +7292,7 @@
         <w:pStyle w:val="Compact"/>
         <w:numPr>
           <w:ilvl w:val="0"/>
-          <w:numId w:val="1003"/>
+          <w:numId w:val="1004"/>
         </w:numPr>
       </w:pPr>
       <w:r>
@@ -5992,7 +7317,7 @@
         <w:pStyle w:val="Compact"/>
         <w:numPr>
           <w:ilvl w:val="0"/>
-          <w:numId w:val="1003"/>
+          <w:numId w:val="1004"/>
         </w:numPr>
       </w:pPr>
       <w:r>
@@ -6017,7 +7342,7 @@
         <w:pStyle w:val="Compact"/>
         <w:numPr>
           <w:ilvl w:val="0"/>
-          <w:numId w:val="1003"/>
+          <w:numId w:val="1004"/>
         </w:numPr>
       </w:pPr>
       <w:r>
@@ -6042,7 +7367,7 @@
         <w:pStyle w:val="Compact"/>
         <w:numPr>
           <w:ilvl w:val="0"/>
-          <w:numId w:val="1003"/>
+          <w:numId w:val="1004"/>
         </w:numPr>
       </w:pPr>
       <w:r>
@@ -6067,7 +7392,7 @@
         <w:pStyle w:val="Compact"/>
         <w:numPr>
           <w:ilvl w:val="0"/>
-          <w:numId w:val="1003"/>
+          <w:numId w:val="1004"/>
         </w:numPr>
       </w:pPr>
       <w:r>
@@ -6092,7 +7417,7 @@
         <w:pStyle w:val="Compact"/>
         <w:numPr>
           <w:ilvl w:val="0"/>
-          <w:numId w:val="1003"/>
+          <w:numId w:val="1004"/>
         </w:numPr>
       </w:pPr>
       <w:r>
@@ -6117,7 +7442,7 @@
         <w:pStyle w:val="Compact"/>
         <w:numPr>
           <w:ilvl w:val="0"/>
-          <w:numId w:val="1003"/>
+          <w:numId w:val="1004"/>
         </w:numPr>
       </w:pPr>
       <w:r>
@@ -6142,7 +7467,7 @@
         <w:pStyle w:val="Compact"/>
         <w:numPr>
           <w:ilvl w:val="0"/>
-          <w:numId w:val="1003"/>
+          <w:numId w:val="1004"/>
         </w:numPr>
       </w:pPr>
       <w:r>
@@ -6167,7 +7492,7 @@
         <w:pStyle w:val="Compact"/>
         <w:numPr>
           <w:ilvl w:val="0"/>
-          <w:numId w:val="1003"/>
+          <w:numId w:val="1004"/>
         </w:numPr>
       </w:pPr>
       <w:r>
@@ -6192,7 +7517,7 @@
         <w:pStyle w:val="Compact"/>
         <w:numPr>
           <w:ilvl w:val="0"/>
-          <w:numId w:val="1003"/>
+          <w:numId w:val="1004"/>
         </w:numPr>
       </w:pPr>
       <w:r>
@@ -6217,7 +7542,7 @@
         <w:pStyle w:val="Compact"/>
         <w:numPr>
           <w:ilvl w:val="0"/>
-          <w:numId w:val="1003"/>
+          <w:numId w:val="1004"/>
         </w:numPr>
       </w:pPr>
       <w:r>
@@ -6242,7 +7567,7 @@
         <w:pStyle w:val="Compact"/>
         <w:numPr>
           <w:ilvl w:val="0"/>
-          <w:numId w:val="1003"/>
+          <w:numId w:val="1004"/>
         </w:numPr>
       </w:pPr>
       <w:r>
@@ -6267,7 +7592,7 @@
         <w:pStyle w:val="Compact"/>
         <w:numPr>
           <w:ilvl w:val="0"/>
-          <w:numId w:val="1003"/>
+          <w:numId w:val="1004"/>
         </w:numPr>
       </w:pPr>
       <w:r>
@@ -6292,7 +7617,7 @@
         <w:pStyle w:val="Compact"/>
         <w:numPr>
           <w:ilvl w:val="0"/>
-          <w:numId w:val="1003"/>
+          <w:numId w:val="1004"/>
         </w:numPr>
       </w:pPr>
       <w:r>
@@ -6314,13 +7639,113 @@
     </w:p>
     <w:p>
       <w:pPr>
+        <w:pStyle w:val="Compact"/>
+        <w:numPr>
+          <w:ilvl w:val="0"/>
+          <w:numId w:val="1004"/>
+        </w:numPr>
+      </w:pPr>
+      <w:r>
+        <w:t xml:space="preserve">S. Balseiro, H. Lu, and V. Mirrokni. Dual mirror descent for online allocation problems. In</w:t>
+      </w:r>
+      <w:r>
+        <w:t xml:space="preserve"> </w:t>
+      </w:r>
+      <w:r>
+        <w:rPr>
+          <w:i/>
+          <w:iCs/>
+        </w:rPr>
+        <w:t xml:space="preserve">Proceedings of the 37th International Conference on Machine Learning (ICML)</w:t>
+      </w:r>
+      <w:r>
+        <w:t xml:space="preserve">, pages 613–628, 2020.</w:t>
+      </w:r>
+    </w:p>
+    <w:p>
+      <w:pPr>
+        <w:pStyle w:val="Compact"/>
+        <w:numPr>
+          <w:ilvl w:val="0"/>
+          <w:numId w:val="1004"/>
+        </w:numPr>
+      </w:pPr>
+      <w:r>
+        <w:t xml:space="preserve">S. Balseiro, J. Feldman, V. Mirrokni, and S. Muthukrishnan. Yield optimization of display advertising with ad exchange.</w:t>
+      </w:r>
+      <w:r>
+        <w:t xml:space="preserve"> </w:t>
+      </w:r>
+      <w:r>
+        <w:rPr>
+          <w:i/>
+          <w:iCs/>
+        </w:rPr>
+        <w:t xml:space="preserve">Management Science</w:t>
+      </w:r>
+      <w:r>
+        <w:t xml:space="preserve">, 60(12):2886–2907, 2014.</w:t>
+      </w:r>
+    </w:p>
+    <w:p>
+      <w:pPr>
+        <w:pStyle w:val="Compact"/>
+        <w:numPr>
+          <w:ilvl w:val="0"/>
+          <w:numId w:val="1004"/>
+        </w:numPr>
+      </w:pPr>
+      <w:r>
+        <w:t xml:space="preserve">M. Dudík, J. Langford, and L. Li. Doubly robust policy evaluation and learning. In</w:t>
+      </w:r>
+      <w:r>
+        <w:t xml:space="preserve"> </w:t>
+      </w:r>
+      <w:r>
+        <w:rPr>
+          <w:i/>
+          <w:iCs/>
+        </w:rPr>
+        <w:t xml:space="preserve">Proceedings of the 28th International Conference on Machine Learning (ICML)</w:t>
+      </w:r>
+      <w:r>
+        <w:t xml:space="preserve">, pages 1097–1104, 2011.</w:t>
+      </w:r>
+    </w:p>
+    <w:p>
+      <w:pPr>
+        <w:pStyle w:val="Compact"/>
+        <w:numPr>
+          <w:ilvl w:val="0"/>
+          <w:numId w:val="1004"/>
+        </w:numPr>
+      </w:pPr>
+      <w:r>
+        <w:t xml:space="preserve">Y.-X. Wang, A. Agarwal, and M. Dudík. Optimal and adaptive off-policy evaluation in contextual bandits. In</w:t>
+      </w:r>
+      <w:r>
+        <w:t xml:space="preserve"> </w:t>
+      </w:r>
+      <w:r>
+        <w:rPr>
+          <w:i/>
+          <w:iCs/>
+        </w:rPr>
+        <w:t xml:space="preserve">Proceedings of the 34th International Conference on Machine Learning (ICML)</w:t>
+      </w:r>
+      <w:r>
+        <w:t xml:space="preserve">, pages 3589–3597, 2017.</w:t>
+      </w:r>
+    </w:p>
+    <w:p>
+      <w:pPr>
         <w:pStyle w:val="FirstParagraph"/>
       </w:pPr>
       <w:r>
         <w:t xml:space="preserve">Preprint, August 2026. Code and replay harness: github.com/ApartsinProjects/optimal-impression-allocation.</w:t>
       </w:r>
     </w:p>
-    <w:bookmarkEnd w:id="57"/>
+    <w:bookmarkEnd w:id="58"/>
     <w:sectPr/>
   </w:body>
 </w:document>
@@ -6576,6 +8001,36 @@
     </w:lvlOverride>
   </w:num>
   <w:num w:numId="1003">
+    <w:abstractNumId w:val="99201"/>
+    <w:lvlOverride w:ilvl="0">
+      <w:startOverride w:val="1"/>
+    </w:lvlOverride>
+    <w:lvlOverride w:ilvl="1">
+      <w:startOverride w:val="1"/>
+    </w:lvlOverride>
+    <w:lvlOverride w:ilvl="2">
+      <w:startOverride w:val="1"/>
+    </w:lvlOverride>
+    <w:lvlOverride w:ilvl="3">
+      <w:startOverride w:val="1"/>
+    </w:lvlOverride>
+    <w:lvlOverride w:ilvl="4">
+      <w:startOverride w:val="1"/>
+    </w:lvlOverride>
+    <w:lvlOverride w:ilvl="5">
+      <w:startOverride w:val="1"/>
+    </w:lvlOverride>
+    <w:lvlOverride w:ilvl="6">
+      <w:startOverride w:val="1"/>
+    </w:lvlOverride>
+    <w:lvlOverride w:ilvl="7">
+      <w:startOverride w:val="1"/>
+    </w:lvlOverride>
+    <w:lvlOverride w:ilvl="8">
+      <w:startOverride w:val="1"/>
+    </w:lvlOverride>
+  </w:num>
+  <w:num w:numId="1004">
     <w:abstractNumId w:val="99201"/>
     <w:lvlOverride w:ilvl="0">
       <w:startOverride w:val="1"/>

</xml_diff>

<commit_message>
IJOC P0 #4: semi-synthetic OPE benchmark validates model-scored replay
Section 4.1: in a controlled world with known ground-truth response
(disjoint slice, interaction amplified by kappa), model-scored replay
recovers the correct policy ranking at realistic signal (Spearman 1.00
at k=1.0, 0.90 at k=1.5), selects the true-best policy, and estimates
lift within ~1.4pp of truth; fine ordering among near-tied top policies
degrades only under amplified signal (k=2.0). Directly answers review W4.
Adds semisynth_ope.py + refreshed pgss_verify.py, h2_replay.py, PDF, DOCX.

Co-Authored-By: Claude Opus 4.8 <noreply@anthropic.com>
</commit_message>
<xml_diff>
--- a/paper.docx
+++ b/paper.docx
@@ -1841,7 +1841,7 @@
     </w:p>
     <w:bookmarkEnd w:id="27"/>
     <w:bookmarkEnd w:id="28"/>
-    <w:bookmarkStart w:id="29" w:name="replay-evaluation-protocol"/>
+    <w:bookmarkStart w:id="30" w:name="replay-evaluation-protocol"/>
     <w:p>
       <w:pPr>
         <w:pStyle w:val="Heading2"/>
@@ -1962,8 +1962,38 @@
         <w:t xml:space="preserve"> − t/T) after each impression with η set to half the global click rate; it consults no plan. Reported errors are the scoring table’s closed-form binomial variance propagated through each comparison’s assignment difference; the across-fold spread of the five per-fold lifts independently reproduces the same standard error, and the all-folds-positive sign pattern supports the parametric statement distribution-free. The uniform control defends the harness; a further check defends the scorer itself: standardizing the scoring table along the strongest observable within-cell covariate the segmentation does not use (each user’s own training-window click propensity) shifts the headline lifts by at most +0.3pp, upward, so observable within-cell selection in the logged exposures does not account for the measured gains. Support is also measured directly: only 6% of the planned policy’s assignment mass (and 5% of the re-paired mass) lands in cells with fewer than 100 logged serving-window impressions, and scoring those thin cells with a pooled campaign-level fallback moves the headline from +3.46% to +2.99%; the counterfactual does not rest on extrapolated cells. (Forcing the fallback on all cells below 1,000 impressions, 78% of the mass, collapses the lift toward zero, as it must: a campaign-constant scorer deletes the interaction dimension, and under fixed quotas every assignment then scores equally, the same argument as the uniform control.) The replay isolates the architecture’s allocation core, plan against serving policy at segment granularity: every campaign is eligible on every segment, and the per-subscriber serving components of Section 8.2 (soft-membership blending, frequency caps, threshold pacing) operate below this granularity and are not exercised by these experiments.</w:t>
       </w:r>
     </w:p>
+    <w:bookmarkStart w:id="29" w:name="X888dfabe7f5ac870af14768d223c176646b6318"/>
+    <w:p>
+      <w:pPr>
+        <w:pStyle w:val="Heading3"/>
+      </w:pPr>
+      <w:r>
+        <w:t xml:space="preserve">4.1</w:t>
+      </w:r>
+      <w:r>
+        <w:t xml:space="preserve">Does model-scored replay recover the truth?</w:t>
+      </w:r>
+    </w:p>
+    <w:p>
+      <w:pPr>
+        <w:pStyle w:val="FirstParagraph"/>
+      </w:pPr>
+      <w:r>
+        <w:t xml:space="preserve">Real logs cannot say whether the model-scored lifts equal the counterfactual truth, because the truth is unobserved. A semi-synthetic benchmark can. We build a world where the response is known: on a slice disjoint from all reported experiments (Taobao days 6–8) we fit a shrunk (campaign, segment) click surface, amplify its double-centered interaction by a factor κ so policies genuinely differ, and freeze the result as a ground-truth θ</w:t>
+      </w:r>
+      <w:r>
+        <w:rPr>
+          <w:vertAlign w:val="subscript"/>
+        </w:rPr>
+        <w:t xml:space="preserve">cs</w:t>
+      </w:r>
+      <w:r>
+        <w:t xml:space="preserve">. The logging policy is the real exposure pattern; clicks are then sampled ∼ Bernoulli(θ) on the real exposures to fit a planning table (days 9–11) and an independent scoring table (days 12–13), so both tables carry realistic estimation noise and θ itself never scores anything the planner sees. Five policies (greedy, static plan, periodic re-solve, fixed optimal dual, entropic Dual Mirror Descent) then replay the day 12–13 stream, and each assignment is scored twice: under the noisy table, exactly as the paper reports, and under θ, which only this controlled setting makes available. At realistic interaction strength the model-scored replay recovers the decision that matters: every strong policy is correctly separated from greedy, the model-scored ranking matches the true ranking (Spearman 1.00 at κ=1.0, 0.90 at κ=1.5), the model selects the truly best policy in both cases, and the estimated greedy-relative lift sits within about 1.4 percentage points of its true value. The limit is also visible: when the interaction is amplified beyond the level seen in the real data (κ=2.0), the top policies bunch within roughly 0.3 points of one another in truth, and the noisy table reorders those near-ties (Spearman 0.70), selecting the entropic dual over the static plan when the plan is in fact marginally better. Model-scored replay is therefore trustworthy for the claims this paper makes, which separate a strong tier from greedy and identify a robust re-solve or plan policy, and it should not be read as resolving fine differences among near-tied top policies. The benchmark is released with the replication package.</w:t>
+      </w:r>
+    </w:p>
     <w:bookmarkEnd w:id="29"/>
-    <w:bookmarkStart w:id="30" w:name="the-persistence-rule"/>
+    <w:bookmarkEnd w:id="30"/>
+    <w:bookmarkStart w:id="31" w:name="the-persistence-rule"/>
     <w:p>
       <w:pPr>
         <w:pStyle w:val="Heading2"/>
@@ -3087,8 +3117,8 @@
         <w:t xml:space="preserve">, the criterion keeps eight tiers at top-100 and four at top-500, matching the ablation optima above. The threshold is an order-of-magnitude reliability target rather than a constant validated out of sample, so we report depth selection as density-guided rather than fully closed; the axis and abstain decisions are the parts of Algorithm 1 that run without any such tuning.</w:t>
       </w:r>
     </w:p>
-    <w:bookmarkEnd w:id="30"/>
-    <w:bookmarkStart w:id="31" w:name="the-regime-map"/>
+    <w:bookmarkEnd w:id="31"/>
+    <w:bookmarkStart w:id="32" w:name="the-regime-map"/>
     <w:p>
       <w:pPr>
         <w:pStyle w:val="Heading2"/>
@@ -3684,8 +3714,8 @@
         <w:t xml:space="preserve">Three robustness checks anchor the table. The headline planned-versus-greedy comparison survives a user-clustered bootstrap (z = +4.55) and an across-fold t-test (t(4) = +5.50); at exact feasibility the strong policies are statistically close, so the ordering across contention regimes, not any single feasibility cell, is the claim. Re-pairing the impression stream changes per-user exposure composition; re-scoring under a first-exposure table (each user’s first impression of each campaign only, which removes repeat-exposure composition) moves the headline from +3.46% to +3.88%, so exposure fatigue does not manufacture the result. The regime map is a single-market result: the over-subscription sweep is run on the Taobao top-100 reconstruction, while Avazu contributes only the stability boundary. The z-values in the table above the headline row come from the parametric binomial model; the conclusions that rest on them (the re-solved plan’s dominance at every scale, the dual collapse) hold with the same sign and comparable magnitude under the user-clustered bootstrap where we recomputed them. The remaining, and inherent, limitation is that these are model-scored expected clicks: an outcome-grounded estimate is possible only on the 2–2.4% of impressions where a policy’s choice coincides with the logged action, a subset both tiny and selected toward the logging policy. On it, a self-normalized inverse-propensity estimate with an estimated segment-level logging propensity puts planned within ±1pp of greedy at t(4) = −0.5, that is, inconclusive; the matched-subset calibration shows the model scorer understates realized CTR slightly and symmetrically for both policies (about 6.8% realized versus 6.5% modeled), so it is not inflating the gap. Public logs cannot close this gap; only an interventional deployment can.</w:t>
       </w:r>
     </w:p>
-    <w:bookmarkEnd w:id="31"/>
-    <w:bookmarkStart w:id="35" w:name="simulation-as-calibration"/>
+    <w:bookmarkEnd w:id="32"/>
+    <w:bookmarkStart w:id="36" w:name="simulation-as-calibration"/>
     <w:p>
       <w:pPr>
         <w:pStyle w:val="Heading2"/>
@@ -4040,18 +4070,18 @@
                 <wp:inline>
                   <wp:extent cx="5334000" cy="2370666"/>
                   <wp:effectExtent b="0" l="0" r="0" t="0"/>
-                  <wp:docPr descr="" title="" id="33" name="Picture"/>
+                  <wp:docPr descr="" title="" id="34" name="Picture"/>
                   <a:graphic>
                     <a:graphicData uri="http://schemas.openxmlformats.org/drawingml/2006/picture">
                       <pic:pic>
                         <pic:nvPicPr>
-                          <pic:cNvPr descr="file:///E:/tmp/claude/E--Projects-Submitted-MobileAd-Comverse/464e82cd-870f-4dc1-b795-92348cf1a9b8/scratchpad/figs/fig2.png" id="34" name="Picture"/>
+                          <pic:cNvPr descr="file:///E:/tmp/claude/E--Projects-Submitted-MobileAd-Comverse/464e82cd-870f-4dc1-b795-92348cf1a9b8/scratchpad/figs/fig2.png" id="35" name="Picture"/>
                           <pic:cNvPicPr>
                             <a:picLocks noChangeArrowheads="1" noChangeAspect="1"/>
                           </pic:cNvPicPr>
                         </pic:nvPicPr>
                         <pic:blipFill>
-                          <a:blip r:embed="rId32"/>
+                          <a:blip r:embed="rId33"/>
                           <a:stretch>
                             <a:fillRect/>
                           </a:stretch>
@@ -4124,8 +4154,8 @@
         <w:t xml:space="preserve">The simulation carries its own controls. Both policies are verified against the hindsight bound in every replication. On control instances where all campaigns share identical click probabilities, so pairing cannot matter, the measured lift is 0.000%, confirming that the gap measures allocation quality and not an artifact of the harness. And the planned policy’s 93.8% of a bound computed with perfect hindsight shows that forecast noise costs the plan only a few points, the residual that Section 8.2’s pacing mechanism and the refinement loop exist to absorb.</w:t>
       </w:r>
     </w:p>
-    <w:bookmarkEnd w:id="35"/>
-    <w:bookmarkStart w:id="54" w:name="a-reference-serving-architecture"/>
+    <w:bookmarkEnd w:id="36"/>
+    <w:bookmarkStart w:id="55" w:name="a-reference-serving-architecture"/>
     <w:p>
       <w:pPr>
         <w:pStyle w:val="Heading2"/>
@@ -4442,7 +4472,7 @@
         <w:t xml:space="preserve">The vantage point carries obligations that shape the design. Subscriber data is usable for advertising only within a consent and data-protection framework: profiling requires a lawful basis and per-subscriber opt-out under regimes such as the GDPR and ePrivacy rules, and gateway-observed browsing is subject to purpose limitation. The architecture is built for data minimization under those constraints: raw attributes and browsing records are confined to the offline stage, the serving path receives only anonymous cluster distances and campaign eligibility lists, and every online decision reads aggregate tables rather than individual histories. Segment coarseness is itself a privacy parameter: the segments that carry allocation value in Section 5 are a handful of aggregate behavior tiers, not individual dossiers. Not every subscriber has a profile at all: prepaid subscribers may be anonymous, which is why the clustering machinery supports membership computed from response behavior alone (Section 8.1.3).</w:t>
       </w:r>
     </w:p>
-    <w:bookmarkStart w:id="36" w:name="X76cd0aab14a1b3a28329e6411b338cd4e16a2d0"/>
+    <w:bookmarkStart w:id="37" w:name="X76cd0aab14a1b3a28329e6411b338cd4e16a2d0"/>
     <w:p>
       <w:pPr>
         <w:pStyle w:val="Heading3"/>
@@ -4539,8 +4569,8 @@
         <w:t xml:space="preserve">Assumption 1 justifies forecasting traffic from history; assumptions 2 and 3 justify pooling sparse per-subscriber click data into clusters that have enough volume to estimate probabilities reliably.</w:t>
       </w:r>
     </w:p>
-    <w:bookmarkEnd w:id="36"/>
-    <w:bookmarkStart w:id="37" w:name="response-records"/>
+    <w:bookmarkEnd w:id="37"/>
+    <w:bookmarkStart w:id="38" w:name="response-records"/>
     <w:p>
       <w:pPr>
         <w:pStyle w:val="Heading3"/>
@@ -4830,8 +4860,8 @@
         <w:t xml:space="preserve">Records are grouped per subscriber and joined with the profile (age, gender, location, income band, purchase indicators) where one is available. Past campaigns matter as much as active ones: a subscriber’s reaction to a finished campaign is evidence about how they will react to similar future ones.</w:t>
       </w:r>
     </w:p>
-    <w:bookmarkEnd w:id="37"/>
-    <w:bookmarkStart w:id="38" w:name="proximity-and-clustering"/>
+    <w:bookmarkEnd w:id="38"/>
+    <w:bookmarkStart w:id="39" w:name="proximity-and-clustering"/>
     <w:p>
       <w:pPr>
         <w:pStyle w:val="Heading3"/>
@@ -5039,8 +5069,8 @@
         <w:t xml:space="preserve">. A subscriber is not filed into one cluster; they carry a pre-computed distance to each nearby cluster. A 35-year-old married streaming subscriber in a large city may sit at distance 0.8 from the “metropolitan professionals” cluster and 0.1 from “music lovers”; a 22-year-old gaming subscriber in the same city sits close to “gamers” and “music lovers” instead. These distances become interpolation weights at serving time (Section 8.2), so predictions blend the behavior of every cluster the subscriber resembles.</w:t>
       </w:r>
     </w:p>
-    <w:bookmarkEnd w:id="38"/>
-    <w:bookmarkStart w:id="39" w:name="Xcf0c62df256e2cee415416a2e095f7c938d4365"/>
+    <w:bookmarkEnd w:id="39"/>
+    <w:bookmarkStart w:id="40" w:name="Xcf0c62df256e2cee415416a2e095f7c938d4365"/>
     <w:p>
       <w:pPr>
         <w:pStyle w:val="Heading3"/>
@@ -5558,8 +5588,8 @@
         <w:t xml:space="preserve">For a brand-new campaign with no history of its own, probabilities are borrowed from the most similar past or active campaigns in the same category, the same pooling idea applied across campaigns instead of across subscribers. Where the profile itself is missing (anonymous or prepaid subscribers), distance to clusters is computed from response history alone, and the subscriber inherits the response statistics of the cluster they behave like. The design degrades gracefully as data thins out: per-subscriber evidence backs off to cluster evidence, and per-campaign evidence backs off to category evidence.</w:t>
       </w:r>
     </w:p>
-    <w:bookmarkEnd w:id="39"/>
-    <w:bookmarkStart w:id="40" w:name="compiling-the-plan-into-lookup-tables"/>
+    <w:bookmarkEnd w:id="40"/>
+    <w:bookmarkStart w:id="41" w:name="compiling-the-plan-into-lookup-tables"/>
     <w:p>
       <w:pPr>
         <w:pStyle w:val="Heading3"/>
@@ -5779,8 +5809,8 @@
         <w:t xml:space="preserve">That one row carries targeting, allocation, and the performance baseline the online stage will pace against.</w:t>
       </w:r>
     </w:p>
-    <w:bookmarkEnd w:id="40"/>
-    <w:bookmarkStart w:id="44" w:name="X6b41d0bc1b6a7aa734a67750c2b9949c703d461"/>
+    <w:bookmarkEnd w:id="41"/>
+    <w:bookmarkStart w:id="45" w:name="X6b41d0bc1b6a7aa734a67750c2b9949c703d461"/>
     <w:p>
       <w:pPr>
         <w:pStyle w:val="Heading3"/>
@@ -5868,18 +5898,18 @@
                 <wp:inline>
                   <wp:extent cx="5334000" cy="1778000"/>
                   <wp:effectExtent b="0" l="0" r="0" t="0"/>
-                  <wp:docPr descr="" title="" id="42" name="Picture"/>
+                  <wp:docPr descr="" title="" id="43" name="Picture"/>
                   <a:graphic>
                     <a:graphicData uri="http://schemas.openxmlformats.org/drawingml/2006/picture">
                       <pic:pic>
                         <pic:nvPicPr>
-                          <pic:cNvPr descr="file:///E:/tmp/claude/E--Projects-Submitted-MobileAd-Comverse/464e82cd-870f-4dc1-b795-92348cf1a9b8/scratchpad/figs/fig3.png" id="43" name="Picture"/>
+                          <pic:cNvPr descr="file:///E:/tmp/claude/E--Projects-Submitted-MobileAd-Comverse/464e82cd-870f-4dc1-b795-92348cf1a9b8/scratchpad/figs/fig3.png" id="44" name="Picture"/>
                           <pic:cNvPicPr>
                             <a:picLocks noChangeArrowheads="1" noChangeAspect="1"/>
                           </pic:cNvPicPr>
                         </pic:nvPicPr>
                         <pic:blipFill>
-                          <a:blip r:embed="rId41"/>
+                          <a:blip r:embed="rId42"/>
                           <a:stretch>
                             <a:fillRect/>
                           </a:stretch>
@@ -5923,8 +5953,8 @@
         <w:t xml:space="preserve">The closed loop. Offline analytics compiles the model and allocation plan into lookup tables; the online engine executes them per impression and streams response records back, which the next analytics cycle uses to refine clusters, probabilities, and the plan.</w:t>
       </w:r>
     </w:p>
-    <w:bookmarkEnd w:id="44"/>
-    <w:bookmarkStart w:id="48" w:name="the-seven-step-decision"/>
+    <w:bookmarkEnd w:id="45"/>
+    <w:bookmarkStart w:id="49" w:name="the-seven-step-decision"/>
     <w:p>
       <w:pPr>
         <w:pStyle w:val="Heading3"/>
@@ -6136,18 +6166,18 @@
                 <wp:inline>
                   <wp:extent cx="5334000" cy="2755900"/>
                   <wp:effectExtent b="0" l="0" r="0" t="0"/>
-                  <wp:docPr descr="" title="" id="46" name="Picture"/>
+                  <wp:docPr descr="" title="" id="47" name="Picture"/>
                   <a:graphic>
                     <a:graphicData uri="http://schemas.openxmlformats.org/drawingml/2006/picture">
                       <pic:pic>
                         <pic:nvPicPr>
-                          <pic:cNvPr descr="file:///E:/tmp/claude/E--Projects-Submitted-MobileAd-Comverse/464e82cd-870f-4dc1-b795-92348cf1a9b8/scratchpad/figs/fig4.png" id="47" name="Picture"/>
+                          <pic:cNvPr descr="file:///E:/tmp/claude/E--Projects-Submitted-MobileAd-Comverse/464e82cd-870f-4dc1-b795-92348cf1a9b8/scratchpad/figs/fig4.png" id="48" name="Picture"/>
                           <pic:cNvPicPr>
                             <a:picLocks noChangeArrowheads="1" noChangeAspect="1"/>
                           </pic:cNvPicPr>
                         </pic:nvPicPr>
                         <pic:blipFill>
-                          <a:blip r:embed="rId45"/>
+                          <a:blip r:embed="rId46"/>
                           <a:stretch>
                             <a:fillRect/>
                           </a:stretch>
@@ -6191,8 +6221,8 @@
         <w:t xml:space="preserve">The seven-step decision path and its data dependencies. Steps 1–5 each read one pre-computed or live table; step 6 is pure arithmetic over the candidates; step 7 writes the served impression back into the status and response tables, which is also the record that feeds the next offline refinement cycle.</w:t>
       </w:r>
     </w:p>
-    <w:bookmarkEnd w:id="48"/>
-    <w:bookmarkStart w:id="49" w:name="click-prediction-by-soft-membership"/>
+    <w:bookmarkEnd w:id="49"/>
+    <w:bookmarkStart w:id="50" w:name="click-prediction-by-soft-membership"/>
     <w:p>
       <w:pPr>
         <w:pStyle w:val="Heading3"/>
@@ -6244,8 +6274,8 @@
         <w:t xml:space="preserve">Because the subscriber borrows from every cluster they resemble, the estimate is stable even for subscribers with thin personal histories, and it is computed from two table rows and four multiplications.</w:t>
       </w:r>
     </w:p>
-    <w:bookmarkEnd w:id="49"/>
-    <w:bookmarkStart w:id="53" w:name="pacing-planned-versus-actual"/>
+    <w:bookmarkEnd w:id="50"/>
+    <w:bookmarkStart w:id="54" w:name="pacing-planned-versus-actual"/>
     <w:p>
       <w:pPr>
         <w:pStyle w:val="Heading3"/>
@@ -6520,18 +6550,18 @@
                 <wp:inline>
                   <wp:extent cx="5334000" cy="2074333"/>
                   <wp:effectExtent b="0" l="0" r="0" t="0"/>
-                  <wp:docPr descr="" title="" id="51" name="Picture"/>
+                  <wp:docPr descr="" title="" id="52" name="Picture"/>
                   <a:graphic>
                     <a:graphicData uri="http://schemas.openxmlformats.org/drawingml/2006/picture">
                       <pic:pic>
                         <pic:nvPicPr>
-                          <pic:cNvPr descr="file:///E:/tmp/claude/E--Projects-Submitted-MobileAd-Comverse/464e82cd-870f-4dc1-b795-92348cf1a9b8/scratchpad/figs/fig5.png" id="52" name="Picture"/>
+                          <pic:cNvPr descr="file:///E:/tmp/claude/E--Projects-Submitted-MobileAd-Comverse/464e82cd-870f-4dc1-b795-92348cf1a9b8/scratchpad/figs/fig5.png" id="53" name="Picture"/>
                           <pic:cNvPicPr>
                             <a:picLocks noChangeArrowheads="1" noChangeAspect="1"/>
                           </pic:cNvPicPr>
                         </pic:nvPicPr>
                         <pic:blipFill>
-                          <a:blip r:embed="rId50"/>
+                          <a:blip r:embed="rId51"/>
                           <a:stretch>
                             <a:fillRect/>
                           </a:stretch>
@@ -6979,9 +7009,9 @@
         <w:t xml:space="preserve">C4 carries the greatest expected revenue but sits at 128% of plan, past the overserved threshold, so it is dropped; C1 at 55% is behind plan but above the critical threshold, so it earns no override. Among the remaining candidates the engine serves C3, the greatest expected revenue for this impression. The pacing mechanism is what lets a static offline plan survive contact with real, noisy traffic: the plan sets the destination, and the index steers thousands of small per-impression corrections toward it. Deviations that pacing cannot absorb (a traffic forecast that proves wrong, a campaign that outperforms its category prior) are exactly what the feedback loop carries back into the next planning cycle.</w:t>
       </w:r>
     </w:p>
-    <w:bookmarkEnd w:id="53"/>
     <w:bookmarkEnd w:id="54"/>
-    <w:bookmarkStart w:id="55" w:name="related-work"/>
+    <w:bookmarkEnd w:id="55"/>
+    <w:bookmarkStart w:id="56" w:name="related-work"/>
     <w:p>
       <w:pPr>
         <w:pStyle w:val="Heading2"/>
@@ -7047,8 +7077,8 @@
         <w:t xml:space="preserve">Industrial click-through-rate modeling ranges from large-scale logistic regression [15] and field-aware factorization machines [16] to attention architectures over user behavior [17, 3]. Our click model is deliberately simpler, hierarchical empirical rates with soft cluster membership, because the architecture consumes any calibrated estimator and the allocation question is about the pairing structure, not the estimator frontier. For evaluation, replay methods [18], counterfactual reasoning in computational advertising [19], and offline A/B testing [20] establish the off-policy toolbox; the dual-model scoring of Section 4 applies the same discipline to allocation policies specifically, where we show single-model replay inflates lift through the plan’s own estimation noise.</w:t>
       </w:r>
     </w:p>
-    <w:bookmarkEnd w:id="55"/>
-    <w:bookmarkStart w:id="56" w:name="discussion"/>
+    <w:bookmarkEnd w:id="56"/>
+    <w:bookmarkStart w:id="57" w:name="discussion"/>
     <w:p>
       <w:pPr>
         <w:pStyle w:val="Heading2"/>
@@ -7132,8 +7162,8 @@
         <w:t xml:space="preserve">Bit masks make targeting tests branchless; pre-computed distances make personalization a weighted sum; per-(cluster, campaign) rows make pacing a two-row query. The offline stage does not merely produce a model; it compiles one, in the same sense a compiler turns a program into a form the machine executes directly.</w:t>
       </w:r>
     </w:p>
-    <w:bookmarkEnd w:id="56"/>
-    <w:bookmarkStart w:id="57" w:name="scope-and-assumptions"/>
+    <w:bookmarkEnd w:id="57"/>
+    <w:bookmarkStart w:id="58" w:name="scope-and-assumptions"/>
     <w:p>
       <w:pPr>
         <w:pStyle w:val="Heading2"/>
@@ -7153,8 +7183,8 @@
         <w:t xml:space="preserve">The architecture optimizes expected revenue for a known campaign portfolio over a planning horizon; it does not address auction-based pricing, real-time bidding against external demand, or creative selection within a campaign. Its guarantees rest on the stability assumptions of Section 8.1: allocation quality degrades in proportion to how far future traffic and response distributions drift from the modeled ones between refinement cycles, which sets the practical requirement for how frequently the offline stage must re-run. Exposure policy enforcement is per-subscriber and rule-based; richer fatigue models would slot into step 2 without changing the surrounding machinery. Finally, window-fitted planning presumes a campaign portfolio stable over the planning horizon, which is the operator’s contracted-campaign setting; in marketplaces where the ad portfolio and its delivery mix turn over within a day, the re-planning interval must shrink to the churn timescale for the plan to retain value.</w:t>
       </w:r>
     </w:p>
-    <w:bookmarkEnd w:id="57"/>
-    <w:bookmarkStart w:id="58" w:name="references"/>
+    <w:bookmarkEnd w:id="58"/>
+    <w:bookmarkStart w:id="59" w:name="references"/>
     <w:p>
       <w:pPr>
         <w:pStyle w:val="Heading2"/>
@@ -7745,7 +7775,7 @@
         <w:t xml:space="preserve">Preprint, August 2026. Code and replay harness: github.com/ApartsinProjects/optimal-impression-allocation.</w:t>
       </w:r>
     </w:p>
-    <w:bookmarkEnd w:id="58"/>
+    <w:bookmarkEnd w:id="59"/>
     <w:sectPr/>
   </w:body>
 </w:document>

</xml_diff>

<commit_message>
IJOC round 2: semi-synthetic ground-truth + adversarial-logging validation, scarce-inventory revenue objective (8-seed), reframing per strategic review
- New §4.1: semi-synthetic benchmark recovers true policy ranking (Spearman 1.00/0.90), survives adversarial outcome-selected logging
- New §6 revenue objective: regime map transfers under CPC/CPM values + makegood penalties; plan/re-solve robust across 8 seeds, fixed-dual negative under contention (down to -7.7%)
- Fixed-dual claim rescoped (click vs revenue) so sections agree; durable claim = re-solve is the only universal price source
- Uniform control reframed as Prop-1 identity; resolution statement; Outbrain counterfactual/contention caveats
- 3-step operator rule in intro; Algorithm 1 contention precondition; subtitle names the setting
- Two determinism bugs fixed (parallel-float avg, top-K tie order)

Co-Authored-By: Claude Opus 4.8 <noreply@anthropic.com>
</commit_message>
<xml_diff>
--- a/paper.docx
+++ b/paper.docx
@@ -24,7 +24,7 @@
         <w:pStyle w:val="FirstParagraph"/>
       </w:pPr>
       <w:r>
-        <w:t xml:space="preserve">Planning, Pacing, and a Regime Map from Public Advertising Logs.</w:t>
+        <w:t xml:space="preserve">Planning, Pacing, and a Contention Regime Map for Quota-Constrained Impression Allocation over Fine Audience Segments.</w:t>
       </w:r>
     </w:p>
     <w:p>
@@ -99,7 +99,7 @@
         <w:pStyle w:val="BodyText"/>
       </w:pPr>
       <w:r>
-        <w:t xml:space="preserve">Evaluation uses a replay protocol hardened against a trap we document: single-model replay inflates lift through a winner’s curse. Dual-model scoring, an exact uniform-null control, support and fatigue audits, user-clustered inference (headline z = 4.55), and a propensity-weighted outcome bracket delimit what public logs can and cannot show. The protocol yields a regime map. At exact feasibility, plan-informed policies beat greedy serving by 3.5–4.7% expected clicks, and information-matched, feasibility-aware dual-price pacing nearly matches them. Under over-subscription (quotas at 110–150% of supply), online price learning degrades along a spectrum: a scalar controller fails first, and even dual mirror descent, the state-of-the-art adaptive method, tracks the plan through moderate contention but falls below greedy under heavy over-subscription. A fixed dual pinned at the LP’s optimal prices stays positive throughout, so the failure is learning the prices online, not per-campaign pricing. The periodically re-solved plan dominates every regime (+2.2 to +4.4% over greedy, z ≥ 3.4). The ordering reproduces on a second, independent dataset (Outbrain, 87M impressions), where online pacing deepens to −44% while re-solving stays positive. The model-scored gains resist fatigue and support audits. Grounding them in realized outcomes is inconclusive on the small logging-matched subset, an inherent limit of public-log evaluation.</w:t>
+        <w:t xml:space="preserve">Evaluation uses a replay protocol hardened against a trap we document: single-model replay inflates lift through a winner’s curse. Dual-model scoring, an exact uniform-null control, support and fatigue audits, and user-clustered inference (headline z = 4.55) delimit what public logs can show, and a semi-synthetic benchmark with a known ground truth confirms the protocol recovers the true policy ranking and the true best policy, even under an adversarial logging policy that selects on the outcome. The protocol yields a regime map. At exact feasibility, plan-informed policies beat greedy serving by 3.5–4.7% expected clicks, and information-matched, feasibility-aware dual-price pacing nearly matches them. Under over-subscription (quotas at 110–150% of supply), online price learning degrades along a spectrum: a scalar controller fails first, and even dual mirror descent, the state-of-the-art adaptive method, tracks the plan through moderate contention but falls below greedy under heavy over-subscription. The periodically re-solved plan dominates every regime (+2.2 to +4.4% over greedy, z ≥ 3.4) and is the one price source positive across every contention level, dataset, and objective we test: a fixed dual pinned once at the LP optimum survives the click objective, but under a revenue objective with heterogeneous per-click and per-impression values and delivery penalties it turns negative under contention, so the durable prescription is to obtain prices by solving and re-solving, not by learning them online. The ordering reproduces on a second dataset (Outbrain, 87M impressions), where online pacing deepens to −44%, and the whole regime map transfers to the revenue objective, where the plan tier’s advantage grows as delivery guarantees harden. Grounding the gains in realized outcomes is inconclusive on the small logging-matched subset, an inherent limit of public-log evaluation.</w:t>
       </w:r>
     </w:p>
     <w:bookmarkEnd w:id="21"/>
@@ -189,7 +189,71 @@
         <w:t xml:space="preserve"> </w:t>
       </w:r>
       <w:r>
-        <w:t xml:space="preserve">and makes three contributions, each validated on public advertising logs. First, a pre-committable segmentation rule: measure the persistence of campaign-by-segment interaction residuals across adjacent planning windows, segment only on the axes that persist, and scale granularity to per-cell data density. Second, a replay evaluation protocol for allocation policies, hardened against the winner’s curse and selection artifacts that we show inflate naive replay. Third, a regime map locating where planning pays: plan-informed policies lead at exact feasibility and dominate outright under over-subscription, where dual-price adaptation collapses. Section 2 quantifies the cost of greedy serving on a minimal instance and Section 3 states the allocation program. Section 4 develops the replay protocol, Section 5 the persistence rule, and Section 6 the regime map. Section 7 calibrates the harness on a synthetic market with known ground truth, Section 8 presents the reference serving architecture that motivated the study, and Section 9 situates the work in the online-allocation and offline-evaluation literature. Sections 10 and 11 close with design principles and scope.</w:t>
+        <w:t xml:space="preserve">and makes three contributions, each validated on public advertising logs. First, a pre-committable segmentation rule: measure the persistence of campaign-by-segment interaction residuals across adjacent planning windows, segment only on the axes that persist, and scale granularity to per-cell data density. Second, a replay evaluation protocol for allocation policies, hardened against the winner’s curse and selection artifacts that we show inflate naive replay. Third, a regime map locating where planning pays: plan-informed policies lead at exact feasibility and dominate outright under over-subscription, where online dual-price learning collapses while solving for the prices does not, a result that holds on a second dataset and under a revenue objective with delivery guarantees.</w:t>
+      </w:r>
+    </w:p>
+    <w:p>
+      <w:pPr>
+        <w:pStyle w:val="BodyText"/>
+      </w:pPr>
+      <w:r>
+        <w:t xml:space="preserve">Together these compose a three-step rule an operator’s planning team can act on directly.</w:t>
+      </w:r>
+      <w:r>
+        <w:t xml:space="preserve"> </w:t>
+      </w:r>
+      <w:r>
+        <w:rPr>
+          <w:b/>
+          <w:bCs/>
+        </w:rPr>
+        <w:t xml:space="preserve">Probe persistence</w:t>
+      </w:r>
+      <w:r>
+        <w:t xml:space="preserve"> </w:t>
+      </w:r>
+      <w:r>
+        <w:t xml:space="preserve">to choose the segmentation: keep the axes whose campaign-by-segment interaction persists across planning windows, at the depth per-cell data supports.</w:t>
+      </w:r>
+      <w:r>
+        <w:t xml:space="preserve"> </w:t>
+      </w:r>
+      <w:r>
+        <w:rPr>
+          <w:b/>
+          <w:bCs/>
+        </w:rPr>
+        <w:t xml:space="preserve">Measure contention</w:t>
+      </w:r>
+      <w:r>
+        <w:t xml:space="preserve"> </w:t>
+      </w:r>
+      <w:r>
+        <w:t xml:space="preserve">to decide whether allocating is worth the effort at all: compare each segment’s supply to the quotas booked against it, because an uncontended market yields little to allocate whatever the segmentation.</w:t>
+      </w:r>
+      <w:r>
+        <w:t xml:space="preserve"> </w:t>
+      </w:r>
+      <w:r>
+        <w:rPr>
+          <w:b/>
+          <w:bCs/>
+        </w:rPr>
+        <w:t xml:space="preserve">Solve for the prices</w:t>
+      </w:r>
+      <w:r>
+        <w:t xml:space="preserve"> </w:t>
+      </w:r>
+      <w:r>
+        <w:t xml:space="preserve">when it is contended: obtain the dual prices by solving the plan and re-solving on the pacing cadence, rather than learning them online, which is the only price source robust across every contention level, dataset, and objective we test. The rest of the paper establishes each step and the evidence behind it.</w:t>
+      </w:r>
+    </w:p>
+    <w:p>
+      <w:pPr>
+        <w:pStyle w:val="BodyText"/>
+      </w:pPr>
+      <w:r>
+        <w:t xml:space="preserve">Section 2 quantifies the cost of greedy serving on a minimal instance and Section 3 states the allocation program and its interaction-invariance structure. Section 4 develops the replay protocol and validates it against a known ground truth, Section 5 the persistence rule, and Section 6 the regime map, its cross-dataset and revenue-objective replications. Section 7 calibrates the harness on a synthetic market with known ground truth, Section 8 presents the reference serving architecture that motivated the study, and Section 9 situates the work in the online-allocation and offline-evaluation literature. Sections 10 and 11 close with design principles and scope.</w:t>
       </w:r>
     </w:p>
     <w:bookmarkEnd w:id="22"/>
@@ -1892,7 +1956,7 @@
         <w:t xml:space="preserve">dual-model scoring</w:t>
       </w:r>
       <w:r>
-        <w:t xml:space="preserve">: policies plan and serve using only planning-window estimates, while all values, including the hindsight bound, are scored under an independent table fitted on the serving window. A uniform-probability control run then yields exactly 0.0% lift with every policy at exactly 100% of the bound, confirming the harness measures pairing quality and nothing else. Evaluation is</w:t>
+        <w:t xml:space="preserve">: policies plan and serve using only planning-window estimates, while all values, including the hindsight bound, are scored under an independent table fitted on the serving window. A uniform-probability control run then yields exactly 0.0% lift with every policy at exactly 100% of the bound. This is a mechanical identity, not an empirical finding: by Proposition 1, a scorer constant across segments carries no interaction, so under fixed quotas every feasible assignment scores equally, and the control confirms the harness contains no implementation path that manufactures lift from a flat table. Evaluation is</w:t>
       </w:r>
       <w:r>
         <w:t xml:space="preserve"> </w:t>
@@ -1988,7 +2052,7 @@
         <w:t xml:space="preserve">cs</w:t>
       </w:r>
       <w:r>
-        <w:t xml:space="preserve">. The logging policy is the real exposure pattern; clicks are then sampled ∼ Bernoulli(θ) on the real exposures to fit a planning table (days 9–11) and an independent scoring table (days 12–13), so both tables carry realistic estimation noise and θ itself never scores anything the planner sees. Five policies (greedy, static plan, periodic re-solve, fixed optimal dual, entropic Dual Mirror Descent) then replay the day 12–13 stream, and each assignment is scored twice: under the noisy table, exactly as the paper reports, and under θ, which only this controlled setting makes available. At realistic interaction strength the model-scored replay recovers the decision that matters: every strong policy is correctly separated from greedy, the model-scored ranking matches the true ranking (Spearman 1.00 at κ=1.0, 0.90 at κ=1.5), the model selects the truly best policy in both cases, and the estimated greedy-relative lift sits within about 1.4 percentage points of its true value. The limit is also visible: when the interaction is amplified beyond the level seen in the real data (κ=2.0), the top policies bunch within roughly 0.3 points of one another in truth, and the noisy table reorders those near-ties (Spearman 0.70), selecting the entropic dual over the static plan when the plan is in fact marginally better. Model-scored replay is therefore trustworthy for the claims this paper makes, which separate a strong tier from greedy and identify a robust re-solve or plan policy, and it should not be read as resolving fine differences among near-tied top policies. The benchmark is released with the replication package.</w:t>
+        <w:t xml:space="preserve">. The logging policy is the real exposure pattern; clicks are then sampled ∼ Bernoulli(θ) on the real exposures to fit a planning table (days 9–11) and an independent scoring table (days 12–13), so both tables carry realistic estimation noise and θ itself never scores anything the planner sees. Five policies (greedy, static plan, periodic re-solve, fixed optimal dual, entropic Dual Mirror Descent) then replay the day 12–13 stream, and each assignment is scored twice: under the noisy table, exactly as the paper reports, and under θ, which only this controlled setting makes available. At realistic interaction strength the model-scored replay recovers the decision that matters: every strong policy is correctly separated from greedy, the model-scored ranking matches the true ranking (Spearman 1.00 at κ=1.0, 0.90 at κ=1.5), the model selects the truly best policy in both cases, and the estimated greedy-relative lift sits within about 1.4 percentage points of its true value. The limit is also visible: when the interaction is amplified beyond the level seen in the real data (κ=2.0), the top policies bunch within roughly 0.3 points of one another under the true response, and the noisy table reorders those near-ties (Spearman 0.70), selecting the entropic dual over the static plan when the plan is in fact marginally better. Model-scored replay is therefore trustworthy for the claims this paper makes, which separate a strong tier from greedy and identify a robust re-solve or plan policy, and it should not be read as resolving fine differences among near-tied top policies. The recovery does not depend on a benign logging policy. Repeating the benchmark with a deliberately adversarial logger, one that selects on the outcome itself so high-response cells are over-observed and low-response cells starve, the worst case for a scorer fit on logged data, still identifies the true best policy at both signal strengths (rank correlation 0.90 and 1.00), at the cost of a small upward bias, under 1.2 percentage points, from the optimistic tables that outcome-selected logging produces. The benchmark and its adversarial variant are released with the replication package.</w:t>
       </w:r>
     </w:p>
     <w:bookmarkEnd w:id="29"/>
@@ -3053,6 +3117,82 @@
       </w:r>
       <w:r>
         <w:t xml:space="preserve">(serve the unsegmented market). Freeze the choice before the serving window.</w:t>
+      </w:r>
+    </w:p>
+    <w:p>
+      <w:pPr>
+        <w:pStyle w:val="BodyText"/>
+      </w:pPr>
+      <w:r>
+        <w:t xml:space="preserve">6. Independently of the axis choice, measure</w:t>
+      </w:r>
+      <w:r>
+        <w:t xml:space="preserve"> </w:t>
+      </w:r>
+      <w:r>
+        <w:rPr>
+          <w:b/>
+          <w:bCs/>
+        </w:rPr>
+        <w:t xml:space="preserve">contention</w:t>
+      </w:r>
+      <w:r>
+        <w:t xml:space="preserve"> </w:t>
+      </w:r>
+      <w:r>
+        <w:t xml:space="preserve">on the planning window: for each segment compare the quota booked against it to its forecast supply, κ</w:t>
+      </w:r>
+      <w:r>
+        <w:rPr>
+          <w:vertAlign w:val="subscript"/>
+        </w:rPr>
+        <w:t xml:space="preserve">s</w:t>
+      </w:r>
+      <w:r>
+        <w:t xml:space="preserve"> = (∑</w:t>
+      </w:r>
+      <w:r>
+        <w:rPr>
+          <w:vertAlign w:val="subscript"/>
+        </w:rPr>
+        <w:t xml:space="preserve">c</w:t>
+      </w:r>
+      <w:r>
+        <w:t xml:space="preserve"> </w:t>
+      </w:r>
+      <w:r>
+        <w:t xml:space="preserve">planned demand on</w:t>
+      </w:r>
+      <w:r>
+        <w:t xml:space="preserve"> </w:t>
+      </w:r>
+      <w:r>
+        <w:rPr>
+          <w:i/>
+          <w:iCs/>
+        </w:rPr>
+        <w:t xml:space="preserve">s</w:t>
+      </w:r>
+      <w:r>
+        <w:t xml:space="preserve">) / S</w:t>
+      </w:r>
+      <w:r>
+        <w:rPr>
+          <w:vertAlign w:val="subscript"/>
+        </w:rPr>
+        <w:t xml:space="preserve">s</w:t>
+      </w:r>
+      <w:r>
+        <w:t xml:space="preserve">. Where supply dwarfs demand (κ</w:t>
+      </w:r>
+      <w:r>
+        <w:rPr>
+          <w:vertAlign w:val="subscript"/>
+        </w:rPr>
+        <w:t xml:space="preserve">s</w:t>
+      </w:r>
+      <w:r>
+        <w:t xml:space="preserve"> ≪ 1 on the segments that carry the interaction) the achievable allocation gain is bounded and small whatever the segmentation, because greedy already leaves little on the table; the persistence probe then identifies the right axis but the market does not reward acting on it. This is a pre-deployment quantity, computed before any serving, and it is what separates the two markets in Section 6: contended Taobao rewards the segmentation, uncontended Outbrain does not until the demand regime is stressed.</w:t>
       </w:r>
     </w:p>
     <w:p>
@@ -3687,7 +3827,20 @@
         <w:pStyle w:val="BodyText"/>
       </w:pPr>
       <w:r>
-        <w:t xml:space="preserve">At exact feasibility all seven policies cluster within a point; most of the value is the forecast itself, which each consumes. Under contention they separate, and the separation is a spectrum set by how the prices are obtained. Adaptation degrades with the update rule: the scalar controller weakens first (+0.7% at 110% quotas, −6.9% at 150%), Euclidean mirror descent holds to 110% then falls (−4.8% at 150%), and even the strongest adaptive method, entropic mirror descent, tracks the re-solved plan through 125% over-subscription (+3.06% versus +3.39%) before turning slightly negative at 150% (−0.5%). The two policies that do not learn prices online, the re-solved plan and the fixed optimal dual, are the only ones positive at every level, and the re-solved plan is positive throughout (+2.2% to +4.3%). Two conclusions follow, each carefully scoped. First, the failure under heavy over-subscription is shared by every adaptive dual-price method we test, modern mirror descent included, not an artifact of a weak controller; a well-chosen adaptive method (entropic DMD) is nonetheless competitive through moderate contention, so the claim is about the heavy-contention regime, not adaptation in general. Second, the fixed optimal dual’s survival shows per-campaign pricing itself is not the problem, as linear-programming duality predicts: a static optimal price vector carries the allocation. What fails as contention grows is learning that vector online.</w:t>
+        <w:t xml:space="preserve">At exact feasibility all seven policies cluster within a point; most of the value is the forecast itself, which each consumes. Under contention they separate, and the separation is a spectrum set by how the prices are obtained. Adaptation degrades with the update rule: the scalar controller weakens first (+0.7% at 110% quotas, −6.9% at 150%), Euclidean mirror descent holds to 110% then falls (−4.8% at 150%), and even the strongest adaptive method, entropic mirror descent, tracks the re-solved plan through 125% over-subscription (+3.06% versus +3.39%) before turning slightly negative at 150% (−0.5%). The two policies that do not learn prices online, the re-solved plan and the fixed optimal dual, are the only ones positive at every level, and the re-solved plan is positive throughout (+2.2% to +4.3%). The semi-synthetic benchmark of Section 4.1 bounds what this table can resolve: gaps at or below roughly 0.3 points, the feasibility row where every policy clusters and the re-solve-versus-entropic-DMD cell at 125%, are within the protocol’s resolution and are not read here as an ordering; the collapses that carry the argument, 3 to 45 points, are far outside it. Two conclusions follow, each carefully scoped. First, the failure under heavy over-subscription is shared by every adaptive dual-price method we test, modern mirror descent included, not an artifact of a weak controller; a well-chosen adaptive method (entropic DMD) is nonetheless competitive through moderate contention, so the claim is about the heavy-contention regime, not adaptation in general. Second, the fixed optimal dual’s survival under this objective shows per-campaign pricing itself is not the problem, as linear-programming duality predicts: a static optimal price vector can carry the allocation. What fails as contention grows is learning that vector online. This second conclusion is the more fragile of the two: the revenue objective below will show the one-shot optimal dual is not universally robust, since a price vector solved once against the fluid plan can misprice campaigns when the realized arrival order departs from it. The claim that survives every objective and every dataset we test is therefore narrower and sharper than “fixed prices work”: prices should be</w:t>
+      </w:r>
+      <w:r>
+        <w:t xml:space="preserve"> </w:t>
+      </w:r>
+      <w:r>
+        <w:rPr>
+          <w:i/>
+          <w:iCs/>
+        </w:rPr>
+        <w:t xml:space="preserve">obtained by solving</w:t>
+      </w:r>
+      <w:r>
+        <w:t xml:space="preserve">, and re-solving on the pacing cadence is the only price source that is positive in every regime, objective, and market we measure.</w:t>
       </w:r>
     </w:p>
     <w:p>
@@ -3703,7 +3856,89 @@
         <w:pStyle w:val="BodyText"/>
       </w:pPr>
       <w:r>
-        <w:t xml:space="preserve">The regime map reproduces on a second, independent dataset. We repeat the whole protocol on the Outbrain content-recommendation log (87M joined impressions, a slate-click structure unlike Taobao’s display, with the segmentation axis fixed in advance to the most persistent one measured on the planning window, page platform at r = 0.95). At native quotas the Outbrain market is barely contended, per-segment supply dwarfs the quotas, so every policy sits within a percentage point of greedy, exactly the low-contention corner of the map. Under the same over-subscription stress, the ordering returns and sharpens: the re-solved plan is the only policy positive at every level (+0.3 to +0.6%), the static plan and the fixed optimal-dual degrade gently, and online scalar pacing collapses far more steeply than on Taobao, to −19%, −34%, and −44% at 1.5×, 2×, and 3× quotas. That online price learning, not per-campaign pricing, is the failure under contention, and that solving for the prices is the robust choice, holds across two datasets from different domains.</w:t>
+        <w:t xml:space="preserve">The regime map reproduces on a second, independent dataset. We repeat the whole protocol on the Outbrain content-recommendation log (87M joined impressions, a slate-click structure unlike Taobao’s display, with the segmentation axis fixed in advance to the most persistent one measured on the planning window, page platform, whose interaction residuals correlate at r = 0.95 across the shared campaign-by-platform cells; the axis has three platform levels, so this is a statement about the stability of campaigns’ platform preferences, not a many-point fit). At native quotas the Outbrain market is barely contended, per-segment supply dwarfs the quotas, so every policy sits within a percentage point of greedy, exactly the low-contention corner of the map. Under the same over-subscription stress, the ordering returns and sharpens: the re-solved plan is the only policy positive at every level (+0.3 to +0.6%), the static plan and the fixed optimal-dual degrade gently, and online scalar pacing collapses far more steeply than on Taobao, to −19%, −34%, and −44% at 1.5×, 2×, and 3× quotas. That online price learning, not per-campaign pricing, is the failure under contention, and that solving for the prices is the robust choice, holds across two datasets from different domains. Two honest qualifications attach to this second market. The over-subscription sweep is a counterfactual market that Outbrain’s operator never ran: native quotas are barely contended, so the stress levels probe a demand regime absent from the log, and the result is a statement about the mechanism under contention, not about Outbrain’s realized traffic. And the native low contention is itself a</w:t>
+      </w:r>
+      <w:r>
+        <w:t xml:space="preserve"> </w:t>
+      </w:r>
+      <w:r>
+        <w:rPr>
+          <w:i/>
+          <w:iCs/>
+        </w:rPr>
+        <w:t xml:space="preserve">measurable</w:t>
+      </w:r>
+      <w:r>
+        <w:t xml:space="preserve"> </w:t>
+      </w:r>
+      <w:r>
+        <w:t xml:space="preserve">quantity, not a post-hoc excuse: the per-segment supply exceeds the median quota by more than two orders of magnitude, so the abstain-when-uncontended condition is a pre-deployment check (compare quota to segment supply) rather than a judgment made after seeing the lift. The truncated final serving day, whose partial log would understate late-day supply, is excluded throughout.</w:t>
+      </w:r>
+    </w:p>
+    <w:p>
+      <w:pPr>
+        <w:pStyle w:val="BodyText"/>
+      </w:pPr>
+      <w:r>
+        <w:t xml:space="preserve">The regime map also survives a change of objective, from clicks to revenue under guaranteed delivery. We reformulate the market so campaigns carry heterogeneous per-impression values and unmet quotas cost a makegood penalty: half the campaigns, drawn at random, pay per click, so their value on a segment is cpc</w:t>
+      </w:r>
+      <w:r>
+        <w:rPr>
+          <w:vertAlign w:val="subscript"/>
+        </w:rPr>
+        <w:t xml:space="preserve">c</w:t>
+      </w:r>
+      <w:r>
+        <w:t xml:space="preserve"> · p</w:t>
+      </w:r>
+      <w:r>
+        <w:rPr>
+          <w:vertAlign w:val="subscript"/>
+        </w:rPr>
+        <w:t xml:space="preserve">cs</w:t>
+      </w:r>
+      <w:r>
+        <w:t xml:space="preserve"> </w:t>
+      </w:r>
+      <w:r>
+        <w:t xml:space="preserve">and rides on the interaction the paper is about, and half pay per impression at a flat cpm</w:t>
+      </w:r>
+      <w:r>
+        <w:rPr>
+          <w:vertAlign w:val="subscript"/>
+        </w:rPr>
+        <w:t xml:space="preserve">c</w:t>
+      </w:r>
+      <w:r>
+        <w:t xml:space="preserve"> </w:t>
+      </w:r>
+      <w:r>
+        <w:t xml:space="preserve">that rewards reach and is indifferent to the segment, with the two types calibrated to the same mean value per impression so neither dominates by construction; delivery is capped at the booked quota and each undelivered guaranteed impression costs a penalty β</w:t>
+      </w:r>
+      <w:r>
+        <w:rPr>
+          <w:vertAlign w:val="subscript"/>
+        </w:rPr>
+        <w:t xml:space="preserve">c</w:t>
+      </w:r>
+      <w:r>
+        <w:t xml:space="preserve">. Across eight independent value draws and four contention levels, the static plan and the re-solved plan are the top tier in every one of the resulting cells, positive throughout (about +0.4% to +5% over revenue-greedy at makegood-at-par pricing), and their advantage</w:t>
+      </w:r>
+      <w:r>
+        <w:t xml:space="preserve"> </w:t>
+      </w:r>
+      <w:r>
+        <w:rPr>
+          <w:i/>
+          <w:iCs/>
+        </w:rPr>
+        <w:t xml:space="preserve">grows</w:t>
+      </w:r>
+      <w:r>
+        <w:t xml:space="preserve"> </w:t>
+      </w:r>
+      <w:r>
+        <w:t xml:space="preserve">as the guarantee hardens: sweeping the penalty from a pure spot market to a near-hard guarantee, the plan-tier lift rises into double digits under heavy contention, because a makegood-exposed seller is punished most for exactly the misallocation that planning removes. The adaptive policies stay positive but trail the plan tier throughout; unlike the pure-click objective they do not collapse to large negatives, because a mispaced impression still earns its flat CPM value and still retires a makegood liability, so the revenue objective is more forgiving of online mispricing than clicks are. The fixed optimal dual is the least stable policy: positive at exact feasibility in every draw (+1% to +4%) but negative under contention in the majority of them, as low as −7.7%, because a price vector solved once against the fluid plan starves guaranteed campaigns when the realized arrival order departs from it, earning high gross value while paying large makegood penalties, a per-campaign decomposition the released harness prints. Re-solving on the pacing cadence removes the fragility, positive in every draw at every level. The deployment rule, solve for the prices and re-solve on the pacing cadence, is therefore a property of the allocation, not of the click objective it was first measured on.</w:t>
       </w:r>
     </w:p>
     <w:p>

</xml_diff>

<commit_message>
Commit to retail-media use case; add operator go/no-go dose-response chart (Fig 2)
- Intro + Scope reframed to operator-owned / retail-media markets; Taobao = in-vertical evidence, Avazu/Outbrain = churn/contention boundaries not failed replications
- Falsifiable deployment claim with 4 checkable preconditions (persistence r, density, cadence, contention) in Scope
- New Figure 2: regime map as a deployment chart, built from existing walk-forward runs (consistent with the §6 table); re-solve is the only policy positive across contention
- Fixed CLICK-mode pacing learning-rate scale bug (eta scaled to click magnitude)

Co-Authored-By: Claude Opus 4.8 <noreply@anthropic.com>
</commit_message>
<xml_diff>
--- a/paper.docx
+++ b/paper.docx
@@ -144,7 +144,7 @@
         <w:pStyle w:val="BodyText"/>
       </w:pPr>
       <w:r>
-        <w:t xml:space="preserve">On the open web this failure is blunted by coarseness: broad audiences are interchangeable audiences, so the opportunity cost of a greedy choice is small. Operator-run mobile advertising inverts that condition: verified profiles and gateway-complete response attribution support far finer segmentation, and fine segmentation is precisely what advertisers pay an operator for, not “males 18–49” but urban music buyers on sports content on weekend afternoons. That deployment setting motivated this study; Section 8 describes the serving design built for it.</w:t>
+        <w:t xml:space="preserve">On the open web this failure is blunted by coarseness: broad audiences are interchangeable audiences, so the opportunity cost of a greedy choice is small. Operator-owned advertising markets invert that condition. A platform that owns logged-in, first-party identity, a mobile operator, or, in its largest contemporary form, a retail-media network selling onsite display against its own commerce data, supports far finer segmentation, and fine segmentation is precisely what advertisers pay it for: not “males 18–49” but heavy category buyers on related content in the promotional window. Its campaigns are sold direct as guaranteed impression quotas with makegood penalties, and it controls the whole serving stack, with no auction standing between the plan and the impression. That class of market, whose originating instance is the mobile-operator system of Section 8 and whose largest current one is retail media, is where this study applies; the public commerce-media log we evaluate on (Taobao) is drawn from inside it, not a distant analog.</w:t>
       </w:r>
     </w:p>
     <w:p>
@@ -3258,7 +3258,7 @@
       </w:r>
     </w:p>
     <w:bookmarkEnd w:id="31"/>
-    <w:bookmarkStart w:id="32" w:name="the-regime-map"/>
+    <w:bookmarkStart w:id="35" w:name="the-regime-map"/>
     <w:p>
       <w:pPr>
         <w:pStyle w:val="Heading2"/>
@@ -3727,6 +3727,84 @@
         </w:tc>
       </w:tr>
     </w:tbl>
+    <w:tbl>
+      <w:tblPr>
+        <w:tblStyle w:val="FigureTable"/>
+        <w:tblW w:type="auto" w:w="0"/>
+        <w:jc w:val="center"/>
+        <w:tblLook w:firstRow="0" w:lastRow="0" w:firstColumn="0" w:lastColumn="0"/>
+      </w:tblPr>
+      <w:tblGrid>
+        <w:gridCol w:w="7920"/>
+      </w:tblGrid>
+      <w:tr>
+        <w:tc>
+          <w:tcPr/>
+          <w:p>
+            <w:pPr>
+              <w:pStyle w:val="Compact"/>
+              <w:jc w:val="center"/>
+            </w:pPr>
+            <w:r>
+              <w:drawing>
+                <wp:inline>
+                  <wp:extent cx="5334000" cy="2592916"/>
+                  <wp:effectExtent b="0" l="0" r="0" t="0"/>
+                  <wp:docPr descr="" title="" id="33" name="Picture"/>
+                  <a:graphic>
+                    <a:graphicData uri="http://schemas.openxmlformats.org/drawingml/2006/picture">
+                      <pic:pic>
+                        <pic:nvPicPr>
+                          <pic:cNvPr descr="file:///E:/tmp/claude/E--Projects-Submitted-MobileAd-Comverse/464e82cd-870f-4dc1-b795-92348cf1a9b8/scratchpad/figs/fig2.png" id="34" name="Picture"/>
+                          <pic:cNvPicPr>
+                            <a:picLocks noChangeArrowheads="1" noChangeAspect="1"/>
+                          </pic:cNvPicPr>
+                        </pic:nvPicPr>
+                        <pic:blipFill>
+                          <a:blip r:embed="rId32"/>
+                          <a:stretch>
+                            <a:fillRect/>
+                          </a:stretch>
+                        </pic:blipFill>
+                        <pic:spPr bwMode="auto">
+                          <a:xfrm>
+                            <a:off x="0" y="0"/>
+                            <a:ext cx="5334000" cy="2592916"/>
+                          </a:xfrm>
+                          <a:prstGeom prst="rect">
+                            <a:avLst/>
+                          </a:prstGeom>
+                          <a:noFill/>
+                          <a:ln w="9525">
+                            <a:noFill/>
+                            <a:headEnd/>
+                            <a:tailEnd/>
+                          </a:ln>
+                        </pic:spPr>
+                      </pic:pic>
+                    </a:graphicData>
+                  </a:graphic>
+                </wp:inline>
+              </w:drawing>
+            </w:r>
+          </w:p>
+        </w:tc>
+      </w:tr>
+    </w:tbl>
+    <w:p>
+      <w:pPr>
+        <w:pStyle w:val="ImageCaption"/>
+      </w:pPr>
+      <w:r>
+        <w:t xml:space="preserve">Figure 2.</w:t>
+      </w:r>
+      <w:r>
+        <w:t xml:space="preserve"> </w:t>
+      </w:r>
+      <w:r>
+        <w:t xml:space="preserve">The regime map as a deployment chart. Each curve is one policy’s lift over greedy serving (walk-forward mean, Taobao top-100, pre-committed 8-tier segmentation) as quotas are scaled above deliverable supply. The re-solved plan is the only policy that stays above greedy across the whole contention range; every online price-learning method crosses into the shaded loss region, in order of update aggressiveness (scalar first, then Euclidean, then entropic mirror descent). An operator reads the horizontal axis from the pre-deployment contention ratio of Algorithm 1, step 6, and the chart says when planning is worth the effort and which pacing to trust.</w:t>
+      </w:r>
+    </w:p>
     <w:p>
       <w:pPr>
         <w:pStyle w:val="BodyText"/>
@@ -3827,7 +3905,7 @@
         <w:pStyle w:val="BodyText"/>
       </w:pPr>
       <w:r>
-        <w:t xml:space="preserve">At exact feasibility all seven policies cluster within a point; most of the value is the forecast itself, which each consumes. Under contention they separate, and the separation is a spectrum set by how the prices are obtained. Adaptation degrades with the update rule: the scalar controller weakens first (+0.7% at 110% quotas, −6.9% at 150%), Euclidean mirror descent holds to 110% then falls (−4.8% at 150%), and even the strongest adaptive method, entropic mirror descent, tracks the re-solved plan through 125% over-subscription (+3.06% versus +3.39%) before turning slightly negative at 150% (−0.5%). The two policies that do not learn prices online, the re-solved plan and the fixed optimal dual, are the only ones positive at every level, and the re-solved plan is positive throughout (+2.2% to +4.3%). The semi-synthetic benchmark of Section 4.1 bounds what this table can resolve: gaps at or below roughly 0.3 points, the feasibility row where every policy clusters and the re-solve-versus-entropic-DMD cell at 125%, are within the protocol’s resolution and are not read here as an ordering; the collapses that carry the argument, 3 to 45 points, are far outside it. Two conclusions follow, each carefully scoped. First, the failure under heavy over-subscription is shared by every adaptive dual-price method we test, modern mirror descent included, not an artifact of a weak controller; a well-chosen adaptive method (entropic DMD) is nonetheless competitive through moderate contention, so the claim is about the heavy-contention regime, not adaptation in general. Second, the fixed optimal dual’s survival under this objective shows per-campaign pricing itself is not the problem, as linear-programming duality predicts: a static optimal price vector can carry the allocation. What fails as contention grows is learning that vector online. This second conclusion is the more fragile of the two: the revenue objective below will show the one-shot optimal dual is not universally robust, since a price vector solved once against the fluid plan can misprice campaigns when the realized arrival order departs from it. The claim that survives every objective and every dataset we test is therefore narrower and sharper than “fixed prices work”: prices should be</w:t>
+        <w:t xml:space="preserve">At exact feasibility all seven policies cluster within a point; most of the value is the forecast itself, which each consumes. Under contention they separate, and the separation is a spectrum set by how the prices are obtained (Figure 2). Adaptation degrades with the update rule: the scalar controller weakens first (+0.7% at 110% quotas, −6.9% at 150%), Euclidean mirror descent holds to 110% then falls (−4.8% at 150%), and even the strongest adaptive method, entropic mirror descent, tracks the re-solved plan through 125% over-subscription (+3.06% versus +3.39%) before turning slightly negative at 150% (−0.5%). The two policies that do not learn prices online, the re-solved plan and the fixed optimal dual, are the only ones positive at every level, and the re-solved plan is positive throughout (+2.2% to +4.3%). The semi-synthetic benchmark of Section 4.1 bounds what this table can resolve: gaps at or below roughly 0.3 points, the feasibility row where every policy clusters and the re-solve-versus-entropic-DMD cell at 125%, are within the protocol’s resolution and are not read here as an ordering; the collapses that carry the argument, 3 to 45 points, are far outside it. Two conclusions follow, each carefully scoped. First, the failure under heavy over-subscription is shared by every adaptive dual-price method we test, modern mirror descent included, not an artifact of a weak controller; a well-chosen adaptive method (entropic DMD) is nonetheless competitive through moderate contention, so the claim is about the heavy-contention regime, not adaptation in general. Second, the fixed optimal dual’s survival under this objective shows per-campaign pricing itself is not the problem, as linear-programming duality predicts: a static optimal price vector can carry the allocation. What fails as contention grows is learning that vector online. This second conclusion is the more fragile of the two: the revenue objective below will show the one-shot optimal dual is not universally robust, since a price vector solved once against the fluid plan can misprice campaigns when the realized arrival order departs from it. The claim that survives every objective and every dataset we test is therefore narrower and sharper than “fixed prices work”: prices should be</w:t>
       </w:r>
       <w:r>
         <w:t xml:space="preserve"> </w:t>
@@ -3949,8 +4027,8 @@
         <w:t xml:space="preserve">Three robustness checks anchor the table. The headline planned-versus-greedy comparison survives a user-clustered bootstrap (z = +4.55) and an across-fold t-test (t(4) = +5.50); at exact feasibility the strong policies are statistically close, so the ordering across contention regimes, not any single feasibility cell, is the claim. Re-pairing the impression stream changes per-user exposure composition; re-scoring under a first-exposure table (each user’s first impression of each campaign only, which removes repeat-exposure composition) moves the headline from +3.46% to +3.88%, so exposure fatigue does not manufacture the result. The regime map is a single-market result: the over-subscription sweep is run on the Taobao top-100 reconstruction, while Avazu contributes only the stability boundary. The z-values in the table above the headline row come from the parametric binomial model; the conclusions that rest on them (the re-solved plan’s dominance at every scale, the dual collapse) hold with the same sign and comparable magnitude under the user-clustered bootstrap where we recomputed them. The remaining, and inherent, limitation is that these are model-scored expected clicks: an outcome-grounded estimate is possible only on the 2–2.4% of impressions where a policy’s choice coincides with the logged action, a subset both tiny and selected toward the logging policy. On it, a self-normalized inverse-propensity estimate with an estimated segment-level logging propensity puts planned within ±1pp of greedy at t(4) = −0.5, that is, inconclusive; the matched-subset calibration shows the model scorer understates realized CTR slightly and symmetrically for both policies (about 6.8% realized versus 6.5% modeled), so it is not inflating the gap. Public logs cannot close this gap; only an interventional deployment can.</w:t>
       </w:r>
     </w:p>
-    <w:bookmarkEnd w:id="32"/>
-    <w:bookmarkStart w:id="36" w:name="simulation-as-calibration"/>
+    <w:bookmarkEnd w:id="35"/>
+    <w:bookmarkStart w:id="39" w:name="simulation-as-calibration"/>
     <w:p>
       <w:pPr>
         <w:pStyle w:val="Heading2"/>
@@ -4305,18 +4383,18 @@
                 <wp:inline>
                   <wp:extent cx="5334000" cy="2370666"/>
                   <wp:effectExtent b="0" l="0" r="0" t="0"/>
-                  <wp:docPr descr="" title="" id="34" name="Picture"/>
+                  <wp:docPr descr="" title="" id="37" name="Picture"/>
                   <a:graphic>
                     <a:graphicData uri="http://schemas.openxmlformats.org/drawingml/2006/picture">
                       <pic:pic>
                         <pic:nvPicPr>
-                          <pic:cNvPr descr="file:///E:/tmp/claude/E--Projects-Submitted-MobileAd-Comverse/464e82cd-870f-4dc1-b795-92348cf1a9b8/scratchpad/figs/fig2.png" id="35" name="Picture"/>
+                          <pic:cNvPr descr="file:///E:/tmp/claude/E--Projects-Submitted-MobileAd-Comverse/464e82cd-870f-4dc1-b795-92348cf1a9b8/scratchpad/figs/fig3.png" id="38" name="Picture"/>
                           <pic:cNvPicPr>
                             <a:picLocks noChangeArrowheads="1" noChangeAspect="1"/>
                           </pic:cNvPicPr>
                         </pic:nvPicPr>
                         <pic:blipFill>
-                          <a:blip r:embed="rId33"/>
+                          <a:blip r:embed="rId36"/>
                           <a:stretch>
                             <a:fillRect/>
                           </a:stretch>
@@ -4351,7 +4429,7 @@
         <w:pStyle w:val="ImageCaption"/>
       </w:pPr>
       <w:r>
-        <w:t xml:space="preserve">Figure 2.</w:t>
+        <w:t xml:space="preserve">Figure 3.</w:t>
       </w:r>
       <w:r>
         <w:t xml:space="preserve"> </w:t>
@@ -4389,8 +4467,8 @@
         <w:t xml:space="preserve">The simulation carries its own controls. Both policies are verified against the hindsight bound in every replication. On control instances where all campaigns share identical click probabilities, so pairing cannot matter, the measured lift is 0.000%, confirming that the gap measures allocation quality and not an artifact of the harness. And the planned policy’s 93.8% of a bound computed with perfect hindsight shows that forecast noise costs the plan only a few points, the residual that Section 8.2’s pacing mechanism and the refinement loop exist to absorb.</w:t>
       </w:r>
     </w:p>
-    <w:bookmarkEnd w:id="36"/>
-    <w:bookmarkStart w:id="55" w:name="a-reference-serving-architecture"/>
+    <w:bookmarkEnd w:id="39"/>
+    <w:bookmarkStart w:id="58" w:name="a-reference-serving-architecture"/>
     <w:p>
       <w:pPr>
         <w:pStyle w:val="Heading2"/>
@@ -4707,7 +4785,7 @@
         <w:t xml:space="preserve">The vantage point carries obligations that shape the design. Subscriber data is usable for advertising only within a consent and data-protection framework: profiling requires a lawful basis and per-subscriber opt-out under regimes such as the GDPR and ePrivacy rules, and gateway-observed browsing is subject to purpose limitation. The architecture is built for data minimization under those constraints: raw attributes and browsing records are confined to the offline stage, the serving path receives only anonymous cluster distances and campaign eligibility lists, and every online decision reads aggregate tables rather than individual histories. Segment coarseness is itself a privacy parameter: the segments that carry allocation value in Section 5 are a handful of aggregate behavior tiers, not individual dossiers. Not every subscriber has a profile at all: prepaid subscribers may be anonymous, which is why the clustering machinery supports membership computed from response behavior alone (Section 8.1.3).</w:t>
       </w:r>
     </w:p>
-    <w:bookmarkStart w:id="37" w:name="X76cd0aab14a1b3a28329e6411b338cd4e16a2d0"/>
+    <w:bookmarkStart w:id="40" w:name="X76cd0aab14a1b3a28329e6411b338cd4e16a2d0"/>
     <w:p>
       <w:pPr>
         <w:pStyle w:val="Heading3"/>
@@ -4804,8 +4882,8 @@
         <w:t xml:space="preserve">Assumption 1 justifies forecasting traffic from history; assumptions 2 and 3 justify pooling sparse per-subscriber click data into clusters that have enough volume to estimate probabilities reliably.</w:t>
       </w:r>
     </w:p>
-    <w:bookmarkEnd w:id="37"/>
-    <w:bookmarkStart w:id="38" w:name="response-records"/>
+    <w:bookmarkEnd w:id="40"/>
+    <w:bookmarkStart w:id="41" w:name="response-records"/>
     <w:p>
       <w:pPr>
         <w:pStyle w:val="Heading3"/>
@@ -5095,8 +5173,8 @@
         <w:t xml:space="preserve">Records are grouped per subscriber and joined with the profile (age, gender, location, income band, purchase indicators) where one is available. Past campaigns matter as much as active ones: a subscriber’s reaction to a finished campaign is evidence about how they will react to similar future ones.</w:t>
       </w:r>
     </w:p>
-    <w:bookmarkEnd w:id="38"/>
-    <w:bookmarkStart w:id="39" w:name="proximity-and-clustering"/>
+    <w:bookmarkEnd w:id="41"/>
+    <w:bookmarkStart w:id="42" w:name="proximity-and-clustering"/>
     <w:p>
       <w:pPr>
         <w:pStyle w:val="Heading3"/>
@@ -5304,8 +5382,8 @@
         <w:t xml:space="preserve">. A subscriber is not filed into one cluster; they carry a pre-computed distance to each nearby cluster. A 35-year-old married streaming subscriber in a large city may sit at distance 0.8 from the “metropolitan professionals” cluster and 0.1 from “music lovers”; a 22-year-old gaming subscriber in the same city sits close to “gamers” and “music lovers” instead. These distances become interpolation weights at serving time (Section 8.2), so predictions blend the behavior of every cluster the subscriber resembles.</w:t>
       </w:r>
     </w:p>
-    <w:bookmarkEnd w:id="39"/>
-    <w:bookmarkStart w:id="40" w:name="Xcf0c62df256e2cee415416a2e095f7c938d4365"/>
+    <w:bookmarkEnd w:id="42"/>
+    <w:bookmarkStart w:id="43" w:name="Xcf0c62df256e2cee415416a2e095f7c938d4365"/>
     <w:p>
       <w:pPr>
         <w:pStyle w:val="Heading3"/>
@@ -5823,8 +5901,8 @@
         <w:t xml:space="preserve">For a brand-new campaign with no history of its own, probabilities are borrowed from the most similar past or active campaigns in the same category, the same pooling idea applied across campaigns instead of across subscribers. Where the profile itself is missing (anonymous or prepaid subscribers), distance to clusters is computed from response history alone, and the subscriber inherits the response statistics of the cluster they behave like. The design degrades gracefully as data thins out: per-subscriber evidence backs off to cluster evidence, and per-campaign evidence backs off to category evidence.</w:t>
       </w:r>
     </w:p>
-    <w:bookmarkEnd w:id="40"/>
-    <w:bookmarkStart w:id="41" w:name="compiling-the-plan-into-lookup-tables"/>
+    <w:bookmarkEnd w:id="43"/>
+    <w:bookmarkStart w:id="44" w:name="compiling-the-plan-into-lookup-tables"/>
     <w:p>
       <w:pPr>
         <w:pStyle w:val="Heading3"/>
@@ -6044,8 +6122,8 @@
         <w:t xml:space="preserve">That one row carries targeting, allocation, and the performance baseline the online stage will pace against.</w:t>
       </w:r>
     </w:p>
-    <w:bookmarkEnd w:id="41"/>
-    <w:bookmarkStart w:id="45" w:name="X6b41d0bc1b6a7aa734a67750c2b9949c703d461"/>
+    <w:bookmarkEnd w:id="44"/>
+    <w:bookmarkStart w:id="48" w:name="X6b41d0bc1b6a7aa734a67750c2b9949c703d461"/>
     <w:p>
       <w:pPr>
         <w:pStyle w:val="Heading3"/>
@@ -6133,18 +6211,18 @@
                 <wp:inline>
                   <wp:extent cx="5334000" cy="1778000"/>
                   <wp:effectExtent b="0" l="0" r="0" t="0"/>
-                  <wp:docPr descr="" title="" id="43" name="Picture"/>
+                  <wp:docPr descr="" title="" id="46" name="Picture"/>
                   <a:graphic>
                     <a:graphicData uri="http://schemas.openxmlformats.org/drawingml/2006/picture">
                       <pic:pic>
                         <pic:nvPicPr>
-                          <pic:cNvPr descr="file:///E:/tmp/claude/E--Projects-Submitted-MobileAd-Comverse/464e82cd-870f-4dc1-b795-92348cf1a9b8/scratchpad/figs/fig3.png" id="44" name="Picture"/>
+                          <pic:cNvPr descr="file:///E:/tmp/claude/E--Projects-Submitted-MobileAd-Comverse/464e82cd-870f-4dc1-b795-92348cf1a9b8/scratchpad/figs/fig4.png" id="47" name="Picture"/>
                           <pic:cNvPicPr>
                             <a:picLocks noChangeArrowheads="1" noChangeAspect="1"/>
                           </pic:cNvPicPr>
                         </pic:nvPicPr>
                         <pic:blipFill>
-                          <a:blip r:embed="rId42"/>
+                          <a:blip r:embed="rId45"/>
                           <a:stretch>
                             <a:fillRect/>
                           </a:stretch>
@@ -6179,7 +6257,7 @@
         <w:pStyle w:val="ImageCaption"/>
       </w:pPr>
       <w:r>
-        <w:t xml:space="preserve">Figure 3.</w:t>
+        <w:t xml:space="preserve">Figure 4.</w:t>
       </w:r>
       <w:r>
         <w:t xml:space="preserve"> </w:t>
@@ -6188,8 +6266,8 @@
         <w:t xml:space="preserve">The closed loop. Offline analytics compiles the model and allocation plan into lookup tables; the online engine executes them per impression and streams response records back, which the next analytics cycle uses to refine clusters, probabilities, and the plan.</w:t>
       </w:r>
     </w:p>
-    <w:bookmarkEnd w:id="45"/>
-    <w:bookmarkStart w:id="49" w:name="the-seven-step-decision"/>
+    <w:bookmarkEnd w:id="48"/>
+    <w:bookmarkStart w:id="52" w:name="the-seven-step-decision"/>
     <w:p>
       <w:pPr>
         <w:pStyle w:val="Heading3"/>
@@ -6401,18 +6479,18 @@
                 <wp:inline>
                   <wp:extent cx="5334000" cy="2755900"/>
                   <wp:effectExtent b="0" l="0" r="0" t="0"/>
-                  <wp:docPr descr="" title="" id="47" name="Picture"/>
+                  <wp:docPr descr="" title="" id="50" name="Picture"/>
                   <a:graphic>
                     <a:graphicData uri="http://schemas.openxmlformats.org/drawingml/2006/picture">
                       <pic:pic>
                         <pic:nvPicPr>
-                          <pic:cNvPr descr="file:///E:/tmp/claude/E--Projects-Submitted-MobileAd-Comverse/464e82cd-870f-4dc1-b795-92348cf1a9b8/scratchpad/figs/fig4.png" id="48" name="Picture"/>
+                          <pic:cNvPr descr="file:///E:/tmp/claude/E--Projects-Submitted-MobileAd-Comverse/464e82cd-870f-4dc1-b795-92348cf1a9b8/scratchpad/figs/fig5.png" id="51" name="Picture"/>
                           <pic:cNvPicPr>
                             <a:picLocks noChangeArrowheads="1" noChangeAspect="1"/>
                           </pic:cNvPicPr>
                         </pic:nvPicPr>
                         <pic:blipFill>
-                          <a:blip r:embed="rId46"/>
+                          <a:blip r:embed="rId49"/>
                           <a:stretch>
                             <a:fillRect/>
                           </a:stretch>
@@ -6447,7 +6525,7 @@
         <w:pStyle w:val="ImageCaption"/>
       </w:pPr>
       <w:r>
-        <w:t xml:space="preserve">Figure 4.</w:t>
+        <w:t xml:space="preserve">Figure 5.</w:t>
       </w:r>
       <w:r>
         <w:t xml:space="preserve"> </w:t>
@@ -6456,8 +6534,8 @@
         <w:t xml:space="preserve">The seven-step decision path and its data dependencies. Steps 1–5 each read one pre-computed or live table; step 6 is pure arithmetic over the candidates; step 7 writes the served impression back into the status and response tables, which is also the record that feeds the next offline refinement cycle.</w:t>
       </w:r>
     </w:p>
-    <w:bookmarkEnd w:id="49"/>
-    <w:bookmarkStart w:id="50" w:name="click-prediction-by-soft-membership"/>
+    <w:bookmarkEnd w:id="52"/>
+    <w:bookmarkStart w:id="53" w:name="click-prediction-by-soft-membership"/>
     <w:p>
       <w:pPr>
         <w:pStyle w:val="Heading3"/>
@@ -6509,8 +6587,8 @@
         <w:t xml:space="preserve">Because the subscriber borrows from every cluster they resemble, the estimate is stable even for subscribers with thin personal histories, and it is computed from two table rows and four multiplications.</w:t>
       </w:r>
     </w:p>
-    <w:bookmarkEnd w:id="50"/>
-    <w:bookmarkStart w:id="54" w:name="pacing-planned-versus-actual"/>
+    <w:bookmarkEnd w:id="53"/>
+    <w:bookmarkStart w:id="57" w:name="pacing-planned-versus-actual"/>
     <w:p>
       <w:pPr>
         <w:pStyle w:val="Heading3"/>
@@ -6785,18 +6863,18 @@
                 <wp:inline>
                   <wp:extent cx="5334000" cy="2074333"/>
                   <wp:effectExtent b="0" l="0" r="0" t="0"/>
-                  <wp:docPr descr="" title="" id="52" name="Picture"/>
+                  <wp:docPr descr="" title="" id="55" name="Picture"/>
                   <a:graphic>
                     <a:graphicData uri="http://schemas.openxmlformats.org/drawingml/2006/picture">
                       <pic:pic>
                         <pic:nvPicPr>
-                          <pic:cNvPr descr="file:///E:/tmp/claude/E--Projects-Submitted-MobileAd-Comverse/464e82cd-870f-4dc1-b795-92348cf1a9b8/scratchpad/figs/fig5.png" id="53" name="Picture"/>
+                          <pic:cNvPr descr="file:///E:/tmp/claude/E--Projects-Submitted-MobileAd-Comverse/464e82cd-870f-4dc1-b795-92348cf1a9b8/scratchpad/figs/fig6.png" id="56" name="Picture"/>
                           <pic:cNvPicPr>
                             <a:picLocks noChangeArrowheads="1" noChangeAspect="1"/>
                           </pic:cNvPicPr>
                         </pic:nvPicPr>
                         <pic:blipFill>
-                          <a:blip r:embed="rId51"/>
+                          <a:blip r:embed="rId54"/>
                           <a:stretch>
                             <a:fillRect/>
                           </a:stretch>
@@ -6831,7 +6909,7 @@
         <w:pStyle w:val="ImageCaption"/>
       </w:pPr>
       <w:r>
-        <w:t xml:space="preserve">Figure 5.</w:t>
+        <w:t xml:space="preserve">Figure 6.</w:t>
       </w:r>
       <w:r>
         <w:t xml:space="preserve"> </w:t>
@@ -7244,9 +7322,9 @@
         <w:t xml:space="preserve">C4 carries the greatest expected revenue but sits at 128% of plan, past the overserved threshold, so it is dropped; C1 at 55% is behind plan but above the critical threshold, so it earns no override. Among the remaining candidates the engine serves C3, the greatest expected revenue for this impression. The pacing mechanism is what lets a static offline plan survive contact with real, noisy traffic: the plan sets the destination, and the index steers thousands of small per-impression corrections toward it. Deviations that pacing cannot absorb (a traffic forecast that proves wrong, a campaign that outperforms its category prior) are exactly what the feedback loop carries back into the next planning cycle.</w:t>
       </w:r>
     </w:p>
-    <w:bookmarkEnd w:id="54"/>
-    <w:bookmarkEnd w:id="55"/>
-    <w:bookmarkStart w:id="56" w:name="related-work"/>
+    <w:bookmarkEnd w:id="57"/>
+    <w:bookmarkEnd w:id="58"/>
+    <w:bookmarkStart w:id="59" w:name="related-work"/>
     <w:p>
       <w:pPr>
         <w:pStyle w:val="Heading2"/>
@@ -7312,8 +7390,8 @@
         <w:t xml:space="preserve">Industrial click-through-rate modeling ranges from large-scale logistic regression [15] and field-aware factorization machines [16] to attention architectures over user behavior [17, 3]. Our click model is deliberately simpler, hierarchical empirical rates with soft cluster membership, because the architecture consumes any calibrated estimator and the allocation question is about the pairing structure, not the estimator frontier. For evaluation, replay methods [18], counterfactual reasoning in computational advertising [19], and offline A/B testing [20] establish the off-policy toolbox; the dual-model scoring of Section 4 applies the same discipline to allocation policies specifically, where we show single-model replay inflates lift through the plan’s own estimation noise.</w:t>
       </w:r>
     </w:p>
-    <w:bookmarkEnd w:id="56"/>
-    <w:bookmarkStart w:id="57" w:name="discussion"/>
+    <w:bookmarkEnd w:id="59"/>
+    <w:bookmarkStart w:id="60" w:name="discussion"/>
     <w:p>
       <w:pPr>
         <w:pStyle w:val="Heading2"/>
@@ -7397,8 +7475,8 @@
         <w:t xml:space="preserve">Bit masks make targeting tests branchless; pre-computed distances make personalization a weighted sum; per-(cluster, campaign) rows make pacing a two-row query. The offline stage does not merely produce a model; it compiles one, in the same sense a compiler turns a program into a form the machine executes directly.</w:t>
       </w:r>
     </w:p>
-    <w:bookmarkEnd w:id="57"/>
-    <w:bookmarkStart w:id="58" w:name="scope-and-assumptions"/>
+    <w:bookmarkEnd w:id="60"/>
+    <w:bookmarkStart w:id="61" w:name="scope-and-assumptions"/>
     <w:p>
       <w:pPr>
         <w:pStyle w:val="Heading2"/>
@@ -7415,11 +7493,43 @@
         <w:pStyle w:val="FirstParagraph"/>
       </w:pPr>
       <w:r>
+        <w:t xml:space="preserve">The method is built for operator-owned advertising markets, retail-media networks being the largest contemporary instance and the mobile-operator system that motivated it the originating one, where direct-sold campaigns carry guaranteed impression quotas with makegood penalties, logged-in first-party identity yields audience segments whose campaign-by-segment interaction persists across planning windows, and booked demand meets or exceeds supply on those segments; where any of these conditions fails, in particular where supply dwarfs demand, planning offers little over serving greedily. The conditions are checkable before deployment, and the paper measures each: interaction persistence r ≥ ~0.4 on the chosen axis (Section 5), per-cell planning density near 10</w:t>
+      </w:r>
+      <w:r>
+        <w:rPr>
+          <w:vertAlign w:val="superscript"/>
+        </w:rPr>
+        <w:t xml:space="preserve">3</w:t>
+      </w:r>
+      <w:r>
+        <w:t xml:space="preserve"> </w:t>
+      </w:r>
+      <w:r>
+        <w:t xml:space="preserve">(Algorithm 1), a re-plan cadence at least as fast as portfolio churn (the Avazu boundary), and contention κ</w:t>
+      </w:r>
+      <w:r>
+        <w:rPr>
+          <w:vertAlign w:val="subscript"/>
+        </w:rPr>
+        <w:t xml:space="preserve">s</w:t>
+      </w:r>
+      <w:r>
+        <w:t xml:space="preserve"> </w:t>
+      </w:r>
+      <w:r>
+        <w:t xml:space="preserve">at or above one on the interaction-carrying segments (Algorithm 1, step 6). The three public datasets are positioned accordingly: Taobao is the in-vertical evidence where all conditions hold, Avazu is the churn boundary where a daily plan fails until the cadence shrinks, and Outbrain is the contention boundary where an uncontended market yields little until demand is stressed. The two boundaries are not failed replications; they are the edges that make the deployment claim falsifiable.</w:t>
+      </w:r>
+    </w:p>
+    <w:p>
+      <w:pPr>
+        <w:pStyle w:val="BodyText"/>
+      </w:pPr>
+      <w:r>
         <w:t xml:space="preserve">The architecture optimizes expected revenue for a known campaign portfolio over a planning horizon; it does not address auction-based pricing, real-time bidding against external demand, or creative selection within a campaign. Its guarantees rest on the stability assumptions of Section 8.1: allocation quality degrades in proportion to how far future traffic and response distributions drift from the modeled ones between refinement cycles, which sets the practical requirement for how frequently the offline stage must re-run. Exposure policy enforcement is per-subscriber and rule-based; richer fatigue models would slot into step 2 without changing the surrounding machinery. Finally, window-fitted planning presumes a campaign portfolio stable over the planning horizon, which is the operator’s contracted-campaign setting; in marketplaces where the ad portfolio and its delivery mix turn over within a day, the re-planning interval must shrink to the churn timescale for the plan to retain value.</w:t>
       </w:r>
     </w:p>
-    <w:bookmarkEnd w:id="58"/>
-    <w:bookmarkStart w:id="59" w:name="references"/>
+    <w:bookmarkEnd w:id="61"/>
+    <w:bookmarkStart w:id="62" w:name="references"/>
     <w:p>
       <w:pPr>
         <w:pStyle w:val="Heading2"/>
@@ -8010,7 +8120,7 @@
         <w:t xml:space="preserve">Preprint, August 2026. Code and replay harness: github.com/ApartsinProjects/optimal-impression-allocation.</w:t>
       </w:r>
     </w:p>
-    <w:bookmarkEnd w:id="59"/>
+    <w:bookmarkEnd w:id="62"/>
     <w:sectPr/>
   </w:body>
 </w:document>

</xml_diff>

<commit_message>
Consistency pass: resolve 12 contradictions from the revision (fixed-dual rescope, Figure 2 alignment to table, use-case wording)
- Deployment rule no longer re-endorses the fixed dual; re-solve named as the single universal price source
- Figure 2 re-solve and scalar curves realigned to the exact regime-map table values; caption clarified (only policy shown)
- Abstract: +4.4->+4.3, 4.7->4.5, 'every regime'->'every contended regime'
- Policy enumeration names all six table policies; feasibility cell +3.51->+3.46 to match Section 5 headline
- Taobao reframed as in-vertical evidence (not 'closest analog'); stray 'Regime B' label removed; apologetic 'honest qualifications' softened

Co-Authored-By: Claude Opus 4.8 <noreply@anthropic.com>
</commit_message>
<xml_diff>
--- a/paper.docx
+++ b/paper.docx
@@ -99,7 +99,7 @@
         <w:pStyle w:val="BodyText"/>
       </w:pPr>
       <w:r>
-        <w:t xml:space="preserve">Evaluation uses a replay protocol hardened against a trap we document: single-model replay inflates lift through a winner’s curse. Dual-model scoring, an exact uniform-null control, support and fatigue audits, and user-clustered inference (headline z = 4.55) delimit what public logs can show, and a semi-synthetic benchmark with a known ground truth confirms the protocol recovers the true policy ranking and the true best policy, even under an adversarial logging policy that selects on the outcome. The protocol yields a regime map. At exact feasibility, plan-informed policies beat greedy serving by 3.5–4.7% expected clicks, and information-matched, feasibility-aware dual-price pacing nearly matches them. Under over-subscription (quotas at 110–150% of supply), online price learning degrades along a spectrum: a scalar controller fails first, and even dual mirror descent, the state-of-the-art adaptive method, tracks the plan through moderate contention but falls below greedy under heavy over-subscription. The periodically re-solved plan dominates every regime (+2.2 to +4.4% over greedy, z ≥ 3.4) and is the one price source positive across every contention level, dataset, and objective we test: a fixed dual pinned once at the LP optimum survives the click objective, but under a revenue objective with heterogeneous per-click and per-impression values and delivery penalties it turns negative under contention, so the durable prescription is to obtain prices by solving and re-solving, not by learning them online. The ordering reproduces on a second dataset (Outbrain, 87M impressions), where online pacing deepens to −44%, and the whole regime map transfers to the revenue objective, where the plan tier’s advantage grows as delivery guarantees harden. Grounding the gains in realized outcomes is inconclusive on the small logging-matched subset, an inherent limit of public-log evaluation.</w:t>
+        <w:t xml:space="preserve">Evaluation uses a replay protocol hardened against a trap we document: single-model replay inflates lift through a winner’s curse. Dual-model scoring, an exact uniform-null control, support and fatigue audits, and user-clustered inference (headline z = 4.55) delimit what public logs can show, and a semi-synthetic benchmark with a known ground truth confirms the protocol recovers the true policy ranking and the true best policy, even under an adversarial logging policy that selects on the outcome. The protocol yields a regime map. At exact feasibility, plan-informed policies beat greedy serving by 3.5–4.5% expected clicks, and information-matched, feasibility-aware dual-price pacing nearly matches them. Under over-subscription (quotas at 110–150% of supply), online price learning degrades along a spectrum: a scalar controller fails first, and even dual mirror descent, the state-of-the-art adaptive method, tracks the plan through moderate contention but falls below greedy under heavy over-subscription. The periodically re-solved plan dominates every contended regime (+2.2 to +4.3% over greedy, z ≥ 3.4) and is the one price source positive across every contention level, dataset, and objective we test: a fixed dual pinned once at the LP optimum survives the click objective, but under a revenue objective with heterogeneous per-click and per-impression values and delivery penalties it turns negative under contention, so the durable prescription is to obtain prices by solving and re-solving, not by learning them online. The ordering reproduces on a second dataset (Outbrain, 87M impressions), where online pacing deepens to −44%, and the whole regime map transfers to the revenue objective, where the plan tier’s advantage grows as delivery guarantees harden. Grounding the gains in realized outcomes is inconclusive on the small logging-matched subset, an inherent limit of public-log evaluation.</w:t>
       </w:r>
     </w:p>
     <w:bookmarkEnd w:id="21"/>
@@ -1870,7 +1870,7 @@
           <w:b/>
           <w:bCs/>
         </w:rPr>
-        <w:t xml:space="preserve">Over-subscription (Regime B).</w:t>
+        <w:t xml:space="preserve">Over-subscription.</w:t>
       </w:r>
       <w:r>
         <w:t xml:space="preserve"> </w:t>
@@ -1922,7 +1922,7 @@
         <w:pStyle w:val="FirstParagraph"/>
       </w:pPr>
       <w:r>
-        <w:t xml:space="preserve">A synthetic market controls everything (Section 7); real logs control nothing, which is the point. The experiments of Sections 4–6 replay the public Taobao display-advertising dataset [2, 3]: 26.6 million impressions over 8 days in May 2017, roughly 1.1 million users with declared demographics, and explicit campaign identifiers, the closest public analog to an operator's data. The market is reconstructed from the log itself: campaigns are the top 100 by planning-window volume, each campaign’s quota is the number of impressions it actually received in the serving window, and policies re-pair the identical impression stream, so the counterfactual is</w:t>
+        <w:t xml:space="preserve">A synthetic market controls everything (Section 7); real logs control nothing, which is the point. The core experiments replay the public Taobao display-advertising dataset [2, 3]: 26.6 million impressions over 8 days in May 2017, roughly 1.1 million users with declared demographics, and explicit campaign identifiers, an in-vertical commerce-media log rather than a distant analog to an operator’s data (Sections 5 and 6 add Avazu and Outbrain as the churn and contention boundaries). The market is reconstructed from the log itself: campaigns are the top 100 by planning-window volume, each campaign’s quota is the number of impressions it actually received in the serving window, and policies re-pair the identical impression stream, so the counterfactual is</w:t>
       </w:r>
       <w:r>
         <w:t xml:space="preserve"> </w:t>
@@ -3275,7 +3275,7 @@
         <w:pStyle w:val="FirstParagraph"/>
       </w:pPr>
       <w:r>
-        <w:t xml:space="preserve">Over-subscription is the regime that motivates planning, and the market reconstruction supports stressing it directly. Quotas set to each campaign’s realized delivery make the market exactly feasible; scaling all quotas above deliverable supply forces genuine contention, and policies choose which campaigns under-deliver. Five policies replay each regime on the pre-committed configuration: the static plan; a periodically re-solved plan (the same LP re-solved on remaining quotas and prorated remaining supply every 20,000 impressions); a plain dual-price pacing policy; and a tuned dual-price policy (step size tuned by simulated serving on the last planning day), started either cold or warm from the plan LP’s quota shadow prices. Lift versus greedy, combined over the five walk-forward folds, with z in parentheses:</w:t>
+        <w:t xml:space="preserve">Over-subscription is the regime that motivates planning, and the market reconstruction supports stressing it directly. Quotas set to each campaign’s realized delivery make the market exactly feasible; scaling all quotas above deliverable supply forces genuine contention, and policies choose which campaigns under-deliver. Six policies, alongside greedy, replay each regime on the pre-committed configuration: the static plan; a periodically re-solved plan (the same LP re-solved on remaining quotas and prorated remaining supply every 20,000 impressions); a scalar dual-price pacing controller; the fixed optimal dual; and dual mirror descent in Euclidean and entropic geometries. The dual-price policies and their tuning are specified below. Lift versus greedy, combined over the five walk-forward folds, with z in parentheses:</w:t>
       </w:r>
     </w:p>
     <w:tbl>
@@ -3403,7 +3403,7 @@
               <w:jc w:val="left"/>
             </w:pPr>
             <w:r>
-              <w:t xml:space="preserve">+3.51% (4.7)</w:t>
+              <w:t xml:space="preserve">+3.46% (5.0)</w:t>
             </w:r>
           </w:p>
         </w:tc>
@@ -3802,7 +3802,7 @@
         <w:t xml:space="preserve"> </w:t>
       </w:r>
       <w:r>
-        <w:t xml:space="preserve">The regime map as a deployment chart. Each curve is one policy’s lift over greedy serving (walk-forward mean, Taobao top-100, pre-committed 8-tier segmentation) as quotas are scaled above deliverable supply. The re-solved plan is the only policy that stays above greedy across the whole contention range; every online price-learning method crosses into the shaded loss region, in order of update aggressiveness (scalar first, then Euclidean, then entropic mirror descent). An operator reads the horizontal axis from the pre-deployment contention ratio of Algorithm 1, step 6, and the chart says when planning is worth the effort and which pacing to trust.</w:t>
+        <w:t xml:space="preserve">The regime map as a deployment chart. Each curve is one policy’s lift over greedy serving (walk-forward mean, Taobao top-100, pre-committed 8-tier segmentation) as quotas are scaled above deliverable supply. Of the four policies plotted, the re-solved plan is the only one that stays above greedy across the whole contention range; every online price-learning method crosses into the shaded loss region, in order of update aggressiveness (scalar first, then Euclidean, then entropic mirror descent). The static plan and the fixed optimal dual, omitted to keep the chart legible, also stay non-negative under the click objective (Section 6 table). An operator reads the horizontal axis from the pre-deployment contention ratio of Algorithm 1, step 6, and the chart says when planning is worth the effort and which pacing to trust.</w:t>
       </w:r>
     </w:p>
     <w:p>
@@ -3905,7 +3905,7 @@
         <w:pStyle w:val="BodyText"/>
       </w:pPr>
       <w:r>
-        <w:t xml:space="preserve">At exact feasibility all seven policies cluster within a point; most of the value is the forecast itself, which each consumes. Under contention they separate, and the separation is a spectrum set by how the prices are obtained (Figure 2). Adaptation degrades with the update rule: the scalar controller weakens first (+0.7% at 110% quotas, −6.9% at 150%), Euclidean mirror descent holds to 110% then falls (−4.8% at 150%), and even the strongest adaptive method, entropic mirror descent, tracks the re-solved plan through 125% over-subscription (+3.06% versus +3.39%) before turning slightly negative at 150% (−0.5%). The two policies that do not learn prices online, the re-solved plan and the fixed optimal dual, are the only ones positive at every level, and the re-solved plan is positive throughout (+2.2% to +4.3%). The semi-synthetic benchmark of Section 4.1 bounds what this table can resolve: gaps at or below roughly 0.3 points, the feasibility row where every policy clusters and the re-solve-versus-entropic-DMD cell at 125%, are within the protocol’s resolution and are not read here as an ordering; the collapses that carry the argument, 3 to 45 points, are far outside it. Two conclusions follow, each carefully scoped. First, the failure under heavy over-subscription is shared by every adaptive dual-price method we test, modern mirror descent included, not an artifact of a weak controller; a well-chosen adaptive method (entropic DMD) is nonetheless competitive through moderate contention, so the claim is about the heavy-contention regime, not adaptation in general. Second, the fixed optimal dual’s survival under this objective shows per-campaign pricing itself is not the problem, as linear-programming duality predicts: a static optimal price vector can carry the allocation. What fails as contention grows is learning that vector online. This second conclusion is the more fragile of the two: the revenue objective below will show the one-shot optimal dual is not universally robust, since a price vector solved once against the fluid plan can misprice campaigns when the realized arrival order departs from it. The claim that survives every objective and every dataset we test is therefore narrower and sharper than “fixed prices work”: prices should be</w:t>
+        <w:t xml:space="preserve">At exact feasibility all seven policies cluster within a point; most of the value is the forecast itself, which each consumes. Under contention they separate, and the separation is a spectrum set by how the prices are obtained (Figure 2). Adaptation degrades with the update rule: the scalar controller weakens first (+0.7% at 110% quotas, −6.9% at 150%), Euclidean mirror descent holds to 110% then falls (−4.8% at 150%), and even the strongest adaptive method, entropic mirror descent, tracks the re-solved plan through 125% over-subscription (+3.06% versus +3.39%) before turning slightly negative at 150% (−0.5%). The policies that obtain prices by solving rather than learning them online, the static plan, the re-solved plan, and the fixed optimal dual, are the ones that stay non-negative across the range; the re-solved plan holds the largest margin under contention (+2.2% to +4.3%), while the static plan’s edge narrows to within noise at the heaviest over-subscription (+0.28% at 150%). The semi-synthetic benchmark of Section 4.1 bounds what this table can resolve: gaps at or below roughly 0.3 points, the feasibility row where every policy clusters and the re-solve-versus-entropic-DMD cell at 125%, are within the protocol’s resolution and are not read here as an ordering; the collapses that carry the argument, 3 to 45 points, are far outside it. Two conclusions follow, each carefully scoped. First, the failure under heavy over-subscription is shared by every adaptive dual-price method we test, modern mirror descent included, not an artifact of a weak controller; a well-chosen adaptive method (entropic DMD) is nonetheless competitive through moderate contention, so the claim is about the heavy-contention regime, not adaptation in general. Second, the fixed optimal dual’s survival under this objective shows per-campaign pricing itself is not the problem, as linear-programming duality predicts: a static optimal price vector can carry the allocation. What fails as contention grows is learning that vector online. This second conclusion is the more fragile of the two: the revenue objective below will show the one-shot optimal dual is not universally robust, since a price vector solved once against the fluid plan can misprice campaigns when the realized arrival order departs from it. The claim that survives every objective and every dataset we test is therefore narrower and sharper than “fixed prices work”: prices should be</w:t>
       </w:r>
       <w:r>
         <w:t xml:space="preserve"> </w:t>
@@ -3926,7 +3926,7 @@
         <w:pStyle w:val="BodyText"/>
       </w:pPr>
       <w:r>
-        <w:t xml:space="preserve">The deployment rule follows: the LP’s prices are what matter, so obtain them by solving, either recomputing on the pacing cadence (re-solve) or holding the LP optimum (fixed dual); online price learning is competitive only while contention is mild, and no adaptive variant we test survives heavy over-subscription.</w:t>
+        <w:t xml:space="preserve">The deployment rule follows: the LP’s prices are what matter, so obtain them by solving, and recompute them on the pacing cadence (re-solve). Holding a one-shot LP optimum (the fixed dual) suffices under the click objective but is not universally robust, as the revenue results below show; online price learning is competitive only while contention is mild, and no adaptive variant we test survives heavy over-subscription. Re-solving is the single price source positive in every regime we measure.</w:t>
       </w:r>
     </w:p>
     <w:p>
@@ -3934,7 +3934,7 @@
         <w:pStyle w:val="BodyText"/>
       </w:pPr>
       <w:r>
-        <w:t xml:space="preserve">The regime map reproduces on a second, independent dataset. We repeat the whole protocol on the Outbrain content-recommendation log (87M joined impressions, a slate-click structure unlike Taobao’s display, with the segmentation axis fixed in advance to the most persistent one measured on the planning window, page platform, whose interaction residuals correlate at r = 0.95 across the shared campaign-by-platform cells; the axis has three platform levels, so this is a statement about the stability of campaigns’ platform preferences, not a many-point fit). At native quotas the Outbrain market is barely contended, per-segment supply dwarfs the quotas, so every policy sits within a percentage point of greedy, exactly the low-contention corner of the map. Under the same over-subscription stress, the ordering returns and sharpens: the re-solved plan is the only policy positive at every level (+0.3 to +0.6%), the static plan and the fixed optimal-dual degrade gently, and online scalar pacing collapses far more steeply than on Taobao, to −19%, −34%, and −44% at 1.5×, 2×, and 3× quotas. That online price learning, not per-campaign pricing, is the failure under contention, and that solving for the prices is the robust choice, holds across two datasets from different domains. Two honest qualifications attach to this second market. The over-subscription sweep is a counterfactual market that Outbrain’s operator never ran: native quotas are barely contended, so the stress levels probe a demand regime absent from the log, and the result is a statement about the mechanism under contention, not about Outbrain’s realized traffic. And the native low contention is itself a</w:t>
+        <w:t xml:space="preserve">The regime map reproduces on a second, independent dataset. We repeat the whole protocol on the Outbrain content-recommendation log (87M joined impressions, a slate-click structure unlike Taobao’s display, with the segmentation axis fixed in advance to the most persistent one measured on the planning window, page platform, whose interaction residuals correlate at r = 0.95 across the shared campaign-by-platform cells; the axis has three platform levels, so this is a statement about the stability of campaigns’ platform preferences, not a many-point fit). At native quotas the Outbrain market is barely contended, per-segment supply dwarfs the quotas, so every policy sits within a percentage point of greedy, exactly the low-contention corner of the map. Under the same over-subscription stress, the ordering returns and sharpens: the re-solved plan is the only policy positive at every level (+0.3 to +0.6%), the static plan and the fixed optimal-dual degrade gently, and online scalar pacing collapses far more steeply than on Taobao, to −19%, −34%, and −44% at 1.5×, 2×, and 3× quotas. That online price learning, not per-campaign pricing, is the failure under contention, and that solving for the prices is the robust choice, holds across two datasets from different domains. Two qualifications attach to this second market. The over-subscription sweep is a counterfactual market that Outbrain’s operator never ran: native quotas are barely contended, so the stress levels probe a demand regime absent from the log, and the result is a statement about the mechanism under contention, not about Outbrain’s realized traffic. And the native low contention is itself a</w:t>
       </w:r>
       <w:r>
         <w:t xml:space="preserve"> </w:t>
@@ -4024,7 +4024,7 @@
         <w:pStyle w:val="BodyText"/>
       </w:pPr>
       <w:r>
-        <w:t xml:space="preserve">Three robustness checks anchor the table. The headline planned-versus-greedy comparison survives a user-clustered bootstrap (z = +4.55) and an across-fold t-test (t(4) = +5.50); at exact feasibility the strong policies are statistically close, so the ordering across contention regimes, not any single feasibility cell, is the claim. Re-pairing the impression stream changes per-user exposure composition; re-scoring under a first-exposure table (each user’s first impression of each campaign only, which removes repeat-exposure composition) moves the headline from +3.46% to +3.88%, so exposure fatigue does not manufacture the result. The regime map is a single-market result: the over-subscription sweep is run on the Taobao top-100 reconstruction, while Avazu contributes only the stability boundary. The z-values in the table above the headline row come from the parametric binomial model; the conclusions that rest on them (the re-solved plan’s dominance at every scale, the dual collapse) hold with the same sign and comparable magnitude under the user-clustered bootstrap where we recomputed them. The remaining, and inherent, limitation is that these are model-scored expected clicks: an outcome-grounded estimate is possible only on the 2–2.4% of impressions where a policy’s choice coincides with the logged action, a subset both tiny and selected toward the logging policy. On it, a self-normalized inverse-propensity estimate with an estimated segment-level logging propensity puts planned within ±1pp of greedy at t(4) = −0.5, that is, inconclusive; the matched-subset calibration shows the model scorer understates realized CTR slightly and symmetrically for both policies (about 6.8% realized versus 6.5% modeled), so it is not inflating the gap. Public logs cannot close this gap; only an interventional deployment can.</w:t>
+        <w:t xml:space="preserve">Three robustness checks anchor the table. The headline planned-versus-greedy comparison survives a user-clustered bootstrap (z = +4.55) and an across-fold t-test (t(4) = +5.50); at exact feasibility the strong policies are statistically close, so the ordering across contention regimes, not any single feasibility cell, is the claim. Re-pairing the impression stream changes per-user exposure composition; re-scoring under a first-exposure table (each user’s first impression of each campaign only, which removes repeat-exposure composition) moves the headline from +3.46% to +3.88%, so exposure fatigue does not manufacture the result. The regime map is a single-market result: the over-subscription sweep is run on the Taobao top-100 reconstruction, while Avazu contributes only the stability boundary. The z-values in the table above the headline row come from the parametric binomial model; the conclusions that rest on them (the re-solved plan’s dominance at every over-subscribed scale, the dual collapse) hold with the same sign and comparable magnitude under the user-clustered bootstrap where we recomputed them. The remaining, and inherent, limitation is that these are model-scored expected clicks: an outcome-grounded estimate is possible only on the 2–2.4% of impressions where a policy’s choice coincides with the logged action, a subset both tiny and selected toward the logging policy. On it, a self-normalized inverse-propensity estimate with an estimated segment-level logging propensity puts planned within ±1pp of greedy at t(4) = −0.5, that is, inconclusive; the matched-subset calibration shows the model scorer understates realized CTR slightly and symmetrically for both policies (about 6.8% realized versus 6.5% modeled), so it is not inflating the gap. Public logs cannot close this gap; only an interventional deployment can.</w:t>
       </w:r>
     </w:p>
     <w:bookmarkEnd w:id="35"/>

</xml_diff>

<commit_message>
Compress Section 8 to a summary; move serving-architecture detail to Appendix A
Sharpens the paper's identity around the persistence rule and regime map (strategic review's top rejection-risk). Body Section 8 keeps the operator data-position table, privacy design, and a one-paragraph architecture summary; the offline/online engineering detail (former 8.1.x/8.2.x, Figures 4-6) moves to Appendix A with cross-references updated.

Co-Authored-By: Claude Opus 4.8 <noreply@anthropic.com>
</commit_message>
<xml_diff>
--- a/paper.docx
+++ b/paper.docx
@@ -253,7 +253,7 @@
         <w:pStyle w:val="BodyText"/>
       </w:pPr>
       <w:r>
-        <w:t xml:space="preserve">Section 2 quantifies the cost of greedy serving on a minimal instance and Section 3 states the allocation program and its interaction-invariance structure. Section 4 develops the replay protocol and validates it against a known ground truth, Section 5 the persistence rule, and Section 6 the regime map, its cross-dataset and revenue-objective replications. Section 7 calibrates the harness on a synthetic market with known ground truth, Section 8 presents the reference serving architecture that motivated the study, and Section 9 situates the work in the online-allocation and offline-evaluation literature. Sections 10 and 11 close with design principles and scope.</w:t>
+        <w:t xml:space="preserve">Section 2 quantifies the cost of greedy serving on a minimal instance and Section 3 states the allocation program and its interaction-invariance structure. Section 4 develops the replay protocol and validates it against a known ground truth, Section 5 the persistence rule, and Section 6 the regime map, its cross-dataset and revenue-objective replications. Section 7 calibrates the harness on a synthetic market with known ground truth, Section 8 summarizes the reference serving architecture that motivated the study, with the full design in Appendix A, and Section 9 situates the work in the online-allocation and offline-evaluation literature. Sections 10 and 11 close with design principles and scope.</w:t>
       </w:r>
     </w:p>
     <w:bookmarkEnd w:id="22"/>
@@ -2023,7 +2023,7 @@
         <w:t xml:space="preserve">c</w:t>
       </w:r>
       <w:r>
-        <w:t xml:space="preserve"> − t/T) after each impression with η set to half the global click rate; it consults no plan. Reported errors are the scoring table’s closed-form binomial variance propagated through each comparison’s assignment difference; the across-fold spread of the five per-fold lifts independently reproduces the same standard error, and the all-folds-positive sign pattern supports the parametric statement distribution-free. The uniform control defends the harness; a further check defends the scorer itself: standardizing the scoring table along the strongest observable within-cell covariate the segmentation does not use (each user’s own training-window click propensity) shifts the headline lifts by at most +0.3pp, upward, so observable within-cell selection in the logged exposures does not account for the measured gains. Support is also measured directly: only 6% of the planned policy’s assignment mass (and 5% of the re-paired mass) lands in cells with fewer than 100 logged serving-window impressions, and scoring those thin cells with a pooled campaign-level fallback moves the headline from +3.46% to +2.99%; the counterfactual does not rest on extrapolated cells. (Forcing the fallback on all cells below 1,000 impressions, 78% of the mass, collapses the lift toward zero, as it must: a campaign-constant scorer deletes the interaction dimension, and under fixed quotas every assignment then scores equally, the same argument as the uniform control.) The replay isolates the architecture’s allocation core, plan against serving policy at segment granularity: every campaign is eligible on every segment, and the per-subscriber serving components of Section 8.2 (soft-membership blending, frequency caps, threshold pacing) operate below this granularity and are not exercised by these experiments.</w:t>
+        <w:t xml:space="preserve"> − t/T) after each impression with η set to half the global click rate; it consults no plan. Reported errors are the scoring table’s closed-form binomial variance propagated through each comparison’s assignment difference; the across-fold spread of the five per-fold lifts independently reproduces the same standard error, and the all-folds-positive sign pattern supports the parametric statement distribution-free. The uniform control defends the harness; a further check defends the scorer itself: standardizing the scoring table along the strongest observable within-cell covariate the segmentation does not use (each user’s own training-window click propensity) shifts the headline lifts by at most +0.3pp, upward, so observable within-cell selection in the logged exposures does not account for the measured gains. Support is also measured directly: only 6% of the planned policy’s assignment mass (and 5% of the re-paired mass) lands in cells with fewer than 100 logged serving-window impressions, and scoring those thin cells with a pooled campaign-level fallback moves the headline from +3.46% to +2.99%; the counterfactual does not rest on extrapolated cells. (Forcing the fallback on all cells below 1,000 impressions, 78% of the mass, collapses the lift toward zero, as it must: a campaign-constant scorer deletes the interaction dimension, and under fixed quotas every assignment then scores equally, the same argument as the uniform control.) The replay isolates the architecture’s allocation core, plan against serving policy at segment granularity: every campaign is eligible on every segment, and the per-subscriber serving components of Appendix A.2 (soft-membership blending, frequency caps, threshold pacing) operate below this granularity and are not exercised by these experiments.</w:t>
       </w:r>
     </w:p>
     <w:bookmarkStart w:id="29" w:name="X888dfabe7f5ac870af14768d223c176646b6318"/>
@@ -2726,7 +2726,7 @@
         <w:t xml:space="preserve">persistence, not granularity, carries the value</w:t>
       </w:r>
       <w:r>
-        <w:t xml:space="preserve">: eight segments on the persistent axis beat 168 finer ones, because finer cells add estimation noise and re-pairing churn faster than they add exploitable signal; and the right granularity scales with per-cell data density (in a 500-campaign market, four tiers beat eight). The density component is not free of tension: eight tiers give the larger edge over greedy, yet four tiers separate more decisively from the adaptive baseline, so the depth that maximizes the gap depends on which competitor one measures against; we pre-commit to the greedy-referenced choice and report both. Third, the persistence measurement itself is the deployable design rule: before segmenting, correlate double-centered interaction residuals across adjacent planning windows, and segment only on axes that persist. The rule generalizes: on a second public log (Avazu, 40.4M mobile impressions [4]), the same measurement ranks page category as the most persistent axis (r = 0.88) and, in both datasets, time-of-day as the least, confirming that time belongs to the pacing loop, not to segmentation. Avazu’s own replay is where the rule earns its boundary: a plan fitted on a full prior window and served for a whole day is negative on three of five days, because Avazu’s ad portfolio and delivery mix turn over within a day. The persistence measurement implies a re-planning timescale, and re-planning at that timescale (every 50,000 impressions) turns the same market positive on all five days (+6.5%, +8.3%, +1.7%, +2.7%, +0.5% over greedy), confirming the mechanism and the stability condition Section 11 states. With that rule applied, the replayed policies capture 85–91% of the hindsight bound; the residual is the estimation noise and week-over-week drift that the pacing loop of Section 8.2 exists to absorb.</w:t>
+        <w:t xml:space="preserve">: eight segments on the persistent axis beat 168 finer ones, because finer cells add estimation noise and re-pairing churn faster than they add exploitable signal; and the right granularity scales with per-cell data density (in a 500-campaign market, four tiers beat eight). The density component is not free of tension: eight tiers give the larger edge over greedy, yet four tiers separate more decisively from the adaptive baseline, so the depth that maximizes the gap depends on which competitor one measures against; we pre-commit to the greedy-referenced choice and report both. Third, the persistence measurement itself is the deployable design rule: before segmenting, correlate double-centered interaction residuals across adjacent planning windows, and segment only on axes that persist. The rule generalizes: on a second public log (Avazu, 40.4M mobile impressions [4]), the same measurement ranks page category as the most persistent axis (r = 0.88) and, in both datasets, time-of-day as the least, confirming that time belongs to the pacing loop, not to segmentation. Avazu’s own replay is where the rule earns its boundary: a plan fitted on a full prior window and served for a whole day is negative on three of five days, because Avazu’s ad portfolio and delivery mix turn over within a day. The persistence measurement implies a re-planning timescale, and re-planning at that timescale (every 50,000 impressions) turns the same market positive on all five days (+6.5%, +8.3%, +1.7%, +2.7%, +0.5% over greedy), confirming the mechanism and the stability condition Section 11 states. With that rule applied, the replayed policies capture 85–91% of the hindsight bound; the residual is the estimation noise and week-over-week drift that the pacing loop of Appendix A.2 exists to absorb.</w:t>
       </w:r>
     </w:p>
     <w:p>
@@ -4464,11 +4464,11 @@
         <w:pStyle w:val="BodyText"/>
       </w:pPr>
       <w:r>
-        <w:t xml:space="preserve">The simulation carries its own controls. Both policies are verified against the hindsight bound in every replication. On control instances where all campaigns share identical click probabilities, so pairing cannot matter, the measured lift is 0.000%, confirming that the gap measures allocation quality and not an artifact of the harness. And the planned policy’s 93.8% of a bound computed with perfect hindsight shows that forecast noise costs the plan only a few points, the residual that Section 8.2’s pacing mechanism and the refinement loop exist to absorb.</w:t>
+        <w:t xml:space="preserve">The simulation carries its own controls. Both policies are verified against the hindsight bound in every replication. On control instances where all campaigns share identical click probabilities, so pairing cannot matter, the measured lift is 0.000%, confirming that the gap measures allocation quality and not an artifact of the harness. And the planned policy’s 93.8% of a bound computed with perfect hindsight shows that forecast noise costs the plan only a few points, the residual that Appendix A.2’s pacing mechanism and the refinement loop exist to absorb.</w:t>
       </w:r>
     </w:p>
     <w:bookmarkEnd w:id="39"/>
-    <w:bookmarkStart w:id="58" w:name="a-reference-serving-architecture"/>
+    <w:bookmarkStart w:id="40" w:name="a-reference-serving-architecture"/>
     <w:p>
       <w:pPr>
         <w:pStyle w:val="Heading2"/>
@@ -4782,16 +4782,247 @@
         <w:pStyle w:val="BodyText"/>
       </w:pPr>
       <w:r>
-        <w:t xml:space="preserve">The vantage point carries obligations that shape the design. Subscriber data is usable for advertising only within a consent and data-protection framework: profiling requires a lawful basis and per-subscriber opt-out under regimes such as the GDPR and ePrivacy rules, and gateway-observed browsing is subject to purpose limitation. The architecture is built for data minimization under those constraints: raw attributes and browsing records are confined to the offline stage, the serving path receives only anonymous cluster distances and campaign eligibility lists, and every online decision reads aggregate tables rather than individual histories. Segment coarseness is itself a privacy parameter: the segments that carry allocation value in Section 5 are a handful of aggregate behavior tiers, not individual dossiers. Not every subscriber has a profile at all: prepaid subscribers may be anonymous, which is why the clustering machinery supports membership computed from response behavior alone (Section 8.1.3).</w:t>
-      </w:r>
-    </w:p>
-    <w:bookmarkStart w:id="40" w:name="X76cd0aab14a1b3a28329e6411b338cd4e16a2d0"/>
+        <w:t xml:space="preserve">The vantage point carries obligations that shape the design. Subscriber data is usable for advertising only within a consent and data-protection framework: profiling requires a lawful basis and per-subscriber opt-out under regimes such as the GDPR and ePrivacy rules, and gateway-observed browsing is subject to purpose limitation. The architecture is built for data minimization under those constraints: raw attributes and browsing records are confined to the offline stage, the serving path receives only anonymous cluster distances and campaign eligibility lists, and every online decision reads aggregate tables rather than individual histories. Segment coarseness is itself a privacy parameter: the segments that carry allocation value in Section 5 are a handful of aggregate behavior tiers, not individual dossiers. Not every subscriber has a profile at all: prepaid subscribers may be anonymous, which is why the clustering machinery supports membership computed from response behavior alone (Appendix A.1.3).</w:t>
+      </w:r>
+    </w:p>
+    <w:p>
+      <w:pPr>
+        <w:pStyle w:val="BodyText"/>
+      </w:pPr>
+      <w:r>
+        <w:t xml:space="preserve">The full serving design is a two-stage architecture. An offline analytics stage learns the plan’s inputs, per-segment traffic forecasts and per-(campaign, segment) click probabilities, from event history, clusters subscribers on behavior, and compiles the resulting plan into compact lookup tables. An online engine then executes one impression at a time in constant time: a seven-step decision reads the pre-computed tables to pick the eligible, quota-remaining campaign whose plan-adjusted score is highest, blends per-cluster click estimates by soft membership, and paces delivery by tracking each campaign against its planned trajectory. Because the offline stage holds all raw attributes while the serving path sees only anonymous cluster distances and eligibility lists, the design realizes the data-minimization posture the operator setting requires. Appendix A gives the full design, its data structures, and the pacing rule; the experiments in this paper exercise the allocation core it compiles, not the per-subscriber serving machinery.</w:t>
+      </w:r>
+    </w:p>
+    <w:bookmarkEnd w:id="40"/>
+    <w:bookmarkStart w:id="41" w:name="related-work"/>
+    <w:p>
+      <w:pPr>
+        <w:pStyle w:val="Heading2"/>
+      </w:pPr>
+      <w:r>
+        <w:t xml:space="preserve">9</w:t>
+      </w:r>
+      <w:r>
+        <w:t xml:space="preserve">Related work</w:t>
+      </w:r>
+    </w:p>
+    <w:p>
+      <w:pPr>
+        <w:pStyle w:val="FirstParagraph"/>
+      </w:pPr>
+      <w:r>
+        <w:rPr>
+          <w:b/>
+          <w:bCs/>
+        </w:rPr>
+        <w:t xml:space="preserve">Online matching and allocation.</w:t>
+      </w:r>
+      <w:r>
+        <w:t xml:space="preserve"> </w:t>
+      </w:r>
+      <w:r>
+        <w:t xml:space="preserve">The theoretical core of ad allocation is online bipartite matching, from the optimal 1 − 1/e algorithm of Karp, Vazirani, and Vazirani [6] through its budgeted AdWords generalization [7]. Under stochastic arrivals, the random-permutation model admits near-optimal algorithms that learn dual prices from an initial sample [8], and primal-dual training on forecast samples extends to display allocation [9] and general online linear programming [10]. This line of work supplies the adaptive dual-price policy we use as the strong online baseline; our contribution is orthogonal: an empirical account, on public logs, of when a compiled offline plan beats such adaptive methods and what segmentation makes the plan's advantage real.</w:t>
+      </w:r>
+    </w:p>
+    <w:p>
+      <w:pPr>
+        <w:pStyle w:val="BodyText"/>
+      </w:pPr>
+      <w:r>
+        <w:rPr>
+          <w:b/>
+          <w:bCs/>
+        </w:rPr>
+        <w:t xml:space="preserve">Guaranteed display allocation.</w:t>
+      </w:r>
+      <w:r>
+        <w:t xml:space="preserve"> </w:t>
+      </w:r>
+      <w:r>
+        <w:t xml:space="preserve">Closest in spirit are systems that precompute compact allocation plans for guaranteed-delivery display advertising: optimal online assignment with forecasts [11] and the SHALE algorithm [12] both compute offline parameters that a lightweight online server executes, as our architecture does. Those works optimize the plan's representation and solve time; we address the two questions they leave open in deployment: which audience segmentation gives the plan exploitable, durable structure (the persistence rule of Section 5), and how to measure a plan's realized value against strong baselines without an online experiment. Budget-pacing controllers [13, 14] are the production embodiment of the adaptive alternative and correspond to the pacing loop our serving stage carries in Appendix A.2. Relative to this line, our contributions are a pre-committable, falsifiable segmentation test and a public-log evaluation protocol; the architecture itself is a deployment sketch.</w:t>
+      </w:r>
+    </w:p>
+    <w:p>
+      <w:pPr>
+        <w:pStyle w:val="BodyText"/>
+      </w:pPr>
+      <w:r>
+        <w:rPr>
+          <w:b/>
+          <w:bCs/>
+        </w:rPr>
+        <w:t xml:space="preserve">Click prediction and offline evaluation.</w:t>
+      </w:r>
+      <w:r>
+        <w:t xml:space="preserve"> </w:t>
+      </w:r>
+      <w:r>
+        <w:t xml:space="preserve">Industrial click-through-rate modeling ranges from large-scale logistic regression [15] and field-aware factorization machines [16] to attention architectures over user behavior [17, 3]. Our click model is deliberately simpler, hierarchical empirical rates with soft cluster membership, because the architecture consumes any calibrated estimator and the allocation question is about the pairing structure, not the estimator frontier. For evaluation, replay methods [18], counterfactual reasoning in computational advertising [19], and offline A/B testing [20] establish the off-policy toolbox; the dual-model scoring of Section 4 applies the same discipline to allocation policies specifically, where we show single-model replay inflates lift through the plan’s own estimation noise.</w:t>
+      </w:r>
+    </w:p>
+    <w:bookmarkEnd w:id="41"/>
+    <w:bookmarkStart w:id="42" w:name="discussion"/>
+    <w:p>
+      <w:pPr>
+        <w:pStyle w:val="Heading2"/>
+      </w:pPr>
+      <w:r>
+        <w:t xml:space="preserve">10</w:t>
+      </w:r>
+      <w:r>
+        <w:t xml:space="preserve">Discussion</w:t>
+      </w:r>
+    </w:p>
+    <w:p>
+      <w:pPr>
+        <w:pStyle w:val="FirstParagraph"/>
+      </w:pPr>
+      <w:r>
+        <w:rPr>
+          <w:b/>
+          <w:bCs/>
+        </w:rPr>
+        <w:t xml:space="preserve">The optimization lives where time is cheap.</w:t>
+      </w:r>
+      <w:r>
+        <w:t xml:space="preserve"> </w:t>
+      </w:r>
+      <w:r>
+        <w:t xml:space="preserve">Global allocation over all campaigns and segments is a large linear program, and it is solved where minutes are available, not milliseconds. The serving path touches five small tables and does arithmetic. This is the classic plan/execute split, applied so that the online system inherits the quality of the offline optimum at lookup cost.</w:t>
+      </w:r>
+    </w:p>
+    <w:p>
+      <w:pPr>
+        <w:pStyle w:val="BodyText"/>
+      </w:pPr>
+      <w:r>
+        <w:rPr>
+          <w:b/>
+          <w:bCs/>
+        </w:rPr>
+        <w:t xml:space="preserve">Pooling defeats sparsity.</w:t>
+      </w:r>
+      <w:r>
+        <w:t xml:space="preserve"> </w:t>
+      </w:r>
+      <w:r>
+        <w:t xml:space="preserve">No individual generates enough clicks to estimate their own response rates. Clusters do. Soft membership then re-personalizes the pooled estimates, blending each subscriber’s several behavioral neighborhoods instead of forcing a single label. The same back-off logic handles new campaigns (borrow from similar campaigns) and profile-less subscribers (cluster by response history alone), so one mechanism covers three cold-start problems.</w:t>
+      </w:r>
+    </w:p>
+    <w:p>
+      <w:pPr>
+        <w:pStyle w:val="BodyText"/>
+      </w:pPr>
+      <w:r>
+        <w:rPr>
+          <w:b/>
+          <w:bCs/>
+        </w:rPr>
+        <w:t xml:space="preserve">The plan is a baseline, not a cage.</w:t>
+      </w:r>
+      <w:r>
+        <w:t xml:space="preserve"> </w:t>
+      </w:r>
+      <w:r>
+        <w:t xml:space="preserve">Real traffic never matches the forecast. By carrying planned counts into the serving state and steering with a performance index, the system tolerates forecast error gracefully: small deviations are corrected impression by impression, and persistent ones are evidence, fed back into the next modeling cycle rather than silently accumulated.</w:t>
+      </w:r>
+    </w:p>
+    <w:p>
+      <w:pPr>
+        <w:pStyle w:val="BodyText"/>
+      </w:pPr>
+      <w:r>
+        <w:rPr>
+          <w:b/>
+          <w:bCs/>
+        </w:rPr>
+        <w:t xml:space="preserve">Every representation is serving-shaped.</w:t>
+      </w:r>
+      <w:r>
+        <w:t xml:space="preserve"> </w:t>
+      </w:r>
+      <w:r>
+        <w:t xml:space="preserve">Bit masks make targeting tests branchless; pre-computed distances make personalization a weighted sum; per-(cluster, campaign) rows make pacing a two-row query. The offline stage does not merely produce a model; it compiles one, in the same sense a compiler turns a program into a form the machine executes directly.</w:t>
+      </w:r>
+    </w:p>
+    <w:bookmarkEnd w:id="42"/>
+    <w:bookmarkStart w:id="43" w:name="scope-and-assumptions"/>
+    <w:p>
+      <w:pPr>
+        <w:pStyle w:val="Heading2"/>
+      </w:pPr>
+      <w:r>
+        <w:t xml:space="preserve">11</w:t>
+      </w:r>
+      <w:r>
+        <w:t xml:space="preserve">Scope and assumptions</w:t>
+      </w:r>
+    </w:p>
+    <w:p>
+      <w:pPr>
+        <w:pStyle w:val="FirstParagraph"/>
+      </w:pPr>
+      <w:r>
+        <w:t xml:space="preserve">The method is built for operator-owned advertising markets, retail-media networks being the largest contemporary instance and the mobile-operator system that motivated it the originating one, where direct-sold campaigns carry guaranteed impression quotas with makegood penalties, logged-in first-party identity yields audience segments whose campaign-by-segment interaction persists across planning windows, and booked demand meets or exceeds supply on those segments; where any of these conditions fails, in particular where supply dwarfs demand, planning offers little over serving greedily. The conditions are checkable before deployment, and the paper measures each: interaction persistence r ≥ ~0.4 on the chosen axis (Section 5), per-cell planning density near 10</w:t>
+      </w:r>
+      <w:r>
+        <w:rPr>
+          <w:vertAlign w:val="superscript"/>
+        </w:rPr>
+        <w:t xml:space="preserve">3</w:t>
+      </w:r>
+      <w:r>
+        <w:t xml:space="preserve"> </w:t>
+      </w:r>
+      <w:r>
+        <w:t xml:space="preserve">(Algorithm 1), a re-plan cadence at least as fast as portfolio churn (the Avazu boundary), and contention κ</w:t>
+      </w:r>
+      <w:r>
+        <w:rPr>
+          <w:vertAlign w:val="subscript"/>
+        </w:rPr>
+        <w:t xml:space="preserve">s</w:t>
+      </w:r>
+      <w:r>
+        <w:t xml:space="preserve"> </w:t>
+      </w:r>
+      <w:r>
+        <w:t xml:space="preserve">at or above one on the interaction-carrying segments (Algorithm 1, step 6). The three public datasets are positioned accordingly: Taobao is the in-vertical evidence where all conditions hold, Avazu is the churn boundary where a daily plan fails until the cadence shrinks, and Outbrain is the contention boundary where an uncontended market yields little until demand is stressed. The two boundaries are not failed replications; they are the edges that make the deployment claim falsifiable.</w:t>
+      </w:r>
+    </w:p>
+    <w:p>
+      <w:pPr>
+        <w:pStyle w:val="BodyText"/>
+      </w:pPr>
+      <w:r>
+        <w:t xml:space="preserve">The architecture optimizes expected revenue for a known campaign portfolio over a planning horizon; it does not address auction-based pricing, real-time bidding against external demand, or creative selection within a campaign. Its guarantees rest on the stability assumptions of Appendix A.1: allocation quality degrades in proportion to how far future traffic and response distributions drift from the modeled ones between refinement cycles, which sets the practical requirement for how frequently the offline stage must re-run. Exposure policy enforcement is per-subscriber and rule-based; richer fatigue models would slot into step 2 without changing the surrounding machinery. Finally, window-fitted planning presumes a campaign portfolio stable over the planning horizon, which is the operator’s contracted-campaign setting; in marketplaces where the ad portfolio and its delivery mix turn over within a day, the re-planning interval must shrink to the churn timescale for the plan to retain value.</w:t>
+      </w:r>
+    </w:p>
+    <w:bookmarkEnd w:id="43"/>
+    <w:bookmarkStart w:id="62" w:name="X768eda5dc47c9e2fbd56372e290aa93bfab37c7"/>
+    <w:p>
+      <w:pPr>
+        <w:pStyle w:val="Heading2"/>
+      </w:pPr>
+      <w:r>
+        <w:t xml:space="preserve">Appendix A. Reference serving architecture</w:t>
+      </w:r>
+    </w:p>
+    <w:p>
+      <w:pPr>
+        <w:pStyle w:val="FirstParagraph"/>
+      </w:pPr>
+      <w:r>
+        <w:t xml:space="preserve">This appendix gives the full deployment design summarized in Section 8: the offline stage that compiles the plan and the online stage that executes it per impression. It is a design sketch; the experiments of Sections 4–6 validate the allocation core it compiles, not the per-subscriber serving machinery detailed here.</w:t>
+      </w:r>
+    </w:p>
+    <w:bookmarkStart w:id="44" w:name="Xa31f11580875970f34b111f76672a43985c73f8"/>
     <w:p>
       <w:pPr>
         <w:pStyle w:val="Heading3"/>
       </w:pPr>
       <w:r>
-        <w:t xml:space="preserve">8.1 The offline stage: learning the inputs to the plan</w:t>
+        <w:t xml:space="preserve">A.1 The offline stage: learning the inputs to the plan</w:t>
       </w:r>
     </w:p>
     <w:p>
@@ -4882,14 +5113,14 @@
         <w:t xml:space="preserve">Assumption 1 justifies forecasting traffic from history; assumptions 2 and 3 justify pooling sparse per-subscriber click data into clusters that have enough volume to estimate probabilities reliably.</w:t>
       </w:r>
     </w:p>
-    <w:bookmarkEnd w:id="40"/>
-    <w:bookmarkStart w:id="41" w:name="response-records"/>
+    <w:bookmarkEnd w:id="44"/>
+    <w:bookmarkStart w:id="45" w:name="a.1.1-response-records"/>
     <w:p>
       <w:pPr>
         <w:pStyle w:val="Heading3"/>
       </w:pPr>
       <w:r>
-        <w:t xml:space="preserve">8.1.1 Response records</w:t>
+        <w:t xml:space="preserve">A.1.1 Response records</w:t>
       </w:r>
     </w:p>
     <w:p>
@@ -5173,14 +5404,14 @@
         <w:t xml:space="preserve">Records are grouped per subscriber and joined with the profile (age, gender, location, income band, purchase indicators) where one is available. Past campaigns matter as much as active ones: a subscriber’s reaction to a finished campaign is evidence about how they will react to similar future ones.</w:t>
       </w:r>
     </w:p>
-    <w:bookmarkEnd w:id="41"/>
-    <w:bookmarkStart w:id="42" w:name="proximity-and-clustering"/>
+    <w:bookmarkEnd w:id="45"/>
+    <w:bookmarkStart w:id="46" w:name="a.1.2-proximity-and-clustering"/>
     <w:p>
       <w:pPr>
         <w:pStyle w:val="Heading3"/>
       </w:pPr>
       <w:r>
-        <w:t xml:space="preserve">8.1.2 Proximity and clustering</w:t>
+        <w:t xml:space="preserve">A.1.2 Proximity and clustering</w:t>
       </w:r>
     </w:p>
     <w:p>
@@ -5379,17 +5610,17 @@
         <w:t xml:space="preserve">soft</w:t>
       </w:r>
       <w:r>
-        <w:t xml:space="preserve">. A subscriber is not filed into one cluster; they carry a pre-computed distance to each nearby cluster. A 35-year-old married streaming subscriber in a large city may sit at distance 0.8 from the “metropolitan professionals” cluster and 0.1 from “music lovers”; a 22-year-old gaming subscriber in the same city sits close to “gamers” and “music lovers” instead. These distances become interpolation weights at serving time (Section 8.2), so predictions blend the behavior of every cluster the subscriber resembles.</w:t>
-      </w:r>
-    </w:p>
-    <w:bookmarkEnd w:id="42"/>
-    <w:bookmarkStart w:id="43" w:name="Xcf0c62df256e2cee415416a2e095f7c938d4365"/>
+        <w:t xml:space="preserve">. A subscriber is not filed into one cluster; they carry a pre-computed distance to each nearby cluster. A 35-year-old married streaming subscriber in a large city may sit at distance 0.8 from the “metropolitan professionals” cluster and 0.1 from “music lovers”; a 22-year-old gaming subscriber in the same city sits close to “gamers” and “music lovers” instead. These distances become interpolation weights at serving time (Appendix A.2), so predictions blend the behavior of every cluster the subscriber resembles.</w:t>
+      </w:r>
+    </w:p>
+    <w:bookmarkEnd w:id="46"/>
+    <w:bookmarkStart w:id="47" w:name="X8b2446043a77ae8c428cb2f72851e920fe1c4ed"/>
     <w:p>
       <w:pPr>
         <w:pStyle w:val="Heading3"/>
       </w:pPr>
       <w:r>
-        <w:t xml:space="preserve">8.1.3 Cluster representation and click estimation</w:t>
+        <w:t xml:space="preserve">A.1.3 Cluster representation and click estimation</w:t>
       </w:r>
     </w:p>
     <w:p>
@@ -5901,14 +6132,14 @@
         <w:t xml:space="preserve">For a brand-new campaign with no history of its own, probabilities are borrowed from the most similar past or active campaigns in the same category, the same pooling idea applied across campaigns instead of across subscribers. Where the profile itself is missing (anonymous or prepaid subscribers), distance to clusters is computed from response history alone, and the subscriber inherits the response statistics of the cluster they behave like. The design degrades gracefully as data thins out: per-subscriber evidence backs off to cluster evidence, and per-campaign evidence backs off to category evidence.</w:t>
       </w:r>
     </w:p>
-    <w:bookmarkEnd w:id="43"/>
-    <w:bookmarkStart w:id="44" w:name="compiling-the-plan-into-lookup-tables"/>
+    <w:bookmarkEnd w:id="47"/>
+    <w:bookmarkStart w:id="48" w:name="X2728b61a2ed01e7aae0fb7efa1e42ffc1e64944"/>
     <w:p>
       <w:pPr>
         <w:pStyle w:val="Heading3"/>
       </w:pPr>
       <w:r>
-        <w:t xml:space="preserve">8.1.4 Compiling the plan into lookup tables</w:t>
+        <w:t xml:space="preserve">A.1.4 Compiling the plan into lookup tables</w:t>
       </w:r>
     </w:p>
     <w:p>
@@ -6122,14 +6353,14 @@
         <w:t xml:space="preserve">That one row carries targeting, allocation, and the performance baseline the online stage will pace against.</w:t>
       </w:r>
     </w:p>
-    <w:bookmarkEnd w:id="44"/>
-    <w:bookmarkStart w:id="48" w:name="X6b41d0bc1b6a7aa734a67750c2b9949c703d461"/>
+    <w:bookmarkEnd w:id="48"/>
+    <w:bookmarkStart w:id="52" w:name="X4b4881ba4a2c69f1986b51a46ce2020ac7b4091"/>
     <w:p>
       <w:pPr>
         <w:pStyle w:val="Heading3"/>
       </w:pPr>
       <w:r>
-        <w:t xml:space="preserve">8.2 The online stage: executing the plan in real time</w:t>
+        <w:t xml:space="preserve">A.2 The online stage: executing the plan in real time</w:t>
       </w:r>
     </w:p>
     <w:p>
@@ -6211,18 +6442,18 @@
                 <wp:inline>
                   <wp:extent cx="5334000" cy="1778000"/>
                   <wp:effectExtent b="0" l="0" r="0" t="0"/>
-                  <wp:docPr descr="" title="" id="46" name="Picture"/>
+                  <wp:docPr descr="" title="" id="50" name="Picture"/>
                   <a:graphic>
                     <a:graphicData uri="http://schemas.openxmlformats.org/drawingml/2006/picture">
                       <pic:pic>
                         <pic:nvPicPr>
-                          <pic:cNvPr descr="file:///E:/tmp/claude/E--Projects-Submitted-MobileAd-Comverse/464e82cd-870f-4dc1-b795-92348cf1a9b8/scratchpad/figs/fig4.png" id="47" name="Picture"/>
+                          <pic:cNvPr descr="file:///E:/tmp/claude/E--Projects-Submitted-MobileAd-Comverse/464e82cd-870f-4dc1-b795-92348cf1a9b8/scratchpad/figs/fig4.png" id="51" name="Picture"/>
                           <pic:cNvPicPr>
                             <a:picLocks noChangeArrowheads="1" noChangeAspect="1"/>
                           </pic:cNvPicPr>
                         </pic:nvPicPr>
                         <pic:blipFill>
-                          <a:blip r:embed="rId45"/>
+                          <a:blip r:embed="rId49"/>
                           <a:stretch>
                             <a:fillRect/>
                           </a:stretch>
@@ -6266,14 +6497,14 @@
         <w:t xml:space="preserve">The closed loop. Offline analytics compiles the model and allocation plan into lookup tables; the online engine executes them per impression and streams response records back, which the next analytics cycle uses to refine clusters, probabilities, and the plan.</w:t>
       </w:r>
     </w:p>
-    <w:bookmarkEnd w:id="48"/>
-    <w:bookmarkStart w:id="52" w:name="the-seven-step-decision"/>
+    <w:bookmarkEnd w:id="52"/>
+    <w:bookmarkStart w:id="56" w:name="a.2.1-the-seven-step-decision"/>
     <w:p>
       <w:pPr>
         <w:pStyle w:val="Heading3"/>
       </w:pPr>
       <w:r>
-        <w:t xml:space="preserve">8.2.1 The seven-step decision</w:t>
+        <w:t xml:space="preserve">A.2.1 The seven-step decision</w:t>
       </w:r>
     </w:p>
     <w:p>
@@ -6373,7 +6604,7 @@
         <w:t xml:space="preserve"> </w:t>
       </w:r>
       <w:r>
-        <w:t xml:space="preserve">Blend cluster-level click rates with the soft-membership weights (Section 8.2.2).</w:t>
+        <w:t xml:space="preserve">Blend cluster-level click rates with the soft-membership weights (Appendix A.2.2).</w:t>
       </w:r>
     </w:p>
     <w:p>
@@ -6398,7 +6629,7 @@
         <w:t xml:space="preserve"> </w:t>
       </w:r>
       <w:r>
-        <w:t xml:space="preserve">Compare actual delivery against plan, prorated to this point in the flight (Section 8.2.3).</w:t>
+        <w:t xml:space="preserve">Compare actual delivery against plan, prorated to this point in the flight (Appendix A.2.3).</w:t>
       </w:r>
     </w:p>
     <w:p>
@@ -6479,18 +6710,18 @@
                 <wp:inline>
                   <wp:extent cx="5334000" cy="2755900"/>
                   <wp:effectExtent b="0" l="0" r="0" t="0"/>
-                  <wp:docPr descr="" title="" id="50" name="Picture"/>
+                  <wp:docPr descr="" title="" id="54" name="Picture"/>
                   <a:graphic>
                     <a:graphicData uri="http://schemas.openxmlformats.org/drawingml/2006/picture">
                       <pic:pic>
                         <pic:nvPicPr>
-                          <pic:cNvPr descr="file:///E:/tmp/claude/E--Projects-Submitted-MobileAd-Comverse/464e82cd-870f-4dc1-b795-92348cf1a9b8/scratchpad/figs/fig5.png" id="51" name="Picture"/>
+                          <pic:cNvPr descr="file:///E:/tmp/claude/E--Projects-Submitted-MobileAd-Comverse/464e82cd-870f-4dc1-b795-92348cf1a9b8/scratchpad/figs/fig5.png" id="55" name="Picture"/>
                           <pic:cNvPicPr>
                             <a:picLocks noChangeArrowheads="1" noChangeAspect="1"/>
                           </pic:cNvPicPr>
                         </pic:nvPicPr>
                         <pic:blipFill>
-                          <a:blip r:embed="rId49"/>
+                          <a:blip r:embed="rId53"/>
                           <a:stretch>
                             <a:fillRect/>
                           </a:stretch>
@@ -6534,14 +6765,14 @@
         <w:t xml:space="preserve">The seven-step decision path and its data dependencies. Steps 1–5 each read one pre-computed or live table; step 6 is pure arithmetic over the candidates; step 7 writes the served impression back into the status and response tables, which is also the record that feeds the next offline refinement cycle.</w:t>
       </w:r>
     </w:p>
-    <w:bookmarkEnd w:id="52"/>
-    <w:bookmarkStart w:id="53" w:name="click-prediction-by-soft-membership"/>
+    <w:bookmarkEnd w:id="56"/>
+    <w:bookmarkStart w:id="57" w:name="X177b7c0bc4741b5b22d40a3d16b0d67309e222e"/>
     <w:p>
       <w:pPr>
         <w:pStyle w:val="Heading3"/>
       </w:pPr>
       <w:r>
-        <w:t xml:space="preserve">8.2.2 Click prediction by soft membership</w:t>
+        <w:t xml:space="preserve">A.2.2 Click prediction by soft membership</w:t>
       </w:r>
     </w:p>
     <w:p>
@@ -6587,14 +6818,14 @@
         <w:t xml:space="preserve">Because the subscriber borrows from every cluster they resemble, the estimate is stable even for subscribers with thin personal histories, and it is computed from two table rows and four multiplications.</w:t>
       </w:r>
     </w:p>
-    <w:bookmarkEnd w:id="53"/>
-    <w:bookmarkStart w:id="57" w:name="pacing-planned-versus-actual"/>
+    <w:bookmarkEnd w:id="57"/>
+    <w:bookmarkStart w:id="61" w:name="a.2.3-pacing-planned-versus-actual"/>
     <w:p>
       <w:pPr>
         <w:pStyle w:val="Heading3"/>
       </w:pPr>
       <w:r>
-        <w:t xml:space="preserve">8.2.3 Pacing: planned versus actual</w:t>
+        <w:t xml:space="preserve">A.2.3 Pacing: planned versus actual</w:t>
       </w:r>
     </w:p>
     <w:p>
@@ -6863,18 +7094,18 @@
                 <wp:inline>
                   <wp:extent cx="5334000" cy="2074333"/>
                   <wp:effectExtent b="0" l="0" r="0" t="0"/>
-                  <wp:docPr descr="" title="" id="55" name="Picture"/>
+                  <wp:docPr descr="" title="" id="59" name="Picture"/>
                   <a:graphic>
                     <a:graphicData uri="http://schemas.openxmlformats.org/drawingml/2006/picture">
                       <pic:pic>
                         <pic:nvPicPr>
-                          <pic:cNvPr descr="file:///E:/tmp/claude/E--Projects-Submitted-MobileAd-Comverse/464e82cd-870f-4dc1-b795-92348cf1a9b8/scratchpad/figs/fig6.png" id="56" name="Picture"/>
+                          <pic:cNvPr descr="file:///E:/tmp/claude/E--Projects-Submitted-MobileAd-Comverse/464e82cd-870f-4dc1-b795-92348cf1a9b8/scratchpad/figs/fig6.png" id="60" name="Picture"/>
                           <pic:cNvPicPr>
                             <a:picLocks noChangeArrowheads="1" noChangeAspect="1"/>
                           </pic:cNvPicPr>
                         </pic:nvPicPr>
                         <pic:blipFill>
-                          <a:blip r:embed="rId54"/>
+                          <a:blip r:embed="rId58"/>
                           <a:stretch>
                             <a:fillRect/>
                           </a:stretch>
@@ -7322,214 +7553,9 @@
         <w:t xml:space="preserve">C4 carries the greatest expected revenue but sits at 128% of plan, past the overserved threshold, so it is dropped; C1 at 55% is behind plan but above the critical threshold, so it earns no override. Among the remaining candidates the engine serves C3, the greatest expected revenue for this impression. The pacing mechanism is what lets a static offline plan survive contact with real, noisy traffic: the plan sets the destination, and the index steers thousands of small per-impression corrections toward it. Deviations that pacing cannot absorb (a traffic forecast that proves wrong, a campaign that outperforms its category prior) are exactly what the feedback loop carries back into the next planning cycle.</w:t>
       </w:r>
     </w:p>
-    <w:bookmarkEnd w:id="57"/>
-    <w:bookmarkEnd w:id="58"/>
-    <w:bookmarkStart w:id="59" w:name="related-work"/>
-    <w:p>
-      <w:pPr>
-        <w:pStyle w:val="Heading2"/>
-      </w:pPr>
-      <w:r>
-        <w:t xml:space="preserve">9</w:t>
-      </w:r>
-      <w:r>
-        <w:t xml:space="preserve">Related work</w:t>
-      </w:r>
-    </w:p>
-    <w:p>
-      <w:pPr>
-        <w:pStyle w:val="FirstParagraph"/>
-      </w:pPr>
-      <w:r>
-        <w:rPr>
-          <w:b/>
-          <w:bCs/>
-        </w:rPr>
-        <w:t xml:space="preserve">Online matching and allocation.</w:t>
-      </w:r>
-      <w:r>
-        <w:t xml:space="preserve"> </w:t>
-      </w:r>
-      <w:r>
-        <w:t xml:space="preserve">The theoretical core of ad allocation is online bipartite matching, from the optimal 1 − 1/e algorithm of Karp, Vazirani, and Vazirani [6] through its budgeted AdWords generalization [7]. Under stochastic arrivals, the random-permutation model admits near-optimal algorithms that learn dual prices from an initial sample [8], and primal-dual training on forecast samples extends to display allocation [9] and general online linear programming [10]. This line of work supplies the adaptive dual-price policy we use as the strong online baseline; our contribution is orthogonal: an empirical account, on public logs, of when a compiled offline plan beats such adaptive methods and what segmentation makes the plan's advantage real.</w:t>
-      </w:r>
-    </w:p>
-    <w:p>
-      <w:pPr>
-        <w:pStyle w:val="BodyText"/>
-      </w:pPr>
-      <w:r>
-        <w:rPr>
-          <w:b/>
-          <w:bCs/>
-        </w:rPr>
-        <w:t xml:space="preserve">Guaranteed display allocation.</w:t>
-      </w:r>
-      <w:r>
-        <w:t xml:space="preserve"> </w:t>
-      </w:r>
-      <w:r>
-        <w:t xml:space="preserve">Closest in spirit are systems that precompute compact allocation plans for guaranteed-delivery display advertising: optimal online assignment with forecasts [11] and the SHALE algorithm [12] both compute offline parameters that a lightweight online server executes, as our architecture does. Those works optimize the plan's representation and solve time; we address the two questions they leave open in deployment: which audience segmentation gives the plan exploitable, durable structure (the persistence rule of Section 5), and how to measure a plan's realized value against strong baselines without an online experiment. Budget-pacing controllers [13, 14] are the production embodiment of the adaptive alternative and correspond to the pacing loop our serving stage carries in Section 8.2. Relative to this line, our contributions are a pre-committable, falsifiable segmentation test and a public-log evaluation protocol; the architecture itself is a deployment sketch.</w:t>
-      </w:r>
-    </w:p>
-    <w:p>
-      <w:pPr>
-        <w:pStyle w:val="BodyText"/>
-      </w:pPr>
-      <w:r>
-        <w:rPr>
-          <w:b/>
-          <w:bCs/>
-        </w:rPr>
-        <w:t xml:space="preserve">Click prediction and offline evaluation.</w:t>
-      </w:r>
-      <w:r>
-        <w:t xml:space="preserve"> </w:t>
-      </w:r>
-      <w:r>
-        <w:t xml:space="preserve">Industrial click-through-rate modeling ranges from large-scale logistic regression [15] and field-aware factorization machines [16] to attention architectures over user behavior [17, 3]. Our click model is deliberately simpler, hierarchical empirical rates with soft cluster membership, because the architecture consumes any calibrated estimator and the allocation question is about the pairing structure, not the estimator frontier. For evaluation, replay methods [18], counterfactual reasoning in computational advertising [19], and offline A/B testing [20] establish the off-policy toolbox; the dual-model scoring of Section 4 applies the same discipline to allocation policies specifically, where we show single-model replay inflates lift through the plan’s own estimation noise.</w:t>
-      </w:r>
-    </w:p>
-    <w:bookmarkEnd w:id="59"/>
-    <w:bookmarkStart w:id="60" w:name="discussion"/>
-    <w:p>
-      <w:pPr>
-        <w:pStyle w:val="Heading2"/>
-      </w:pPr>
-      <w:r>
-        <w:t xml:space="preserve">10</w:t>
-      </w:r>
-      <w:r>
-        <w:t xml:space="preserve">Discussion</w:t>
-      </w:r>
-    </w:p>
-    <w:p>
-      <w:pPr>
-        <w:pStyle w:val="FirstParagraph"/>
-      </w:pPr>
-      <w:r>
-        <w:rPr>
-          <w:b/>
-          <w:bCs/>
-        </w:rPr>
-        <w:t xml:space="preserve">The optimization lives where time is cheap.</w:t>
-      </w:r>
-      <w:r>
-        <w:t xml:space="preserve"> </w:t>
-      </w:r>
-      <w:r>
-        <w:t xml:space="preserve">Global allocation over all campaigns and segments is a large linear program, and it is solved where minutes are available, not milliseconds. The serving path touches five small tables and does arithmetic. This is the classic plan/execute split, applied so that the online system inherits the quality of the offline optimum at lookup cost.</w:t>
-      </w:r>
-    </w:p>
-    <w:p>
-      <w:pPr>
-        <w:pStyle w:val="BodyText"/>
-      </w:pPr>
-      <w:r>
-        <w:rPr>
-          <w:b/>
-          <w:bCs/>
-        </w:rPr>
-        <w:t xml:space="preserve">Pooling defeats sparsity.</w:t>
-      </w:r>
-      <w:r>
-        <w:t xml:space="preserve"> </w:t>
-      </w:r>
-      <w:r>
-        <w:t xml:space="preserve">No individual generates enough clicks to estimate their own response rates. Clusters do. Soft membership then re-personalizes the pooled estimates, blending each subscriber’s several behavioral neighborhoods instead of forcing a single label. The same back-off logic handles new campaigns (borrow from similar campaigns) and profile-less subscribers (cluster by response history alone), so one mechanism covers three cold-start problems.</w:t>
-      </w:r>
-    </w:p>
-    <w:p>
-      <w:pPr>
-        <w:pStyle w:val="BodyText"/>
-      </w:pPr>
-      <w:r>
-        <w:rPr>
-          <w:b/>
-          <w:bCs/>
-        </w:rPr>
-        <w:t xml:space="preserve">The plan is a baseline, not a cage.</w:t>
-      </w:r>
-      <w:r>
-        <w:t xml:space="preserve"> </w:t>
-      </w:r>
-      <w:r>
-        <w:t xml:space="preserve">Real traffic never matches the forecast. By carrying planned counts into the serving state and steering with a performance index, the system tolerates forecast error gracefully: small deviations are corrected impression by impression, and persistent ones are evidence, fed back into the next modeling cycle rather than silently accumulated.</w:t>
-      </w:r>
-    </w:p>
-    <w:p>
-      <w:pPr>
-        <w:pStyle w:val="BodyText"/>
-      </w:pPr>
-      <w:r>
-        <w:rPr>
-          <w:b/>
-          <w:bCs/>
-        </w:rPr>
-        <w:t xml:space="preserve">Every representation is serving-shaped.</w:t>
-      </w:r>
-      <w:r>
-        <w:t xml:space="preserve"> </w:t>
-      </w:r>
-      <w:r>
-        <w:t xml:space="preserve">Bit masks make targeting tests branchless; pre-computed distances make personalization a weighted sum; per-(cluster, campaign) rows make pacing a two-row query. The offline stage does not merely produce a model; it compiles one, in the same sense a compiler turns a program into a form the machine executes directly.</w:t>
-      </w:r>
-    </w:p>
-    <w:bookmarkEnd w:id="60"/>
-    <w:bookmarkStart w:id="61" w:name="scope-and-assumptions"/>
-    <w:p>
-      <w:pPr>
-        <w:pStyle w:val="Heading2"/>
-      </w:pPr>
-      <w:r>
-        <w:t xml:space="preserve">11</w:t>
-      </w:r>
-      <w:r>
-        <w:t xml:space="preserve">Scope and assumptions</w:t>
-      </w:r>
-    </w:p>
-    <w:p>
-      <w:pPr>
-        <w:pStyle w:val="FirstParagraph"/>
-      </w:pPr>
-      <w:r>
-        <w:t xml:space="preserve">The method is built for operator-owned advertising markets, retail-media networks being the largest contemporary instance and the mobile-operator system that motivated it the originating one, where direct-sold campaigns carry guaranteed impression quotas with makegood penalties, logged-in first-party identity yields audience segments whose campaign-by-segment interaction persists across planning windows, and booked demand meets or exceeds supply on those segments; where any of these conditions fails, in particular where supply dwarfs demand, planning offers little over serving greedily. The conditions are checkable before deployment, and the paper measures each: interaction persistence r ≥ ~0.4 on the chosen axis (Section 5), per-cell planning density near 10</w:t>
-      </w:r>
-      <w:r>
-        <w:rPr>
-          <w:vertAlign w:val="superscript"/>
-        </w:rPr>
-        <w:t xml:space="preserve">3</w:t>
-      </w:r>
-      <w:r>
-        <w:t xml:space="preserve"> </w:t>
-      </w:r>
-      <w:r>
-        <w:t xml:space="preserve">(Algorithm 1), a re-plan cadence at least as fast as portfolio churn (the Avazu boundary), and contention κ</w:t>
-      </w:r>
-      <w:r>
-        <w:rPr>
-          <w:vertAlign w:val="subscript"/>
-        </w:rPr>
-        <w:t xml:space="preserve">s</w:t>
-      </w:r>
-      <w:r>
-        <w:t xml:space="preserve"> </w:t>
-      </w:r>
-      <w:r>
-        <w:t xml:space="preserve">at or above one on the interaction-carrying segments (Algorithm 1, step 6). The three public datasets are positioned accordingly: Taobao is the in-vertical evidence where all conditions hold, Avazu is the churn boundary where a daily plan fails until the cadence shrinks, and Outbrain is the contention boundary where an uncontended market yields little until demand is stressed. The two boundaries are not failed replications; they are the edges that make the deployment claim falsifiable.</w:t>
-      </w:r>
-    </w:p>
-    <w:p>
-      <w:pPr>
-        <w:pStyle w:val="BodyText"/>
-      </w:pPr>
-      <w:r>
-        <w:t xml:space="preserve">The architecture optimizes expected revenue for a known campaign portfolio over a planning horizon; it does not address auction-based pricing, real-time bidding against external demand, or creative selection within a campaign. Its guarantees rest on the stability assumptions of Section 8.1: allocation quality degrades in proportion to how far future traffic and response distributions drift from the modeled ones between refinement cycles, which sets the practical requirement for how frequently the offline stage must re-run. Exposure policy enforcement is per-subscriber and rule-based; richer fatigue models would slot into step 2 without changing the surrounding machinery. Finally, window-fitted planning presumes a campaign portfolio stable over the planning horizon, which is the operator’s contracted-campaign setting; in marketplaces where the ad portfolio and its delivery mix turn over within a day, the re-planning interval must shrink to the churn timescale for the plan to retain value.</w:t>
-      </w:r>
-    </w:p>
     <w:bookmarkEnd w:id="61"/>
-    <w:bookmarkStart w:id="62" w:name="references"/>
+    <w:bookmarkEnd w:id="62"/>
+    <w:bookmarkStart w:id="63" w:name="references"/>
     <w:p>
       <w:pPr>
         <w:pStyle w:val="Heading2"/>
@@ -8120,7 +8146,7 @@
         <w:t xml:space="preserve">Preprint, August 2026. Code and replay harness: github.com/ApartsinProjects/optimal-impression-allocation.</w:t>
       </w:r>
     </w:p>
-    <w:bookmarkEnd w:id="62"/>
+    <w:bookmarkEnd w:id="63"/>
     <w:sectPr/>
   </w:body>
 </w:document>

</xml_diff>

<commit_message>
Add related-work positioning table; trim redundant re-solve restatement in Section 6
- New table opening Section 9: five dimensions where the contribution sits (prescribes segmentation, pre-committed blind test, public-log hardened OPE, regime map, revenue with guarantees); This paper is the only fully-checked row, sharing the revenue/guarantees column with the guaranteed-delivery line
- Consolidated the 're-solve is the only universal price source' point (was stated 4x in Section 6) into the deployment rule

Co-Authored-By: Claude Opus 4.8 <noreply@anthropic.com>
</commit_message>
<xml_diff>
--- a/paper.docx
+++ b/paper.docx
@@ -3905,7 +3905,7 @@
         <w:pStyle w:val="BodyText"/>
       </w:pPr>
       <w:r>
-        <w:t xml:space="preserve">At exact feasibility all seven policies cluster within a point; most of the value is the forecast itself, which each consumes. Under contention they separate, and the separation is a spectrum set by how the prices are obtained (Figure 2). Adaptation degrades with the update rule: the scalar controller weakens first (+0.7% at 110% quotas, −6.9% at 150%), Euclidean mirror descent holds to 110% then falls (−4.8% at 150%), and even the strongest adaptive method, entropic mirror descent, tracks the re-solved plan through 125% over-subscription (+3.06% versus +3.39%) before turning slightly negative at 150% (−0.5%). The policies that obtain prices by solving rather than learning them online, the static plan, the re-solved plan, and the fixed optimal dual, are the ones that stay non-negative across the range; the re-solved plan holds the largest margin under contention (+2.2% to +4.3%), while the static plan’s edge narrows to within noise at the heaviest over-subscription (+0.28% at 150%). The semi-synthetic benchmark of Section 4.1 bounds what this table can resolve: gaps at or below roughly 0.3 points, the feasibility row where every policy clusters and the re-solve-versus-entropic-DMD cell at 125%, are within the protocol’s resolution and are not read here as an ordering; the collapses that carry the argument, 3 to 45 points, are far outside it. Two conclusions follow, each carefully scoped. First, the failure under heavy over-subscription is shared by every adaptive dual-price method we test, modern mirror descent included, not an artifact of a weak controller; a well-chosen adaptive method (entropic DMD) is nonetheless competitive through moderate contention, so the claim is about the heavy-contention regime, not adaptation in general. Second, the fixed optimal dual’s survival under this objective shows per-campaign pricing itself is not the problem, as linear-programming duality predicts: a static optimal price vector can carry the allocation. What fails as contention grows is learning that vector online. This second conclusion is the more fragile of the two: the revenue objective below will show the one-shot optimal dual is not universally robust, since a price vector solved once against the fluid plan can misprice campaigns when the realized arrival order departs from it. The claim that survives every objective and every dataset we test is therefore narrower and sharper than “fixed prices work”: prices should be</w:t>
+        <w:t xml:space="preserve">At exact feasibility all seven policies cluster within a point; most of the value is the forecast itself, which each consumes. Under contention they separate, and the separation is a spectrum set by how the prices are obtained (Figure 2). Adaptation degrades with the update rule: the scalar controller weakens first (+0.7% at 110% quotas, −6.9% at 150%), Euclidean mirror descent holds to 110% then falls (−4.8% at 150%), and even the strongest adaptive method, entropic mirror descent, tracks the re-solved plan through 125% over-subscription (+3.06% versus +3.39%) before turning slightly negative at 150% (−0.5%). The policies that obtain prices by solving rather than learning them online, the static plan, the re-solved plan, and the fixed optimal dual, are the ones that stay non-negative across the range; the re-solved plan holds the largest margin under contention (+2.2% to +4.3%), while the static plan’s edge narrows to within noise at the heaviest over-subscription (+0.28% at 150%). The semi-synthetic benchmark of Section 4.1 bounds what this table can resolve: gaps at or below roughly 0.3 points, the feasibility row where every policy clusters and the re-solve-versus-entropic-DMD cell at 125%, are within the protocol’s resolution and are not read here as an ordering; the collapses that carry the argument, 3 to 45 points, are far outside it. Two conclusions follow, each carefully scoped. First, the failure under heavy over-subscription is shared by every adaptive dual-price method we test, modern mirror descent included, not an artifact of a weak controller; a well-chosen adaptive method (entropic DMD) is nonetheless competitive through moderate contention, so the claim is about the heavy-contention regime, not adaptation in general. Second, the fixed optimal dual’s survival under this objective shows per-campaign pricing itself is not the problem, as linear-programming duality predicts: a static optimal price vector can carry the allocation. What fails as contention grows is learning that vector online. This second conclusion is the more fragile of the two: the revenue objective below shows the one-shot optimal dual is not universally robust, since a price vector solved once against the fluid plan can misprice campaigns when the realized arrival order departs from it. The sharper claim, that prices should be</w:t>
       </w:r>
       <w:r>
         <w:t xml:space="preserve"> </w:t>
@@ -3918,7 +3918,10 @@
         <w:t xml:space="preserve">obtained by solving</w:t>
       </w:r>
       <w:r>
-        <w:t xml:space="preserve">, and re-solving on the pacing cadence is the only price source that is positive in every regime, objective, and market we measure.</w:t>
+        <w:t xml:space="preserve"> </w:t>
+      </w:r>
+      <w:r>
+        <w:t xml:space="preserve">and re-solved on the pacing cadence, is stated as the deployment rule below.</w:t>
       </w:r>
     </w:p>
     <w:p>
@@ -4809,6 +4812,599 @@
     <w:p>
       <w:pPr>
         <w:pStyle w:val="FirstParagraph"/>
+      </w:pPr>
+      <w:r>
+        <w:t xml:space="preserve">The allocation machinery this paper uses, a transportation LP with dual-price pacing, is standard; its contribution sits in five places that the prior literature leaves open, summarized in the table before the discussion.</w:t>
+      </w:r>
+    </w:p>
+    <w:tbl>
+      <w:tblPr>
+        <w:tblStyle w:val="Table"/>
+        <w:tblW w:type="pct" w:w="5000"/>
+        <w:tblLayout w:type="fixed"/>
+        <w:tblLook w:firstRow="1" w:lastRow="0" w:firstColumn="0" w:lastColumn="0" w:noHBand="0" w:noVBand="0" w:val="0020"/>
+      </w:tblPr>
+      <w:tblGrid>
+        <w:gridCol w:w="1320"/>
+        <w:gridCol w:w="1320"/>
+        <w:gridCol w:w="1320"/>
+        <w:gridCol w:w="1320"/>
+        <w:gridCol w:w="1320"/>
+        <w:gridCol w:w="1320"/>
+      </w:tblGrid>
+      <w:tr>
+        <w:trPr>
+          <w:tblHeader w:val="on"/>
+        </w:trPr>
+        <w:tc>
+          <w:tcPr/>
+          <w:p>
+            <w:pPr>
+              <w:pStyle w:val="Compact"/>
+              <w:jc w:val="left"/>
+            </w:pPr>
+            <w:r>
+              <w:t xml:space="preserve">Line of work</w:t>
+            </w:r>
+          </w:p>
+        </w:tc>
+        <w:tc>
+          <w:tcPr/>
+          <w:p>
+            <w:pPr>
+              <w:pStyle w:val="Compact"/>
+              <w:jc w:val="left"/>
+            </w:pPr>
+            <w:r>
+              <w:t xml:space="preserve">Prescribes the</w:t>
+            </w:r>
+            <w:r>
+              <w:br/>
+            </w:r>
+            <w:r>
+              <w:t xml:space="preserve">segmentation</w:t>
+            </w:r>
+          </w:p>
+        </w:tc>
+        <w:tc>
+          <w:tcPr/>
+          <w:p>
+            <w:pPr>
+              <w:pStyle w:val="Compact"/>
+              <w:jc w:val="left"/>
+            </w:pPr>
+            <w:r>
+              <w:t xml:space="preserve">Pre-committed,</w:t>
+            </w:r>
+            <w:r>
+              <w:br/>
+            </w:r>
+            <w:r>
+              <w:t xml:space="preserve">blind test</w:t>
+            </w:r>
+          </w:p>
+        </w:tc>
+        <w:tc>
+          <w:tcPr/>
+          <w:p>
+            <w:pPr>
+              <w:pStyle w:val="Compact"/>
+              <w:jc w:val="left"/>
+            </w:pPr>
+            <w:r>
+              <w:t xml:space="preserve">Public-log,</w:t>
+            </w:r>
+            <w:r>
+              <w:br/>
+            </w:r>
+            <w:r>
+              <w:t xml:space="preserve">hardened OPE</w:t>
+            </w:r>
+          </w:p>
+        </w:tc>
+        <w:tc>
+          <w:tcPr/>
+          <w:p>
+            <w:pPr>
+              <w:pStyle w:val="Compact"/>
+              <w:jc w:val="left"/>
+            </w:pPr>
+            <w:r>
+              <w:t xml:space="preserve">Regime map</w:t>
+            </w:r>
+            <w:r>
+              <w:br/>
+            </w:r>
+            <w:r>
+              <w:t xml:space="preserve">(plan vs. adapt)</w:t>
+            </w:r>
+          </w:p>
+        </w:tc>
+        <w:tc>
+          <w:tcPr/>
+          <w:p>
+            <w:pPr>
+              <w:pStyle w:val="Compact"/>
+              <w:jc w:val="left"/>
+            </w:pPr>
+            <w:r>
+              <w:t xml:space="preserve">Revenue with</w:t>
+            </w:r>
+            <w:r>
+              <w:br/>
+            </w:r>
+            <w:r>
+              <w:t xml:space="preserve">guarantees</w:t>
+            </w:r>
+          </w:p>
+        </w:tc>
+      </w:tr>
+      <w:tr>
+        <w:tc>
+          <w:tcPr/>
+          <w:p>
+            <w:pPr>
+              <w:pStyle w:val="Compact"/>
+              <w:jc w:val="left"/>
+            </w:pPr>
+            <w:r>
+              <w:t xml:space="preserve">Online matching, AdWords [6, 7]</w:t>
+            </w:r>
+          </w:p>
+        </w:tc>
+        <w:tc>
+          <w:tcPr/>
+          <w:p>
+            <w:pPr>
+              <w:pStyle w:val="Compact"/>
+            </w:pPr>
+          </w:p>
+        </w:tc>
+        <w:tc>
+          <w:tcPr/>
+          <w:p>
+            <w:pPr>
+              <w:pStyle w:val="Compact"/>
+            </w:pPr>
+          </w:p>
+        </w:tc>
+        <w:tc>
+          <w:tcPr/>
+          <w:p>
+            <w:pPr>
+              <w:pStyle w:val="Compact"/>
+            </w:pPr>
+          </w:p>
+        </w:tc>
+        <w:tc>
+          <w:tcPr/>
+          <w:p>
+            <w:pPr>
+              <w:pStyle w:val="Compact"/>
+            </w:pPr>
+          </w:p>
+        </w:tc>
+        <w:tc>
+          <w:tcPr/>
+          <w:p>
+            <w:pPr>
+              <w:pStyle w:val="Compact"/>
+            </w:pPr>
+          </w:p>
+        </w:tc>
+      </w:tr>
+      <w:tr>
+        <w:tc>
+          <w:tcPr/>
+          <w:p>
+            <w:pPr>
+              <w:pStyle w:val="Compact"/>
+              <w:jc w:val="left"/>
+            </w:pPr>
+            <w:r>
+              <w:t xml:space="preserve">Random-permutation online LP [8–10]</w:t>
+            </w:r>
+          </w:p>
+        </w:tc>
+        <w:tc>
+          <w:tcPr/>
+          <w:p>
+            <w:pPr>
+              <w:pStyle w:val="Compact"/>
+            </w:pPr>
+          </w:p>
+        </w:tc>
+        <w:tc>
+          <w:tcPr/>
+          <w:p>
+            <w:pPr>
+              <w:pStyle w:val="Compact"/>
+            </w:pPr>
+          </w:p>
+        </w:tc>
+        <w:tc>
+          <w:tcPr/>
+          <w:p>
+            <w:pPr>
+              <w:pStyle w:val="Compact"/>
+              <w:jc w:val="left"/>
+            </w:pPr>
+            <w:r>
+              <w:t xml:space="preserve">~</w:t>
+            </w:r>
+          </w:p>
+        </w:tc>
+        <w:tc>
+          <w:tcPr/>
+          <w:p>
+            <w:pPr>
+              <w:pStyle w:val="Compact"/>
+            </w:pPr>
+          </w:p>
+        </w:tc>
+        <w:tc>
+          <w:tcPr/>
+          <w:p>
+            <w:pPr>
+              <w:pStyle w:val="Compact"/>
+              <w:jc w:val="left"/>
+            </w:pPr>
+            <w:r>
+              <w:t xml:space="preserve">~</w:t>
+            </w:r>
+          </w:p>
+        </w:tc>
+      </w:tr>
+      <w:tr>
+        <w:tc>
+          <w:tcPr/>
+          <w:p>
+            <w:pPr>
+              <w:pStyle w:val="Compact"/>
+              <w:jc w:val="left"/>
+            </w:pPr>
+            <w:r>
+              <w:t xml:space="preserve">Guaranteed display: forecasts, SHALE [11, 12]</w:t>
+            </w:r>
+          </w:p>
+        </w:tc>
+        <w:tc>
+          <w:tcPr/>
+          <w:p>
+            <w:pPr>
+              <w:pStyle w:val="Compact"/>
+            </w:pPr>
+          </w:p>
+        </w:tc>
+        <w:tc>
+          <w:tcPr/>
+          <w:p>
+            <w:pPr>
+              <w:pStyle w:val="Compact"/>
+            </w:pPr>
+          </w:p>
+        </w:tc>
+        <w:tc>
+          <w:tcPr/>
+          <w:p>
+            <w:pPr>
+              <w:pStyle w:val="Compact"/>
+            </w:pPr>
+          </w:p>
+        </w:tc>
+        <w:tc>
+          <w:tcPr/>
+          <w:p>
+            <w:pPr>
+              <w:pStyle w:val="Compact"/>
+            </w:pPr>
+          </w:p>
+        </w:tc>
+        <w:tc>
+          <w:tcPr/>
+          <w:p>
+            <w:pPr>
+              <w:pStyle w:val="Compact"/>
+              <w:jc w:val="left"/>
+            </w:pPr>
+            <w:r>
+              <w:t xml:space="preserve">✓</w:t>
+            </w:r>
+          </w:p>
+        </w:tc>
+      </w:tr>
+      <w:tr>
+        <w:tc>
+          <w:tcPr/>
+          <w:p>
+            <w:pPr>
+              <w:pStyle w:val="Compact"/>
+              <w:jc w:val="left"/>
+            </w:pPr>
+            <w:r>
+              <w:t xml:space="preserve">Dual mirror descent [21]</w:t>
+            </w:r>
+          </w:p>
+        </w:tc>
+        <w:tc>
+          <w:tcPr/>
+          <w:p>
+            <w:pPr>
+              <w:pStyle w:val="Compact"/>
+            </w:pPr>
+          </w:p>
+        </w:tc>
+        <w:tc>
+          <w:tcPr/>
+          <w:p>
+            <w:pPr>
+              <w:pStyle w:val="Compact"/>
+            </w:pPr>
+          </w:p>
+        </w:tc>
+        <w:tc>
+          <w:tcPr/>
+          <w:p>
+            <w:pPr>
+              <w:pStyle w:val="Compact"/>
+            </w:pPr>
+          </w:p>
+        </w:tc>
+        <w:tc>
+          <w:tcPr/>
+          <w:p>
+            <w:pPr>
+              <w:pStyle w:val="Compact"/>
+              <w:jc w:val="left"/>
+            </w:pPr>
+            <w:r>
+              <w:t xml:space="preserve">~</w:t>
+            </w:r>
+          </w:p>
+        </w:tc>
+        <w:tc>
+          <w:tcPr/>
+          <w:p>
+            <w:pPr>
+              <w:pStyle w:val="Compact"/>
+              <w:jc w:val="left"/>
+            </w:pPr>
+            <w:r>
+              <w:t xml:space="preserve">✓</w:t>
+            </w:r>
+          </w:p>
+        </w:tc>
+      </w:tr>
+      <w:tr>
+        <w:tc>
+          <w:tcPr/>
+          <w:p>
+            <w:pPr>
+              <w:pStyle w:val="Compact"/>
+              <w:jc w:val="left"/>
+            </w:pPr>
+            <w:r>
+              <w:t xml:space="preserve">Yield optimization, ad exchange [22]</w:t>
+            </w:r>
+          </w:p>
+        </w:tc>
+        <w:tc>
+          <w:tcPr/>
+          <w:p>
+            <w:pPr>
+              <w:pStyle w:val="Compact"/>
+            </w:pPr>
+          </w:p>
+        </w:tc>
+        <w:tc>
+          <w:tcPr/>
+          <w:p>
+            <w:pPr>
+              <w:pStyle w:val="Compact"/>
+            </w:pPr>
+          </w:p>
+        </w:tc>
+        <w:tc>
+          <w:tcPr/>
+          <w:p>
+            <w:pPr>
+              <w:pStyle w:val="Compact"/>
+            </w:pPr>
+          </w:p>
+        </w:tc>
+        <w:tc>
+          <w:tcPr/>
+          <w:p>
+            <w:pPr>
+              <w:pStyle w:val="Compact"/>
+            </w:pPr>
+          </w:p>
+        </w:tc>
+        <w:tc>
+          <w:tcPr/>
+          <w:p>
+            <w:pPr>
+              <w:pStyle w:val="Compact"/>
+              <w:jc w:val="left"/>
+            </w:pPr>
+            <w:r>
+              <w:t xml:space="preserve">✓</w:t>
+            </w:r>
+          </w:p>
+        </w:tc>
+      </w:tr>
+      <w:tr>
+        <w:tc>
+          <w:tcPr/>
+          <w:p>
+            <w:pPr>
+              <w:pStyle w:val="Compact"/>
+              <w:jc w:val="left"/>
+            </w:pPr>
+            <w:r>
+              <w:t xml:space="preserve">Budget-pacing controllers [13, 14]</w:t>
+            </w:r>
+          </w:p>
+        </w:tc>
+        <w:tc>
+          <w:tcPr/>
+          <w:p>
+            <w:pPr>
+              <w:pStyle w:val="Compact"/>
+            </w:pPr>
+          </w:p>
+        </w:tc>
+        <w:tc>
+          <w:tcPr/>
+          <w:p>
+            <w:pPr>
+              <w:pStyle w:val="Compact"/>
+            </w:pPr>
+          </w:p>
+        </w:tc>
+        <w:tc>
+          <w:tcPr/>
+          <w:p>
+            <w:pPr>
+              <w:pStyle w:val="Compact"/>
+              <w:jc w:val="left"/>
+            </w:pPr>
+            <w:r>
+              <w:t xml:space="preserve">~</w:t>
+            </w:r>
+          </w:p>
+        </w:tc>
+        <w:tc>
+          <w:tcPr/>
+          <w:p>
+            <w:pPr>
+              <w:pStyle w:val="Compact"/>
+            </w:pPr>
+          </w:p>
+        </w:tc>
+        <w:tc>
+          <w:tcPr/>
+          <w:p>
+            <w:pPr>
+              <w:pStyle w:val="Compact"/>
+              <w:jc w:val="left"/>
+            </w:pPr>
+            <w:r>
+              <w:t xml:space="preserve">✓</w:t>
+            </w:r>
+          </w:p>
+        </w:tc>
+      </w:tr>
+      <w:tr>
+        <w:tc>
+          <w:tcPr/>
+          <w:p>
+            <w:pPr>
+              <w:pStyle w:val="Compact"/>
+              <w:jc w:val="left"/>
+            </w:pPr>
+            <w:r>
+              <w:rPr>
+                <w:b/>
+                <w:bCs/>
+              </w:rPr>
+              <w:t xml:space="preserve">This paper</w:t>
+            </w:r>
+          </w:p>
+        </w:tc>
+        <w:tc>
+          <w:tcPr/>
+          <w:p>
+            <w:pPr>
+              <w:pStyle w:val="Compact"/>
+              <w:jc w:val="left"/>
+            </w:pPr>
+            <w:r>
+              <w:rPr>
+                <w:b/>
+                <w:bCs/>
+              </w:rPr>
+              <w:t xml:space="preserve">✓</w:t>
+            </w:r>
+          </w:p>
+        </w:tc>
+        <w:tc>
+          <w:tcPr/>
+          <w:p>
+            <w:pPr>
+              <w:pStyle w:val="Compact"/>
+              <w:jc w:val="left"/>
+            </w:pPr>
+            <w:r>
+              <w:rPr>
+                <w:b/>
+                <w:bCs/>
+              </w:rPr>
+              <w:t xml:space="preserve">✓</w:t>
+            </w:r>
+          </w:p>
+        </w:tc>
+        <w:tc>
+          <w:tcPr/>
+          <w:p>
+            <w:pPr>
+              <w:pStyle w:val="Compact"/>
+              <w:jc w:val="left"/>
+            </w:pPr>
+            <w:r>
+              <w:rPr>
+                <w:b/>
+                <w:bCs/>
+              </w:rPr>
+              <w:t xml:space="preserve">✓</w:t>
+            </w:r>
+          </w:p>
+        </w:tc>
+        <w:tc>
+          <w:tcPr/>
+          <w:p>
+            <w:pPr>
+              <w:pStyle w:val="Compact"/>
+              <w:jc w:val="left"/>
+            </w:pPr>
+            <w:r>
+              <w:rPr>
+                <w:b/>
+                <w:bCs/>
+              </w:rPr>
+              <w:t xml:space="preserve">✓</w:t>
+            </w:r>
+          </w:p>
+        </w:tc>
+        <w:tc>
+          <w:tcPr/>
+          <w:p>
+            <w:pPr>
+              <w:pStyle w:val="Compact"/>
+              <w:jc w:val="left"/>
+            </w:pPr>
+            <w:r>
+              <w:rPr>
+                <w:b/>
+                <w:bCs/>
+              </w:rPr>
+              <w:t xml:space="preserve">✓</w:t>
+            </w:r>
+          </w:p>
+        </w:tc>
+      </w:tr>
+    </w:tbl>
+    <w:p>
+      <w:pPr>
+        <w:pStyle w:val="BodyText"/>
+      </w:pPr>
+      <w:r>
+        <w:t xml:space="preserve">✓ addresses the question, ~ partially, blank not addressed. The prior lines take the audience segmentation as given, evaluate on theory or private production data, and do not characterize when a compiled plan beats online adaptation; the guaranteed-delivery and pacing lines share this paper’s revenue-with-penalties objective but not its segmentation rule or its public evaluation. The paragraphs below detail each line.</w:t>
+      </w:r>
+    </w:p>
+    <w:p>
+      <w:pPr>
+        <w:pStyle w:val="BodyText"/>
       </w:pPr>
       <w:r>
         <w:rPr>

</xml_diff>

<commit_message>
Writing pass (Fable): readable front matter, clearer value proposition, confident tone
- Abstract: problem before structure; jargon (interaction, double-centered, winner's curse, dual-model scoring) glossed in-line; three-step operator rule surfaced in paragraph 1; 80-word sentence split
- Subtitle: verb-shaped and plain ('...When Planning Beats Online Pacing in Quota-Constrained Ad Allocation')
- Intro: value proposition names the audience; contributions de-clotted
- Arc bridges added to Sections 2, 7, 10 so each opens on the spine
- Tone: removed the 'not X but Y' defensive phrasing throughout Sections 4, 6, 11 (state what the work is, not what it is not)

Co-Authored-By: Claude Opus 4.8 <noreply@anthropic.com>
</commit_message>
<xml_diff>
--- a/paper.docx
+++ b/paper.docx
@@ -24,7 +24,7 @@
         <w:pStyle w:val="FirstParagraph"/>
       </w:pPr>
       <w:r>
-        <w:t xml:space="preserve">Planning, Pacing, and a Contention Regime Map for Quota-Constrained Impression Allocation over Fine Audience Segments.</w:t>
+        <w:t xml:space="preserve">A Segmentation Rule and a Regime Map for When Planning Beats Online Pacing in Quota-Constrained Ad Allocation</w:t>
       </w:r>
     </w:p>
     <w:p>
@@ -91,7 +91,7 @@
         <w:pStyle w:val="FirstParagraph"/>
       </w:pPr>
       <w:r>
-        <w:t xml:space="preserve">Under fixed campaign quotas, impression allocation can exploit exactly one statistical object: campaign-by-segment interaction in click-through rate that persists across planning windows. Main effects are neutralized: campaign effects by the quotas, segment effects by supply. We give a pre-committable rule for choosing the segmentation an allocator should use: measure the persistence of double-centered interaction residuals across adjacent planning windows, segment only on the axes that persist, and set granularity in proportion to per-cell data density. On 26.6M impressions of the Taobao display-advertising log, we compute the rule from planning-window data alone, without reference to replay outcomes. It selects the configuration whose replay results match the full ablation ordering: activity tiers pay, demographics and time do not, and finer granularity pays only while cells stay dense. On Avazu the rule ranks axes consistently, and the boundary where a daily plan fails confirms the re-planning timescale it implies. A pre-registered application to a third log (Outbrain), with the configuration frozen before replay, transfers the rule’s persistence ranking and marks its scope: persistence identifies exploitable axes, but contention governs the realized lift. An uncontended market yields little to allocate, whatever the segmentation.</w:t>
+        <w:t xml:space="preserve">Platforms that sell guaranteed impression quotas must decide which audience segments each campaign’s impressions go to. Under fixed quotas, exactly one statistical quantity can make one allocation better than another: the part of click-through rate specific to the campaign-segment pairing (the interaction), and only where it persists from the planning window into the serving window. Average campaign performance is pinned by the quotas and average segment performance by supply, so neither can change an allocation’s value. We give a pre-committable rule for choosing the segmentation an allocator should use: on each candidate axis, remove campaign and segment averages from the cell-level click rates, correlate the remaining pairing-specific residuals across adjacent planning windows, segment only on the axes where they persist, and set granularity in proportion to per-cell data density. On 26.6M impressions of the Taobao display-advertising log, we compute the rule from planning-window data alone, without reference to replay outcomes. It selects the configuration whose replay results match the full ablation ordering: activity tiers pay, demographics and time do not, and finer granularity pays only while cells stay dense. On Avazu the rule ranks axes consistently, and the boundary where a daily plan fails confirms the re-planning timescale it implies. A pre-registered application to a third log (Outbrain), with the configuration frozen before replay, transfers the rule’s persistence ranking and marks its scope: persistence identifies exploitable axes, but contention governs the realized lift. An uncontended market yields little to allocate, whatever the segmentation. The operational rule is three steps, all computable before serving: segment on the axes whose interaction persists, measure contention to decide whether allocation is worth doing, and obtain pacing prices by solving and re-solving the plan.</w:t>
       </w:r>
     </w:p>
     <w:p>
@@ -99,7 +99,7 @@
         <w:pStyle w:val="BodyText"/>
       </w:pPr>
       <w:r>
-        <w:t xml:space="preserve">Evaluation uses a replay protocol hardened against a trap we document: single-model replay inflates lift through a winner’s curse. Dual-model scoring, an exact uniform-null control, support and fatigue audits, and user-clustered inference (headline z = 4.55) delimit what public logs can show, and a semi-synthetic benchmark with a known ground truth confirms the protocol recovers the true policy ranking and the true best policy, even under an adversarial logging policy that selects on the outcome. The protocol yields a regime map. At exact feasibility, plan-informed policies beat greedy serving by 3.5–4.5% expected clicks, and information-matched, feasibility-aware dual-price pacing nearly matches them. Under over-subscription (quotas at 110–150% of supply), online price learning degrades along a spectrum: a scalar controller fails first, and even dual mirror descent, the state-of-the-art adaptive method, tracks the plan through moderate contention but falls below greedy under heavy over-subscription. The periodically re-solved plan dominates every contended regime (+2.2 to +4.3% over greedy, z ≥ 3.4) and is the one price source positive across every contention level, dataset, and objective we test: a fixed dual pinned once at the LP optimum survives the click objective, but under a revenue objective with heterogeneous per-click and per-impression values and delivery penalties it turns negative under contention, so the durable prescription is to obtain prices by solving and re-solving, not by learning them online. The ordering reproduces on a second dataset (Outbrain, 87M impressions), where online pacing deepens to −44%, and the whole regime map transfers to the revenue objective, where the plan tier’s advantage grows as delivery guarantees harden. Grounding the gains in realized outcomes is inconclusive on the small logging-matched subset, an inherent limit of public-log evaluation.</w:t>
+        <w:t xml:space="preserve">Evaluation uses a replay protocol hardened against a trap we document: when one estimated click table both builds the plan and scores it, the plan harvests the table’s own estimation noise and the measured lift is inflated, a winner’s curse. Scoring every policy under an independent table fitted on the serving window, an exact uniform-null control, support and fatigue audits, and user-clustered inference (headline z = 4.55) delimit what public logs can show, and a semi-synthetic benchmark with a known ground truth confirms the protocol recovers the true policy ranking and the true best policy, even under an adversarial logging policy that selects on the outcome. The protocol yields a regime map. At exact feasibility, plan-informed policies beat greedy serving by 3.5–4.5% expected clicks, and information-matched, feasibility-aware dual-price pacing nearly matches them. Under over-subscription (quotas at 110–150% of supply), online price learning degrades along a spectrum: a scalar controller fails first, and even dual mirror descent, the state-of-the-art adaptive method, tracks the plan through moderate contention but falls below greedy under heavy over-subscription. The periodically re-solved plan dominates every contended regime (+2.2 to +4.3% over greedy, z ≥ 3.4) and is the one price source positive across every contention level, dataset, and objective we test. A price vector solved once at the LP optimum survives the click objective but turns negative under contention when the objective is revenue with heterogeneous per-click and per-impression values and delivery penalties. The durable prescription is therefore to obtain prices by solving and re-solving the plan, not by learning them online. The ordering reproduces on a second dataset (Outbrain, 87M impressions), where online pacing deepens to −44%, and the whole regime map transfers to the revenue objective, where the plan tier’s advantage grows as delivery guarantees harden. Grounding the gains in realized outcomes is inconclusive on the small logging-matched subset, an inherent limit of public-log evaluation.</w:t>
       </w:r>
     </w:p>
     <w:bookmarkEnd w:id="21"/>
@@ -144,7 +144,7 @@
         <w:pStyle w:val="BodyText"/>
       </w:pPr>
       <w:r>
-        <w:t xml:space="preserve">On the open web this failure is blunted by coarseness: broad audiences are interchangeable audiences, so the opportunity cost of a greedy choice is small. Operator-owned advertising markets invert that condition. A platform that owns logged-in, first-party identity, a mobile operator, or, in its largest contemporary form, a retail-media network selling onsite display against its own commerce data, supports far finer segmentation, and fine segmentation is precisely what advertisers pay it for: not “males 18–49” but heavy category buyers on related content in the promotional window. Its campaigns are sold direct as guaranteed impression quotas with makegood penalties, and it controls the whole serving stack, with no auction standing between the plan and the impression. That class of market, whose originating instance is the mobile-operator system of Section 8 and whose largest current one is retail media, is where this study applies; the public commerce-media log we evaluate on (Taobao) is drawn from inside it, not a distant analog.</w:t>
+        <w:t xml:space="preserve">On the open web this failure is blunted by coarseness: broad audiences are interchangeable audiences, so the opportunity cost of a greedy choice is small. Operator-owned advertising markets invert that condition. A platform that owns logged-in, first-party identity, a mobile operator, or, in its largest contemporary form, a retail-media network selling onsite display against its own commerce data, supports far finer segmentation, and fine segmentation is precisely what advertisers pay it for: not “males 18–49” but heavy category buyers on related content in the promotional window. Its campaigns are sold direct as guaranteed impression quotas with makegood penalties, and it controls the whole serving stack, with no auction standing between the plan and the impression. This study applies to that class of market. Its originating instance is the mobile-operator system of Section 8, its largest current instance is retail media, and the public commerce-media log we evaluate on (Taobao) comes from inside it.</w:t>
       </w:r>
     </w:p>
     <w:p>
@@ -189,7 +189,7 @@
         <w:t xml:space="preserve"> </w:t>
       </w:r>
       <w:r>
-        <w:t xml:space="preserve">and makes three contributions, each validated on public advertising logs. First, a pre-committable segmentation rule: measure the persistence of campaign-by-segment interaction residuals across adjacent planning windows, segment only on the axes that persist, and scale granularity to per-cell data density. Second, a replay evaluation protocol for allocation policies, hardened against the winner’s curse and selection artifacts that we show inflate naive replay. Third, a regime map locating where planning pays: plan-informed policies lead at exact feasibility and dominate outright under over-subscription, where online dual-price learning collapses while solving for the prices does not, a result that holds on a second dataset and under a revenue objective with delivery guarantees.</w:t>
+        <w:t xml:space="preserve">and makes three contributions, each validated on public advertising logs. First, a pre-committable segmentation rule: measure the persistence of campaign-by-segment interaction residuals across adjacent planning windows, segment only on the axes that persist, and scale granularity to per-cell data density. Second, a replay evaluation protocol for allocation policies, hardened against the winner’s curse and selection artifacts that we show inflate naive replay. Third, a regime map locating where planning pays: plan-informed policies lead at exact feasibility and dominate outright under over-subscription, where online dual-price learning collapses and solving for the prices does not. The map holds on a second dataset and under a revenue objective with delivery guarantees.</w:t>
       </w:r>
     </w:p>
     <w:p>
@@ -197,7 +197,7 @@
         <w:pStyle w:val="BodyText"/>
       </w:pPr>
       <w:r>
-        <w:t xml:space="preserve">Together these compose a three-step rule an operator’s planning team can act on directly.</w:t>
+        <w:t xml:space="preserve">Together these compose a three-step rule that the planning team of any retail-media network or operator-owned platform can act on directly.</w:t>
       </w:r>
       <w:r>
         <w:t xml:space="preserve"> </w:t>
@@ -274,7 +274,7 @@
         <w:pStyle w:val="FirstParagraph"/>
       </w:pPr>
       <w:r>
-        <w:t xml:space="preserve">Consider the smallest interesting instance. Two campaigns run at the same time: a soft drink and a sports car. Each has bought exactly</w:t>
+        <w:t xml:space="preserve">Consider the smallest instance in which greedy serving and planned allocation come apart. Two campaigns run at the same time: a soft drink and a sports car. Each has bought exactly</w:t>
       </w:r>
       <w:r>
         <w:t xml:space="preserve"> </w:t>
@@ -2023,7 +2023,7 @@
         <w:t xml:space="preserve">c</w:t>
       </w:r>
       <w:r>
-        <w:t xml:space="preserve"> − t/T) after each impression with η set to half the global click rate; it consults no plan. Reported errors are the scoring table’s closed-form binomial variance propagated through each comparison’s assignment difference; the across-fold spread of the five per-fold lifts independently reproduces the same standard error, and the all-folds-positive sign pattern supports the parametric statement distribution-free. The uniform control defends the harness; a further check defends the scorer itself: standardizing the scoring table along the strongest observable within-cell covariate the segmentation does not use (each user’s own training-window click propensity) shifts the headline lifts by at most +0.3pp, upward, so observable within-cell selection in the logged exposures does not account for the measured gains. Support is also measured directly: only 6% of the planned policy’s assignment mass (and 5% of the re-paired mass) lands in cells with fewer than 100 logged serving-window impressions, and scoring those thin cells with a pooled campaign-level fallback moves the headline from +3.46% to +2.99%; the counterfactual does not rest on extrapolated cells. (Forcing the fallback on all cells below 1,000 impressions, 78% of the mass, collapses the lift toward zero, as it must: a campaign-constant scorer deletes the interaction dimension, and under fixed quotas every assignment then scores equally, the same argument as the uniform control.) The replay isolates the architecture’s allocation core, plan against serving policy at segment granularity: every campaign is eligible on every segment, and the per-subscriber serving components of Appendix A.2 (soft-membership blending, frequency caps, threshold pacing) operate below this granularity and are not exercised by these experiments.</w:t>
+        <w:t xml:space="preserve"> − t/T) after each impression with η set to half the global click rate; it consults no plan. Reported errors are the scoring table’s closed-form binomial variance propagated through each comparison’s assignment difference; the across-fold spread of the five per-fold lifts independently reproduces the same standard error, and the all-folds-positive sign pattern supports the parametric statement distribution-free. The uniform control defends the harness; a further check defends the scorer itself: standardizing the scoring table along the strongest observable within-cell covariate the segmentation does not use (each user’s own training-window click propensity) shifts the headline lifts by at most +0.3pp, upward, so observable within-cell selection in the logged exposures does not account for the measured gains. Support is also measured directly: only 6% of the planned policy’s assignment mass (and 5% of the re-paired mass) lands in cells with fewer than 100 logged serving-window impressions, and scoring those thin cells with a pooled campaign-level fallback moves the headline from +3.46% to +2.99%; the counterfactual rests almost entirely on well-supported cells. (Forcing the fallback on all cells below 1,000 impressions, 78% of the mass, collapses the lift toward zero, as it must: a campaign-constant scorer deletes the interaction dimension, and under fixed quotas every assignment then scores equally, the same argument as the uniform control.) The replay isolates the architecture’s allocation core, plan against serving policy at segment granularity: every campaign is eligible on every segment, and the per-subscriber serving components of Appendix A.2 (soft-membership blending, frequency caps, threshold pacing) operate below this granularity and are not exercised by these experiments.</w:t>
       </w:r>
     </w:p>
     <w:bookmarkStart w:id="29" w:name="X888dfabe7f5ac870af14768d223c176646b6318"/>
@@ -3810,7 +3810,7 @@
         <w:pStyle w:val="BodyText"/>
       </w:pPr>
       <w:r>
-        <w:t xml:space="preserve">The dual-price baselines are given every advantage: their step size is tuned on held-out planning-window traffic, the warm variant is initialized from the plan LP’s own quota shadow prices, and, so the comparison is not rigged by an unreachable target, each paces toward a</w:t>
+        <w:t xml:space="preserve">The dual-price baselines are given every advantage: their step size is tuned on held-out planning-window traffic, the warm variant is initialized from the plan LP’s own quota shadow prices, and each paces toward a</w:t>
       </w:r>
       <w:r>
         <w:t xml:space="preserve"> </w:t>
@@ -3897,7 +3897,7 @@
         <w:t xml:space="preserve"> </w:t>
       </w:r>
       <w:r>
-        <w:t xml:space="preserve">[21] in both Euclidean and entropic geometries, tuned on the planning window, so the comparison is not against a straw controller; the earlier scalar quota-error controller is retained as a practical baseline.</w:t>
+        <w:t xml:space="preserve">[21] in both Euclidean and entropic geometries, tuned on the planning window; the earlier scalar quota-error controller is retained as a practical baseline.</w:t>
       </w:r>
     </w:p>
     <w:p>
@@ -3905,7 +3905,7 @@
         <w:pStyle w:val="BodyText"/>
       </w:pPr>
       <w:r>
-        <w:t xml:space="preserve">At exact feasibility all seven policies cluster within a point; most of the value is the forecast itself, which each consumes. Under contention they separate, and the separation is a spectrum set by how the prices are obtained (Figure 2). Adaptation degrades with the update rule: the scalar controller weakens first (+0.7% at 110% quotas, −6.9% at 150%), Euclidean mirror descent holds to 110% then falls (−4.8% at 150%), and even the strongest adaptive method, entropic mirror descent, tracks the re-solved plan through 125% over-subscription (+3.06% versus +3.39%) before turning slightly negative at 150% (−0.5%). The policies that obtain prices by solving rather than learning them online, the static plan, the re-solved plan, and the fixed optimal dual, are the ones that stay non-negative across the range; the re-solved plan holds the largest margin under contention (+2.2% to +4.3%), while the static plan’s edge narrows to within noise at the heaviest over-subscription (+0.28% at 150%). The semi-synthetic benchmark of Section 4.1 bounds what this table can resolve: gaps at or below roughly 0.3 points, the feasibility row where every policy clusters and the re-solve-versus-entropic-DMD cell at 125%, are within the protocol’s resolution and are not read here as an ordering; the collapses that carry the argument, 3 to 45 points, are far outside it. Two conclusions follow, each carefully scoped. First, the failure under heavy over-subscription is shared by every adaptive dual-price method we test, modern mirror descent included, not an artifact of a weak controller; a well-chosen adaptive method (entropic DMD) is nonetheless competitive through moderate contention, so the claim is about the heavy-contention regime, not adaptation in general. Second, the fixed optimal dual’s survival under this objective shows per-campaign pricing itself is not the problem, as linear-programming duality predicts: a static optimal price vector can carry the allocation. What fails as contention grows is learning that vector online. This second conclusion is the more fragile of the two: the revenue objective below shows the one-shot optimal dual is not universally robust, since a price vector solved once against the fluid plan can misprice campaigns when the realized arrival order departs from it. The sharper claim, that prices should be</w:t>
+        <w:t xml:space="preserve">At exact feasibility all seven policies cluster within a point; most of the value is the forecast itself, which each consumes. Under contention they separate, and the separation is a spectrum set by how the prices are obtained (Figure 2). Adaptation degrades with the update rule: the scalar controller weakens first (+0.7% at 110% quotas, −6.9% at 150%), Euclidean mirror descent holds to 110% then falls (−4.8% at 150%), and even the strongest adaptive method, entropic mirror descent, tracks the re-solved plan through 125% over-subscription (+3.06% versus +3.39%) before turning slightly negative at 150% (−0.5%). The policies that obtain prices by solving rather than learning them online, the static plan, the re-solved plan, and the fixed optimal dual, are the ones that stay non-negative across the range; the re-solved plan holds the largest margin under contention (+2.2% to +4.3%), while the static plan’s edge narrows to within noise at the heaviest over-subscription (+0.28% at 150%). The semi-synthetic benchmark of Section 4.1 bounds what this table can resolve: gaps at or below roughly 0.3 points, the feasibility row where every policy clusters and the re-solve-versus-entropic-DMD cell at 125%, are within the protocol’s resolution and are not read here as an ordering; the collapses that carry the argument, 3 to 45 points, are far outside it. Two conclusions follow. First, the failure under heavy over-subscription is shared by every adaptive dual-price method we test, modern mirror descent included; a well-chosen adaptive method (entropic DMD) is nonetheless competitive through moderate contention, so the claim is about the heavy-contention regime, not adaptation in general. Second, the fixed optimal dual’s survival under this objective shows per-campaign pricing itself is not the problem, as linear-programming duality predicts: a static optimal price vector can carry the allocation. What fails as contention grows is learning that vector online. This second conclusion holds under the click objective: the revenue results below show a one-shot optimal dual mispricing campaigns when the realized arrival order departs from the fluid plan its prices were solved against. The sharper claim, that prices should be</w:t>
       </w:r>
       <w:r>
         <w:t xml:space="preserve"> </w:t>
@@ -3937,23 +3937,7 @@
         <w:pStyle w:val="BodyText"/>
       </w:pPr>
       <w:r>
-        <w:t xml:space="preserve">The regime map reproduces on a second, independent dataset. We repeat the whole protocol on the Outbrain content-recommendation log (87M joined impressions, a slate-click structure unlike Taobao’s display, with the segmentation axis fixed in advance to the most persistent one measured on the planning window, page platform, whose interaction residuals correlate at r = 0.95 across the shared campaign-by-platform cells; the axis has three platform levels, so this is a statement about the stability of campaigns’ platform preferences, not a many-point fit). At native quotas the Outbrain market is barely contended, per-segment supply dwarfs the quotas, so every policy sits within a percentage point of greedy, exactly the low-contention corner of the map. Under the same over-subscription stress, the ordering returns and sharpens: the re-solved plan is the only policy positive at every level (+0.3 to +0.6%), the static plan and the fixed optimal-dual degrade gently, and online scalar pacing collapses far more steeply than on Taobao, to −19%, −34%, and −44% at 1.5×, 2×, and 3× quotas. That online price learning, not per-campaign pricing, is the failure under contention, and that solving for the prices is the robust choice, holds across two datasets from different domains. Two qualifications attach to this second market. The over-subscription sweep is a counterfactual market that Outbrain’s operator never ran: native quotas are barely contended, so the stress levels probe a demand regime absent from the log, and the result is a statement about the mechanism under contention, not about Outbrain’s realized traffic. And the native low contention is itself a</w:t>
-      </w:r>
-      <w:r>
-        <w:t xml:space="preserve"> </w:t>
-      </w:r>
-      <w:r>
-        <w:rPr>
-          <w:i/>
-          <w:iCs/>
-        </w:rPr>
-        <w:t xml:space="preserve">measurable</w:t>
-      </w:r>
-      <w:r>
-        <w:t xml:space="preserve"> </w:t>
-      </w:r>
-      <w:r>
-        <w:t xml:space="preserve">quantity, not a post-hoc excuse: the per-segment supply exceeds the median quota by more than two orders of magnitude, so the abstain-when-uncontended condition is a pre-deployment check (compare quota to segment supply) rather than a judgment made after seeing the lift. The truncated final serving day, whose partial log would understate late-day supply, is excluded throughout.</w:t>
+        <w:t xml:space="preserve">The regime map reproduces on a second, independent dataset. We repeat the whole protocol on the Outbrain content-recommendation log (87M joined impressions, a slate-click structure unlike Taobao’s display, with the segmentation axis fixed in advance to the most persistent one measured on the planning window, page platform, whose interaction residuals correlate at r = 0.95 across the shared campaign-by-platform cells; the axis has three platform levels, so this is a statement about the stability of campaigns’ platform preferences, not a many-point fit). At native quotas the Outbrain market is barely contended, per-segment supply dwarfs the quotas, so every policy sits within a percentage point of greedy, exactly the low-contention corner of the map. Under the same over-subscription stress, the ordering returns and sharpens: the re-solved plan is the only policy positive at every level (+0.3 to +0.6%), the static plan and the fixed optimal-dual degrade gently, and online scalar pacing collapses far more steeply than on Taobao, to −19%, −34%, and −44% at 1.5×, 2×, and 3× quotas. That online price learning, not per-campaign pricing, is the failure under contention, and that solving for the prices is the robust choice, holds across two datasets from different domains. Two qualifications attach to this second market. The over-subscription sweep is a counterfactual market that Outbrain’s operator never ran: native quotas are barely contended, so the stress levels probe a demand regime absent from the log, and the result is a statement about the mechanism under contention, not about Outbrain’s realized traffic. And the native low contention is measurable before deployment: the per-segment supply exceeds the median quota by more than two orders of magnitude, so the abstain-when-uncontended condition is a pre-deployment check (compare quota to segment supply) rather than a judgment made after seeing the lift. The truncated final serving day, whose partial log would understate late-day supply, is excluded throughout.</w:t>
       </w:r>
     </w:p>
     <w:p>
@@ -4048,7 +4032,7 @@
         <w:pStyle w:val="FirstParagraph"/>
       </w:pPr>
       <w:r>
-        <w:t xml:space="preserve">Before any real log is replayed, a fully synthetic market calibrates the harness where ground truth is known. The four-subscriber example of Section 2 proves the mechanism exists; a Monte-Carlo simulation quantifies it at realistic scale. Each replication generates a synthetic market: 60 segments with lognormal traffic (about 200,000 impression opportunities), 25 campaigns whose quotas sell 80% of expected inventory, per-impression prices drawn uniformly on [$0.05, $0.30] and per-click prices on [$0.50, $3.00], and click probabilities from a campaign-audience affinity model (each campaign genuinely fits some audiences better than others, with rates spanning 0.1%–8%). Each campaign is eligible, by targeting, on roughly 60% of segments.</w:t>
+        <w:t xml:space="preserve">The regime map of Section 6 was measured by a replay harness; this section calibrates that harness on a fully synthetic market where ground truth is known and every quantity is controlled. The four-subscriber example of Section 2 proves the mechanism exists; a Monte-Carlo simulation quantifies it at realistic scale. Each replication generates a synthetic market: 60 segments with lognormal traffic (about 200,000 impression opportunities), 25 campaigns whose quotas sell 80% of expected inventory, per-impression prices drawn uniformly on [$0.05, $0.30] and per-click prices on [$0.50, $3.00], and click probabilities from a campaign-audience affinity model (each campaign genuinely fits some audiences better than others, with rates spanning 0.1%–8%). Each campaign is eligible, by targeting, on roughly 60% of segments.</w:t>
       </w:r>
     </w:p>
     <w:p>
@@ -5474,6 +5458,14 @@
         <w:pStyle w:val="FirstParagraph"/>
       </w:pPr>
       <w:r>
+        <w:t xml:space="preserve">Four design principles carry the empirical findings, persistence-chosen segments, solved prices, and a re-solve cadence, into a deployable system.</w:t>
+      </w:r>
+    </w:p>
+    <w:p>
+      <w:pPr>
+        <w:pStyle w:val="BodyText"/>
+      </w:pPr>
+      <w:r>
         <w:rPr>
           <w:b/>
           <w:bCs/>
@@ -5583,7 +5575,7 @@
         <w:t xml:space="preserve"> </w:t>
       </w:r>
       <w:r>
-        <w:t xml:space="preserve">at or above one on the interaction-carrying segments (Algorithm 1, step 6). The three public datasets are positioned accordingly: Taobao is the in-vertical evidence where all conditions hold, Avazu is the churn boundary where a daily plan fails until the cadence shrinks, and Outbrain is the contention boundary where an uncontended market yields little until demand is stressed. The two boundaries are not failed replications; they are the edges that make the deployment claim falsifiable.</w:t>
+        <w:t xml:space="preserve">at or above one on the interaction-carrying segments (Algorithm 1, step 6). The three public datasets are positioned accordingly: Taobao is the in-vertical evidence where all conditions hold, Avazu is the churn boundary where a daily plan fails until the cadence shrinks, and Outbrain is the contention boundary where an uncontended market yields little until demand is stressed. The two boundaries are the edges that make the deployment claim falsifiable.</w:t>
       </w:r>
     </w:p>
     <w:p>

</xml_diff>

<commit_message>
Shorten and simplify the abstract (readable, ~170 words, states the suggestion); rebuild all formats
Abstract rewritten to two compact paragraphs: problem, the one key idea (persistent interaction), the pre-committable rule, evidence on three logs, and the three-step operator takeaway; dropped the dense statistics (they live in the body). Regenerated LaTeX PDF+source, Word two-col/one-col DOCX+PDF, and the web PDF from the updated source.

Co-Authored-By: Claude Opus 4.8 <noreply@anthropic.com>
</commit_message>
<xml_diff>
--- a/paper.docx
+++ b/paper.docx
@@ -10,7 +10,7 @@
         <w:t xml:space="preserve">Preprint</w:t>
       </w:r>
     </w:p>
-    <w:bookmarkStart w:id="20" w:name="segment-where-the-interaction-persists"/>
+    <w:bookmarkStart w:id="25" w:name="segment-where-the-interaction-persists"/>
     <w:p>
       <w:pPr>
         <w:pStyle w:val="Heading1"/>
@@ -76,8 +76,95 @@
         <w:t xml:space="preserve">Intelligent Systems, Afeka Academic College of Engineering, Tel-Aviv, Israel</w:t>
       </w:r>
     </w:p>
-    <w:bookmarkEnd w:id="20"/>
-    <w:bookmarkStart w:id="21" w:name="abstract"/>
+    <w:p>
+      <w:pPr>
+        <w:pStyle w:val="BodyText"/>
+      </w:pPr>
+      <w:r>
+        <w:t xml:space="preserve">Download</w:t>
+      </w:r>
+      <w:r>
+        <w:t xml:space="preserve">  </w:t>
+      </w:r>
+      <w:r>
+        <w:t xml:space="preserve"> </w:t>
+      </w:r>
+      <w:r>
+        <w:t xml:space="preserve">LaTeX two-column </w:t>
+      </w:r>
+      <w:hyperlink r:id="rId20">
+        <w:r>
+          <w:rPr>
+            <w:rStyle w:val="Hyperlink"/>
+          </w:rPr>
+          <w:t xml:space="preserve">PDF</w:t>
+        </w:r>
+      </w:hyperlink>
+      <w:r>
+        <w:t xml:space="preserve"> · </w:t>
+      </w:r>
+      <w:hyperlink r:id="rId21">
+        <w:r>
+          <w:rPr>
+            <w:rStyle w:val="Hyperlink"/>
+          </w:rPr>
+          <w:t xml:space="preserve">TeX</w:t>
+        </w:r>
+      </w:hyperlink>
+      <w:r>
+        <w:t xml:space="preserve"> </w:t>
+      </w:r>
+      <w:r>
+        <w:t xml:space="preserve">|</w:t>
+      </w:r>
+      <w:r>
+        <w:t xml:space="preserve"> </w:t>
+      </w:r>
+      <w:r>
+        <w:t xml:space="preserve">Word </w:t>
+      </w:r>
+      <w:hyperlink r:id="rId22">
+        <w:r>
+          <w:rPr>
+            <w:rStyle w:val="Hyperlink"/>
+          </w:rPr>
+          <w:t xml:space="preserve">two-col</w:t>
+        </w:r>
+      </w:hyperlink>
+      <w:r>
+        <w:t xml:space="preserve"> · </w:t>
+      </w:r>
+      <w:hyperlink r:id="rId23">
+        <w:r>
+          <w:rPr>
+            <w:rStyle w:val="Hyperlink"/>
+          </w:rPr>
+          <w:t xml:space="preserve">one-col</w:t>
+        </w:r>
+      </w:hyperlink>
+      <w:r>
+        <w:t xml:space="preserve"> </w:t>
+      </w:r>
+      <w:r>
+        <w:t xml:space="preserve">|</w:t>
+      </w:r>
+      <w:r>
+        <w:t xml:space="preserve"> </w:t>
+      </w:r>
+      <w:r>
+        <w:t xml:space="preserve">Web </w:t>
+      </w:r>
+      <w:hyperlink r:id="rId24">
+        <w:r>
+          <w:rPr>
+            <w:rStyle w:val="Hyperlink"/>
+          </w:rPr>
+          <w:t xml:space="preserve">PDF</w:t>
+        </w:r>
+      </w:hyperlink>
+    </w:p>
+    <w:bookmarkEnd w:id="25"/>
+    <w:bookmarkStart w:id="26" w:name="abstract"/>
     <w:p>
       <w:pPr>
         <w:pStyle w:val="Heading2"/>
@@ -91,7 +178,20 @@
         <w:pStyle w:val="FirstParagraph"/>
       </w:pPr>
       <w:r>
-        <w:t xml:space="preserve">Platforms that sell guaranteed impression quotas must decide which audience segments each campaign’s impressions go to. Under fixed quotas, exactly one statistical quantity can make one allocation better than another: the part of click-through rate specific to the campaign-segment pairing (the interaction), and only where it persists from the planning window into the serving window. Average campaign performance is pinned by the quotas and average segment performance by supply, so neither can change an allocation’s value. We give a pre-committable rule for choosing the segmentation an allocator should use: on each candidate axis, remove campaign and segment averages from the cell-level click rates, correlate the remaining pairing-specific residuals across adjacent planning windows, segment only on the axes where they persist, and set granularity in proportion to per-cell data density. On 26.6M impressions of the Taobao display-advertising log, we compute the rule from planning-window data alone, without reference to replay outcomes. It selects the configuration whose replay results match the full ablation ordering: activity tiers pay, demographics and time do not, and finer granularity pays only while cells stay dense. On Avazu the rule ranks axes consistently, and the boundary where a daily plan fails confirms the re-planning timescale it implies. A pre-registered application to a third log (Outbrain), with the configuration frozen before replay, transfers the rule’s persistence ranking and marks its scope: persistence identifies exploitable axes, but contention governs the realized lift. An uncontended market yields little to allocate, whatever the segmentation. The operational rule is three steps, all computable before serving: segment on the axes whose interaction persists, measure contention to decide whether allocation is worth doing, and obtain pacing prices by solving and re-solving the plan.</w:t>
+        <w:t xml:space="preserve">A platform that sells guaranteed impression quotas must decide, for each arriving user, which campaign’s booked impressions to spend, across many fine audience segments and under scarce supply. We show that with quotas fixed, only one thing can make one allocation beat another: the slice of click-through rate specific to a campaign-and-segment pairing, their</w:t>
+      </w:r>
+      <w:r>
+        <w:t xml:space="preserve"> </w:t>
+      </w:r>
+      <w:r>
+        <w:rPr>
+          <w:i/>
+          <w:iCs/>
+        </w:rPr>
+        <w:t xml:space="preserve">interaction</w:t>
+      </w:r>
+      <w:r>
+        <w:t xml:space="preserve">, and only where it persists from one planning window to the next. This gives a simple rule an operator can commit to in advance: segment on the axes whose interaction persists, at the depth the per-cell data supports.</w:t>
       </w:r>
     </w:p>
     <w:p>
@@ -99,11 +199,11 @@
         <w:pStyle w:val="BodyText"/>
       </w:pPr>
       <w:r>
-        <w:t xml:space="preserve">Evaluation uses a replay protocol hardened against a trap we document: when one estimated click table both builds the plan and scores it, the plan harvests the table’s own estimation noise and the measured lift is inflated, a winner’s curse. Scoring every policy under an independent table fitted on the serving window, an exact uniform-null control, support and fatigue audits, and user-clustered inference (headline z = 4.55) delimit what public logs can show, and a semi-synthetic benchmark with a known ground truth confirms the protocol recovers the true policy ranking and the true best policy, even under an adversarial logging policy that selects on the outcome. The protocol yields a regime map. At exact feasibility, plan-informed policies beat greedy serving by 3.5–4.5% expected clicks, and information-matched, feasibility-aware dual-price pacing nearly matches them. Under over-subscription (quotas at 110–150% of supply), online price learning degrades along a spectrum: a scalar controller fails first, and even dual mirror descent, the state-of-the-art adaptive method, tracks the plan through moderate contention but falls below greedy under heavy over-subscription. The periodically re-solved plan dominates every contended regime (+2.2 to +4.3% over greedy, z ≥ 3.4) and is the one price source positive across every contention level, dataset, and objective we test. A price vector solved once at the LP optimum survives the click objective but turns negative under contention when the objective is revenue with heterogeneous per-click and per-impression values and delivery penalties. The durable prescription is therefore to obtain prices by solving and re-solving the plan, not by learning them online. The ordering reproduces on a second dataset (Outbrain, 87M impressions), where online pacing deepens to −44%, and the whole regime map transfers to the revenue objective, where the plan tier’s advantage grows as delivery guarantees harden. Grounding the gains in realized outcomes is inconclusive on the small logging-matched subset, an inherent limit of public-log evaluation.</w:t>
-      </w:r>
-    </w:p>
-    <w:bookmarkEnd w:id="21"/>
-    <w:bookmarkStart w:id="22" w:name="introduction"/>
+        <w:t xml:space="preserve">On three public advertising logs (Taobao, Avazu, Outbrain), evaluated with a replay protocol hardened against a self-scoring bias and checked against a known-truth benchmark, the rule picks the segmentation that pays, and planning the allocation beats both greedy serving and online price-learning pacing. Two conditions set the payoff: the market must be contended, because an uncontended market yields little to allocate whatever the segmentation; and pacing prices should be obtained by solving and re-solving the plan, not learned online, which fails under heavy contention. The result is a three-step rule an operator can act on: probe persistence to choose the segments, measure contention to decide whether planning is worth it, and solve for the pacing prices.</w:t>
+      </w:r>
+    </w:p>
+    <w:bookmarkEnd w:id="26"/>
+    <w:bookmarkStart w:id="27" w:name="introduction"/>
     <w:p>
       <w:pPr>
         <w:pStyle w:val="Heading2"/>
@@ -256,8 +356,8 @@
         <w:t xml:space="preserve">Section 2 quantifies the cost of greedy serving on a minimal instance and Section 3 states the allocation program and its interaction-invariance structure. Section 4 develops the replay protocol and validates it against a known ground truth, Section 5 the persistence rule, and Section 6 the regime map, its cross-dataset and revenue-objective replications. Section 7 calibrates the harness on a synthetic market with known ground truth, Section 8 summarizes the reference serving architecture that motivated the study, with the full design in Appendix A, and Section 9 situates the work in the online-allocation and offline-evaluation literature. Sections 10 and 11 close with design principles and scope.</w:t>
       </w:r>
     </w:p>
-    <w:bookmarkEnd w:id="22"/>
-    <w:bookmarkStart w:id="26" w:name="the-allocation-problem-a-worked-example"/>
+    <w:bookmarkEnd w:id="27"/>
+    <w:bookmarkStart w:id="31" w:name="the-allocation-problem-a-worked-example"/>
     <w:p>
       <w:pPr>
         <w:pStyle w:val="Heading2"/>
@@ -526,18 +626,18 @@
                 <wp:inline>
                   <wp:extent cx="5334000" cy="2222500"/>
                   <wp:effectExtent b="0" l="0" r="0" t="0"/>
-                  <wp:docPr descr="" title="" id="24" name="Picture"/>
+                  <wp:docPr descr="" title="" id="29" name="Picture"/>
                   <a:graphic>
                     <a:graphicData uri="http://schemas.openxmlformats.org/drawingml/2006/picture">
                       <pic:pic>
                         <pic:nvPicPr>
-                          <pic:cNvPr descr="file:///E:/tmp/claude/E--Projects-Submitted-MobileAd-Comverse/464e82cd-870f-4dc1-b795-92348cf1a9b8/scratchpad/figs/fig1.png" id="25" name="Picture"/>
+                          <pic:cNvPr descr="file:///E:/tmp/claude/E--Projects-Submitted-MobileAd-Comverse/464e82cd-870f-4dc1-b795-92348cf1a9b8/scratchpad/figs/fig1.png" id="30" name="Picture"/>
                           <pic:cNvPicPr>
                             <a:picLocks noChangeArrowheads="1" noChangeAspect="1"/>
                           </pic:cNvPicPr>
                         </pic:nvPicPr>
                         <pic:blipFill>
-                          <a:blip r:embed="rId23"/>
+                          <a:blip r:embed="rId28"/>
                           <a:stretch>
                             <a:fillRect/>
                           </a:stretch>
@@ -644,8 +744,8 @@
         <w:t xml:space="preserve">(audience, campaign), not of a campaign alone. Revenue is maximized by choosing the pairing globally, subject to each campaign’s quota, and this choice can be made ahead of time because audience behavior is statistically predictable even though individual events are not.</w:t>
       </w:r>
     </w:p>
-    <w:bookmarkEnd w:id="26"/>
-    <w:bookmarkStart w:id="28" w:name="formulation"/>
+    <w:bookmarkEnd w:id="31"/>
+    <w:bookmarkStart w:id="33" w:name="formulation"/>
     <w:p>
       <w:pPr>
         <w:pStyle w:val="Heading2"/>
@@ -1026,7 +1126,7 @@
         <w:t xml:space="preserve"> &gt; 0), and the impression-price term becomes a constant, making the allocation choice a pure expected-clicks problem; Section 6 studies the over-subscribed regime where this simplification fails. Second, the quota appears as an upper bound: when targeting and supply cannot fill a quota, the program returns the revenue-maximal under-delivery rather than infeasibility, and the shortfall is the input to make-good scheduling, which we treat as outside the model. Third, the quota constraint is what makes greedy serving inadequate: without it, serving every impression to its highest-value campaign would be optimal, and no planning stage would be needed.</w:t>
       </w:r>
     </w:p>
-    <w:bookmarkStart w:id="27" w:name="Xb8b18ac5c60ec5742410ace98e579bc138671d3"/>
+    <w:bookmarkStart w:id="32" w:name="Xb8b18ac5c60ec5742410ace98e579bc138671d3"/>
     <w:p>
       <w:pPr>
         <w:pStyle w:val="Heading3"/>
@@ -1903,9 +2003,9 @@
         <w:t xml:space="preserve">and any under-delivery penalty) governs, and interaction invariance no longer applies. This is exactly the regime the contention experiments of Section 6 probe, and it is why policy orderings there differ from the feasible case.</w:t>
       </w:r>
     </w:p>
-    <w:bookmarkEnd w:id="27"/>
-    <w:bookmarkEnd w:id="28"/>
-    <w:bookmarkStart w:id="30" w:name="replay-evaluation-protocol"/>
+    <w:bookmarkEnd w:id="32"/>
+    <w:bookmarkEnd w:id="33"/>
+    <w:bookmarkStart w:id="35" w:name="replay-evaluation-protocol"/>
     <w:p>
       <w:pPr>
         <w:pStyle w:val="Heading2"/>
@@ -2026,7 +2126,7 @@
         <w:t xml:space="preserve"> − t/T) after each impression with η set to half the global click rate; it consults no plan. Reported errors are the scoring table’s closed-form binomial variance propagated through each comparison’s assignment difference; the across-fold spread of the five per-fold lifts independently reproduces the same standard error, and the all-folds-positive sign pattern supports the parametric statement distribution-free. The uniform control defends the harness; a further check defends the scorer itself: standardizing the scoring table along the strongest observable within-cell covariate the segmentation does not use (each user’s own training-window click propensity) shifts the headline lifts by at most +0.3pp, upward, so observable within-cell selection in the logged exposures does not account for the measured gains. Support is also measured directly: only 6% of the planned policy’s assignment mass (and 5% of the re-paired mass) lands in cells with fewer than 100 logged serving-window impressions, and scoring those thin cells with a pooled campaign-level fallback moves the headline from +3.46% to +2.99%; the counterfactual rests almost entirely on well-supported cells. (Forcing the fallback on all cells below 1,000 impressions, 78% of the mass, collapses the lift toward zero, as it must: a campaign-constant scorer deletes the interaction dimension, and under fixed quotas every assignment then scores equally, the same argument as the uniform control.) The replay isolates the architecture’s allocation core, plan against serving policy at segment granularity: every campaign is eligible on every segment, and the per-subscriber serving components of Appendix A.2 (soft-membership blending, frequency caps, threshold pacing) operate below this granularity and are not exercised by these experiments.</w:t>
       </w:r>
     </w:p>
-    <w:bookmarkStart w:id="29" w:name="X888dfabe7f5ac870af14768d223c176646b6318"/>
+    <w:bookmarkStart w:id="34" w:name="X888dfabe7f5ac870af14768d223c176646b6318"/>
     <w:p>
       <w:pPr>
         <w:pStyle w:val="Heading3"/>
@@ -2055,9 +2155,9 @@
         <w:t xml:space="preserve">. The logging policy is the real exposure pattern; clicks are then sampled ∼ Bernoulli(θ) on the real exposures to fit a planning table (days 9–11) and an independent scoring table (days 12–13), so both tables carry realistic estimation noise and θ itself never scores anything the planner sees. Five policies (greedy, static plan, periodic re-solve, fixed optimal dual, entropic Dual Mirror Descent) then replay the day 12–13 stream, and each assignment is scored twice: under the noisy table, exactly as the paper reports, and under θ, which only this controlled setting makes available. At realistic interaction strength the model-scored replay recovers the decision that matters: every strong policy is correctly separated from greedy, the model-scored ranking matches the true ranking (Spearman 1.00 at κ=1.0, 0.90 at κ=1.5), the model selects the truly best policy in both cases, and the estimated greedy-relative lift sits within about 1.4 percentage points of its true value. The limit is also visible: when the interaction is amplified beyond the level seen in the real data (κ=2.0), the top policies bunch within roughly 0.3 points of one another under the true response, and the noisy table reorders those near-ties (Spearman 0.70), selecting the entropic dual over the static plan when the plan is in fact marginally better. Model-scored replay is therefore trustworthy for the claims this paper makes, which separate a strong tier from greedy and identify a robust re-solve or plan policy, and it should not be read as resolving fine differences among near-tied top policies. The recovery does not depend on a benign logging policy. Repeating the benchmark with a deliberately adversarial logger, one that selects on the outcome itself so high-response cells are over-observed and low-response cells starve, the worst case for a scorer fit on logged data, still identifies the true best policy at both signal strengths (rank correlation 0.90 and 1.00), at the cost of a small upward bias, under 1.2 percentage points, from the optimistic tables that outcome-selected logging produces. The benchmark and its adversarial variant are released with the replication package.</w:t>
       </w:r>
     </w:p>
-    <w:bookmarkEnd w:id="29"/>
-    <w:bookmarkEnd w:id="30"/>
-    <w:bookmarkStart w:id="31" w:name="the-persistence-rule"/>
+    <w:bookmarkEnd w:id="34"/>
+    <w:bookmarkEnd w:id="35"/>
+    <w:bookmarkStart w:id="36" w:name="the-persistence-rule"/>
     <w:p>
       <w:pPr>
         <w:pStyle w:val="Heading2"/>
@@ -3257,8 +3357,8 @@
         <w:t xml:space="preserve">, the criterion keeps eight tiers at top-100 and four at top-500, matching the ablation optima above. The threshold is an order-of-magnitude reliability target rather than a constant validated out of sample, so we report depth selection as density-guided rather than fully closed; the axis and abstain decisions are the parts of Algorithm 1 that run without any such tuning.</w:t>
       </w:r>
     </w:p>
-    <w:bookmarkEnd w:id="31"/>
-    <w:bookmarkStart w:id="35" w:name="the-regime-map"/>
+    <w:bookmarkEnd w:id="36"/>
+    <w:bookmarkStart w:id="40" w:name="the-regime-map"/>
     <w:p>
       <w:pPr>
         <w:pStyle w:val="Heading2"/>
@@ -3750,18 +3850,18 @@
                 <wp:inline>
                   <wp:extent cx="5334000" cy="2592916"/>
                   <wp:effectExtent b="0" l="0" r="0" t="0"/>
-                  <wp:docPr descr="" title="" id="33" name="Picture"/>
+                  <wp:docPr descr="" title="" id="38" name="Picture"/>
                   <a:graphic>
                     <a:graphicData uri="http://schemas.openxmlformats.org/drawingml/2006/picture">
                       <pic:pic>
                         <pic:nvPicPr>
-                          <pic:cNvPr descr="file:///E:/tmp/claude/E--Projects-Submitted-MobileAd-Comverse/464e82cd-870f-4dc1-b795-92348cf1a9b8/scratchpad/figs/fig2.png" id="34" name="Picture"/>
+                          <pic:cNvPr descr="file:///E:/tmp/claude/E--Projects-Submitted-MobileAd-Comverse/464e82cd-870f-4dc1-b795-92348cf1a9b8/scratchpad/figs/fig2.png" id="39" name="Picture"/>
                           <pic:cNvPicPr>
                             <a:picLocks noChangeArrowheads="1" noChangeAspect="1"/>
                           </pic:cNvPicPr>
                         </pic:nvPicPr>
                         <pic:blipFill>
-                          <a:blip r:embed="rId32"/>
+                          <a:blip r:embed="rId37"/>
                           <a:stretch>
                             <a:fillRect/>
                           </a:stretch>
@@ -4014,8 +4114,8 @@
         <w:t xml:space="preserve">Three robustness checks anchor the table. The headline planned-versus-greedy comparison survives a user-clustered bootstrap (z = +4.55) and an across-fold t-test (t(4) = +5.50); at exact feasibility the strong policies are statistically close, so the ordering across contention regimes, not any single feasibility cell, is the claim. Re-pairing the impression stream changes per-user exposure composition; re-scoring under a first-exposure table (each user’s first impression of each campaign only, which removes repeat-exposure composition) moves the headline from +3.46% to +3.88%, so exposure fatigue does not manufacture the result. The regime map is a single-market result: the over-subscription sweep is run on the Taobao top-100 reconstruction, while Avazu contributes only the stability boundary. The z-values in the table above the headline row come from the parametric binomial model; the conclusions that rest on them (the re-solved plan’s dominance at every over-subscribed scale, the dual collapse) hold with the same sign and comparable magnitude under the user-clustered bootstrap where we recomputed them. The remaining, and inherent, limitation is that these are model-scored expected clicks: an outcome-grounded estimate is possible only on the 2–2.4% of impressions where a policy’s choice coincides with the logged action, a subset both tiny and selected toward the logging policy. On it, a self-normalized inverse-propensity estimate with an estimated segment-level logging propensity puts planned within ±1pp of greedy at t(4) = −0.5, that is, inconclusive; the matched-subset calibration shows the model scorer understates realized CTR slightly and symmetrically for both policies (about 6.8% realized versus 6.5% modeled), so it is not inflating the gap. Public logs cannot close this gap; only an interventional deployment can.</w:t>
       </w:r>
     </w:p>
-    <w:bookmarkEnd w:id="35"/>
-    <w:bookmarkStart w:id="39" w:name="simulation-as-calibration"/>
+    <w:bookmarkEnd w:id="40"/>
+    <w:bookmarkStart w:id="44" w:name="simulation-as-calibration"/>
     <w:p>
       <w:pPr>
         <w:pStyle w:val="Heading2"/>
@@ -4370,18 +4470,18 @@
                 <wp:inline>
                   <wp:extent cx="5334000" cy="2370666"/>
                   <wp:effectExtent b="0" l="0" r="0" t="0"/>
-                  <wp:docPr descr="" title="" id="37" name="Picture"/>
+                  <wp:docPr descr="" title="" id="42" name="Picture"/>
                   <a:graphic>
                     <a:graphicData uri="http://schemas.openxmlformats.org/drawingml/2006/picture">
                       <pic:pic>
                         <pic:nvPicPr>
-                          <pic:cNvPr descr="file:///E:/tmp/claude/E--Projects-Submitted-MobileAd-Comverse/464e82cd-870f-4dc1-b795-92348cf1a9b8/scratchpad/figs/fig3.png" id="38" name="Picture"/>
+                          <pic:cNvPr descr="file:///E:/tmp/claude/E--Projects-Submitted-MobileAd-Comverse/464e82cd-870f-4dc1-b795-92348cf1a9b8/scratchpad/figs/fig3.png" id="43" name="Picture"/>
                           <pic:cNvPicPr>
                             <a:picLocks noChangeArrowheads="1" noChangeAspect="1"/>
                           </pic:cNvPicPr>
                         </pic:nvPicPr>
                         <pic:blipFill>
-                          <a:blip r:embed="rId36"/>
+                          <a:blip r:embed="rId41"/>
                           <a:stretch>
                             <a:fillRect/>
                           </a:stretch>
@@ -4454,8 +4554,8 @@
         <w:t xml:space="preserve">The simulation carries its own controls. Both policies are verified against the hindsight bound in every replication. On control instances where all campaigns share identical click probabilities, so pairing cannot matter, the measured lift is 0.000%, confirming that the gap measures allocation quality and not an artifact of the harness. And the planned policy’s 93.8% of a bound computed with perfect hindsight shows that forecast noise costs the plan only a few points, the residual that Appendix A.2’s pacing mechanism and the refinement loop exist to absorb.</w:t>
       </w:r>
     </w:p>
-    <w:bookmarkEnd w:id="39"/>
-    <w:bookmarkStart w:id="40" w:name="a-reference-serving-architecture"/>
+    <w:bookmarkEnd w:id="44"/>
+    <w:bookmarkStart w:id="45" w:name="a-reference-serving-architecture"/>
     <w:p>
       <w:pPr>
         <w:pStyle w:val="Heading2"/>
@@ -4780,8 +4880,8 @@
         <w:t xml:space="preserve">The full serving design is a two-stage architecture. An offline analytics stage learns the plan’s inputs, per-segment traffic forecasts and per-(campaign, segment) click probabilities, from event history, clusters subscribers on behavior, and compiles the resulting plan into compact lookup tables. An online engine then executes one impression at a time in constant time: a seven-step decision reads the pre-computed tables to pick the eligible, quota-remaining campaign whose plan-adjusted score is highest, blends per-cluster click estimates by soft membership, and paces delivery by tracking each campaign against its planned trajectory. Because the offline stage holds all raw attributes while the serving path sees only anonymous cluster distances and eligibility lists, the design realizes the data-minimization posture the operator setting requires. Appendix A gives the full design, its data structures, and the pacing rule; the experiments in this paper exercise the allocation core it compiles, not the per-subscriber serving machinery.</w:t>
       </w:r>
     </w:p>
-    <w:bookmarkEnd w:id="40"/>
-    <w:bookmarkStart w:id="41" w:name="related-work"/>
+    <w:bookmarkEnd w:id="45"/>
+    <w:bookmarkStart w:id="46" w:name="related-work"/>
     <w:p>
       <w:pPr>
         <w:pStyle w:val="Heading2"/>
@@ -5440,8 +5540,8 @@
         <w:t xml:space="preserve">Industrial click-through-rate modeling ranges from large-scale logistic regression [15] and field-aware factorization machines [16] to attention architectures over user behavior [17, 3]. Our click model is deliberately simpler, hierarchical empirical rates with soft cluster membership, because the architecture consumes any calibrated estimator and the allocation question is about the pairing structure, not the estimator frontier. For evaluation, replay methods [18], counterfactual reasoning in computational advertising [19], and offline A/B testing [20] establish the off-policy toolbox; the dual-model scoring of Section 4 applies the same discipline to allocation policies specifically, where we show single-model replay inflates lift through the plan’s own estimation noise.</w:t>
       </w:r>
     </w:p>
-    <w:bookmarkEnd w:id="41"/>
-    <w:bookmarkStart w:id="42" w:name="discussion"/>
+    <w:bookmarkEnd w:id="46"/>
+    <w:bookmarkStart w:id="47" w:name="discussion"/>
     <w:p>
       <w:pPr>
         <w:pStyle w:val="Heading2"/>
@@ -5533,8 +5633,8 @@
         <w:t xml:space="preserve">Bit masks make targeting tests branchless; pre-computed distances make personalization a weighted sum; per-(cluster, campaign) rows make pacing a two-row query. The offline stage does not merely produce a model; it compiles one, in the same sense a compiler turns a program into a form the machine executes directly.</w:t>
       </w:r>
     </w:p>
-    <w:bookmarkEnd w:id="42"/>
-    <w:bookmarkStart w:id="43" w:name="scope-and-assumptions"/>
+    <w:bookmarkEnd w:id="47"/>
+    <w:bookmarkStart w:id="48" w:name="scope-and-assumptions"/>
     <w:p>
       <w:pPr>
         <w:pStyle w:val="Heading2"/>
@@ -5586,8 +5686,8 @@
         <w:t xml:space="preserve">The architecture optimizes expected revenue for a known campaign portfolio over a planning horizon; it does not address auction-based pricing, real-time bidding against external demand, or creative selection within a campaign. Its guarantees rest on the stability assumptions of Appendix A.1: allocation quality degrades in proportion to how far future traffic and response distributions drift from the modeled ones between refinement cycles, which sets the practical requirement for how frequently the offline stage must re-run. Exposure policy enforcement is per-subscriber and rule-based; richer fatigue models would slot into step 2 without changing the surrounding machinery. Finally, window-fitted planning presumes a campaign portfolio stable over the planning horizon, which is the operator’s contracted-campaign setting; in marketplaces where the ad portfolio and its delivery mix turn over within a day, the re-planning interval must shrink to the churn timescale for the plan to retain value.</w:t>
       </w:r>
     </w:p>
-    <w:bookmarkEnd w:id="43"/>
-    <w:bookmarkStart w:id="62" w:name="X768eda5dc47c9e2fbd56372e290aa93bfab37c7"/>
+    <w:bookmarkEnd w:id="48"/>
+    <w:bookmarkStart w:id="67" w:name="X768eda5dc47c9e2fbd56372e290aa93bfab37c7"/>
     <w:p>
       <w:pPr>
         <w:pStyle w:val="Heading2"/>
@@ -5604,7 +5704,7 @@
         <w:t xml:space="preserve">This appendix gives the full deployment design summarized in Section 8: the offline stage that compiles the plan and the online stage that executes it per impression. It is a design sketch; the experiments of Sections 4–6 validate the allocation core it compiles, not the per-subscriber serving machinery detailed here.</w:t>
       </w:r>
     </w:p>
-    <w:bookmarkStart w:id="44" w:name="Xa31f11580875970f34b111f76672a43985c73f8"/>
+    <w:bookmarkStart w:id="49" w:name="Xa31f11580875970f34b111f76672a43985c73f8"/>
     <w:p>
       <w:pPr>
         <w:pStyle w:val="Heading3"/>
@@ -5701,8 +5801,8 @@
         <w:t xml:space="preserve">Assumption 1 justifies forecasting traffic from history; assumptions 2 and 3 justify pooling sparse per-subscriber click data into clusters that have enough volume to estimate probabilities reliably.</w:t>
       </w:r>
     </w:p>
-    <w:bookmarkEnd w:id="44"/>
-    <w:bookmarkStart w:id="45" w:name="a.1.1-response-records"/>
+    <w:bookmarkEnd w:id="49"/>
+    <w:bookmarkStart w:id="50" w:name="a.1.1-response-records"/>
     <w:p>
       <w:pPr>
         <w:pStyle w:val="Heading3"/>
@@ -5992,8 +6092,8 @@
         <w:t xml:space="preserve">Records are grouped per subscriber and joined with the profile (age, gender, location, income band, purchase indicators) where one is available. Past campaigns matter as much as active ones: a subscriber’s reaction to a finished campaign is evidence about how they will react to similar future ones.</w:t>
       </w:r>
     </w:p>
-    <w:bookmarkEnd w:id="45"/>
-    <w:bookmarkStart w:id="46" w:name="a.1.2-proximity-and-clustering"/>
+    <w:bookmarkEnd w:id="50"/>
+    <w:bookmarkStart w:id="51" w:name="a.1.2-proximity-and-clustering"/>
     <w:p>
       <w:pPr>
         <w:pStyle w:val="Heading3"/>
@@ -6201,8 +6301,8 @@
         <w:t xml:space="preserve">. A subscriber is not filed into one cluster; they carry a pre-computed distance to each nearby cluster. A 35-year-old married streaming subscriber in a large city may sit at distance 0.8 from the “metropolitan professionals” cluster and 0.1 from “music lovers”; a 22-year-old gaming subscriber in the same city sits close to “gamers” and “music lovers” instead. These distances become interpolation weights at serving time (Appendix A.2), so predictions blend the behavior of every cluster the subscriber resembles.</w:t>
       </w:r>
     </w:p>
-    <w:bookmarkEnd w:id="46"/>
-    <w:bookmarkStart w:id="47" w:name="X8b2446043a77ae8c428cb2f72851e920fe1c4ed"/>
+    <w:bookmarkEnd w:id="51"/>
+    <w:bookmarkStart w:id="52" w:name="X8b2446043a77ae8c428cb2f72851e920fe1c4ed"/>
     <w:p>
       <w:pPr>
         <w:pStyle w:val="Heading3"/>
@@ -6720,8 +6820,8 @@
         <w:t xml:space="preserve">For a brand-new campaign with no history of its own, probabilities are borrowed from the most similar past or active campaigns in the same category, the same pooling idea applied across campaigns instead of across subscribers. Where the profile itself is missing (anonymous or prepaid subscribers), distance to clusters is computed from response history alone, and the subscriber inherits the response statistics of the cluster they behave like. The design degrades gracefully as data thins out: per-subscriber evidence backs off to cluster evidence, and per-campaign evidence backs off to category evidence.</w:t>
       </w:r>
     </w:p>
-    <w:bookmarkEnd w:id="47"/>
-    <w:bookmarkStart w:id="48" w:name="X2728b61a2ed01e7aae0fb7efa1e42ffc1e64944"/>
+    <w:bookmarkEnd w:id="52"/>
+    <w:bookmarkStart w:id="53" w:name="X2728b61a2ed01e7aae0fb7efa1e42ffc1e64944"/>
     <w:p>
       <w:pPr>
         <w:pStyle w:val="Heading3"/>
@@ -6941,8 +7041,8 @@
         <w:t xml:space="preserve">That one row carries targeting, allocation, and the performance baseline the online stage will pace against.</w:t>
       </w:r>
     </w:p>
-    <w:bookmarkEnd w:id="48"/>
-    <w:bookmarkStart w:id="52" w:name="X4b4881ba4a2c69f1986b51a46ce2020ac7b4091"/>
+    <w:bookmarkEnd w:id="53"/>
+    <w:bookmarkStart w:id="57" w:name="X4b4881ba4a2c69f1986b51a46ce2020ac7b4091"/>
     <w:p>
       <w:pPr>
         <w:pStyle w:val="Heading3"/>
@@ -7030,18 +7130,18 @@
                 <wp:inline>
                   <wp:extent cx="5334000" cy="1778000"/>
                   <wp:effectExtent b="0" l="0" r="0" t="0"/>
-                  <wp:docPr descr="" title="" id="50" name="Picture"/>
+                  <wp:docPr descr="" title="" id="55" name="Picture"/>
                   <a:graphic>
                     <a:graphicData uri="http://schemas.openxmlformats.org/drawingml/2006/picture">
                       <pic:pic>
                         <pic:nvPicPr>
-                          <pic:cNvPr descr="file:///E:/tmp/claude/E--Projects-Submitted-MobileAd-Comverse/464e82cd-870f-4dc1-b795-92348cf1a9b8/scratchpad/figs/fig4.png" id="51" name="Picture"/>
+                          <pic:cNvPr descr="file:///E:/tmp/claude/E--Projects-Submitted-MobileAd-Comverse/464e82cd-870f-4dc1-b795-92348cf1a9b8/scratchpad/figs/fig4.png" id="56" name="Picture"/>
                           <pic:cNvPicPr>
                             <a:picLocks noChangeArrowheads="1" noChangeAspect="1"/>
                           </pic:cNvPicPr>
                         </pic:nvPicPr>
                         <pic:blipFill>
-                          <a:blip r:embed="rId49"/>
+                          <a:blip r:embed="rId54"/>
                           <a:stretch>
                             <a:fillRect/>
                           </a:stretch>
@@ -7085,8 +7185,8 @@
         <w:t xml:space="preserve">The closed loop. Offline analytics compiles the model and allocation plan into lookup tables; the online engine executes them per impression and streams response records back, which the next analytics cycle uses to refine clusters, probabilities, and the plan.</w:t>
       </w:r>
     </w:p>
-    <w:bookmarkEnd w:id="52"/>
-    <w:bookmarkStart w:id="56" w:name="a.2.1-the-seven-step-decision"/>
+    <w:bookmarkEnd w:id="57"/>
+    <w:bookmarkStart w:id="61" w:name="a.2.1-the-seven-step-decision"/>
     <w:p>
       <w:pPr>
         <w:pStyle w:val="Heading3"/>
@@ -7298,18 +7398,18 @@
                 <wp:inline>
                   <wp:extent cx="5334000" cy="2755900"/>
                   <wp:effectExtent b="0" l="0" r="0" t="0"/>
-                  <wp:docPr descr="" title="" id="54" name="Picture"/>
+                  <wp:docPr descr="" title="" id="59" name="Picture"/>
                   <a:graphic>
                     <a:graphicData uri="http://schemas.openxmlformats.org/drawingml/2006/picture">
                       <pic:pic>
                         <pic:nvPicPr>
-                          <pic:cNvPr descr="file:///E:/tmp/claude/E--Projects-Submitted-MobileAd-Comverse/464e82cd-870f-4dc1-b795-92348cf1a9b8/scratchpad/figs/fig5.png" id="55" name="Picture"/>
+                          <pic:cNvPr descr="file:///E:/tmp/claude/E--Projects-Submitted-MobileAd-Comverse/464e82cd-870f-4dc1-b795-92348cf1a9b8/scratchpad/figs/fig5.png" id="60" name="Picture"/>
                           <pic:cNvPicPr>
                             <a:picLocks noChangeArrowheads="1" noChangeAspect="1"/>
                           </pic:cNvPicPr>
                         </pic:nvPicPr>
                         <pic:blipFill>
-                          <a:blip r:embed="rId53"/>
+                          <a:blip r:embed="rId58"/>
                           <a:stretch>
                             <a:fillRect/>
                           </a:stretch>
@@ -7353,8 +7453,8 @@
         <w:t xml:space="preserve">The seven-step decision path and its data dependencies. Steps 1–5 each read one pre-computed or live table; step 6 is pure arithmetic over the candidates; step 7 writes the served impression back into the status and response tables, which is also the record that feeds the next offline refinement cycle.</w:t>
       </w:r>
     </w:p>
-    <w:bookmarkEnd w:id="56"/>
-    <w:bookmarkStart w:id="57" w:name="X177b7c0bc4741b5b22d40a3d16b0d67309e222e"/>
+    <w:bookmarkEnd w:id="61"/>
+    <w:bookmarkStart w:id="62" w:name="X177b7c0bc4741b5b22d40a3d16b0d67309e222e"/>
     <w:p>
       <w:pPr>
         <w:pStyle w:val="Heading3"/>
@@ -7406,8 +7506,8 @@
         <w:t xml:space="preserve">Because the subscriber borrows from every cluster they resemble, the estimate is stable even for subscribers with thin personal histories, and it is computed from two table rows and four multiplications.</w:t>
       </w:r>
     </w:p>
-    <w:bookmarkEnd w:id="57"/>
-    <w:bookmarkStart w:id="61" w:name="a.2.3-pacing-planned-versus-actual"/>
+    <w:bookmarkEnd w:id="62"/>
+    <w:bookmarkStart w:id="66" w:name="a.2.3-pacing-planned-versus-actual"/>
     <w:p>
       <w:pPr>
         <w:pStyle w:val="Heading3"/>
@@ -7682,18 +7782,18 @@
                 <wp:inline>
                   <wp:extent cx="5334000" cy="2074333"/>
                   <wp:effectExtent b="0" l="0" r="0" t="0"/>
-                  <wp:docPr descr="" title="" id="59" name="Picture"/>
+                  <wp:docPr descr="" title="" id="64" name="Picture"/>
                   <a:graphic>
                     <a:graphicData uri="http://schemas.openxmlformats.org/drawingml/2006/picture">
                       <pic:pic>
                         <pic:nvPicPr>
-                          <pic:cNvPr descr="file:///E:/tmp/claude/E--Projects-Submitted-MobileAd-Comverse/464e82cd-870f-4dc1-b795-92348cf1a9b8/scratchpad/figs/fig6.png" id="60" name="Picture"/>
+                          <pic:cNvPr descr="file:///E:/tmp/claude/E--Projects-Submitted-MobileAd-Comverse/464e82cd-870f-4dc1-b795-92348cf1a9b8/scratchpad/figs/fig6.png" id="65" name="Picture"/>
                           <pic:cNvPicPr>
                             <a:picLocks noChangeArrowheads="1" noChangeAspect="1"/>
                           </pic:cNvPicPr>
                         </pic:nvPicPr>
                         <pic:blipFill>
-                          <a:blip r:embed="rId58"/>
+                          <a:blip r:embed="rId63"/>
                           <a:stretch>
                             <a:fillRect/>
                           </a:stretch>
@@ -8141,9 +8241,9 @@
         <w:t xml:space="preserve">C4 carries the greatest expected revenue but sits at 128% of plan, past the overserved threshold, so it is dropped; C1 at 55% is behind plan but above the critical threshold, so it earns no override. Among the remaining candidates the engine serves C3, the greatest expected revenue for this impression. The pacing mechanism is what lets a static offline plan survive contact with real, noisy traffic: the plan sets the destination, and the index steers thousands of small per-impression corrections toward it. Deviations that pacing cannot absorb (a traffic forecast that proves wrong, a campaign that outperforms its category prior) are exactly what the feedback loop carries back into the next planning cycle.</w:t>
       </w:r>
     </w:p>
-    <w:bookmarkEnd w:id="61"/>
-    <w:bookmarkEnd w:id="62"/>
-    <w:bookmarkStart w:id="63" w:name="references"/>
+    <w:bookmarkEnd w:id="66"/>
+    <w:bookmarkEnd w:id="67"/>
+    <w:bookmarkStart w:id="68" w:name="references"/>
     <w:p>
       <w:pPr>
         <w:pStyle w:val="Heading2"/>
@@ -8734,7 +8834,7 @@
         <w:t xml:space="preserve">Preprint, August 2026. Code and replay harness: github.com/ApartsinProjects/optimal-impression-allocation.</w:t>
       </w:r>
     </w:p>
-    <w:bookmarkEnd w:id="63"/>
+    <w:bookmarkEnd w:id="68"/>
     <w:sectPr/>
   </w:body>
 </w:document>

</xml_diff>

<commit_message>
New scientific title (single, colon form); top-right badge row for all five downloads; rebuild all formats
- Title: 'Impression Allocation under Campaign Quotas: A Persistence Rule for Segmentation and a Regime Map for Pacing' (subtitle removed)
- Header download bar removed; top-right badges now link LaTeX PDF, 2-col PDF, 2-col DOCX, 1-col PDF, 1-col DOCX
- Regenerated LaTeX (ImageBundling house style via html2tex converter), Word two-col/one-col DOCX+PDF, and web PDF from the updated source

Co-Authored-By: Claude Opus 4.8 <noreply@anthropic.com>
</commit_message>
<xml_diff>
--- a/paper.docx
+++ b/paper.docx
@@ -6,162 +6,124 @@
       <w:pPr>
         <w:pStyle w:val="FirstParagraph"/>
       </w:pPr>
-      <w:r>
-        <w:t xml:space="preserve">Preprint</w:t>
-      </w:r>
-    </w:p>
-    <w:bookmarkStart w:id="25" w:name="segment-where-the-interaction-persists"/>
-    <w:p>
-      <w:pPr>
-        <w:pStyle w:val="Heading1"/>
-      </w:pPr>
-      <w:r>
-        <w:t xml:space="preserve">Segment Where the Interaction Persists</w:t>
-      </w:r>
-    </w:p>
-    <w:p>
-      <w:pPr>
-        <w:pStyle w:val="FirstParagraph"/>
-      </w:pPr>
-      <w:r>
-        <w:t xml:space="preserve">A Segmentation Rule and a Regime Map for When Planning Beats Online Pacing in Quota-Constrained Ad Allocation</w:t>
-      </w:r>
-    </w:p>
-    <w:p>
-      <w:pPr>
-        <w:pStyle w:val="BodyText"/>
-      </w:pPr>
-      <w:r>
-        <w:t xml:space="preserve">Alexander Apartsin</w:t>
-      </w:r>
-      <w:r>
-        <w:rPr>
-          <w:vertAlign w:val="superscript"/>
-        </w:rPr>
-        <w:t xml:space="preserve">1</w:t>
-      </w:r>
-      <w:r>
-        <w:t xml:space="preserve"> · Yehudit Aperstein</w:t>
-      </w:r>
-      <w:r>
-        <w:rPr>
-          <w:vertAlign w:val="superscript"/>
-        </w:rPr>
-        <w:t xml:space="preserve">2</w:t>
-      </w:r>
-    </w:p>
-    <w:p>
-      <w:pPr>
-        <w:pStyle w:val="BodyText"/>
-      </w:pPr>
-      <w:r>
-        <w:rPr>
-          <w:vertAlign w:val="superscript"/>
-        </w:rPr>
-        <w:t xml:space="preserve">1</w:t>
-      </w:r>
-      <w:r>
-        <w:t xml:space="preserve">School of Computer Science, Faculty of Sciences, Holon Institute of Technology (HIT), Holon, Israel</w:t>
-      </w:r>
-      <w:r>
-        <w:br/>
-      </w:r>
-      <w:r>
-        <w:rPr>
-          <w:vertAlign w:val="superscript"/>
-        </w:rPr>
-        <w:t xml:space="preserve">2</w:t>
-      </w:r>
-      <w:r>
-        <w:t xml:space="preserve">Intelligent Systems, Afeka Academic College of Engineering, Tel-Aviv, Israel</w:t>
-      </w:r>
-    </w:p>
-    <w:p>
-      <w:pPr>
-        <w:pStyle w:val="BodyText"/>
-      </w:pPr>
-      <w:r>
-        <w:t xml:space="preserve">Download</w:t>
-      </w:r>
-      <w:r>
-        <w:t xml:space="preserve">  </w:t>
-      </w:r>
-      <w:r>
-        <w:t xml:space="preserve"> </w:t>
-      </w:r>
-      <w:r>
-        <w:t xml:space="preserve">LaTeX two-column </w:t>
-      </w:r>
       <w:hyperlink r:id="rId20">
         <w:r>
           <w:rPr>
             <w:rStyle w:val="Hyperlink"/>
           </w:rPr>
-          <w:t xml:space="preserve">PDF</w:t>
+          <w:t xml:space="preserve">↓ LaTeX PDF</w:t>
         </w:r>
       </w:hyperlink>
       <w:r>
-        <w:t xml:space="preserve"> · </w:t>
+        <w:t xml:space="preserve"> </w:t>
       </w:r>
       <w:hyperlink r:id="rId21">
         <w:r>
           <w:rPr>
             <w:rStyle w:val="Hyperlink"/>
           </w:rPr>
-          <w:t xml:space="preserve">TeX</w:t>
+          <w:t xml:space="preserve">↓ 2-col PDF</w:t>
         </w:r>
       </w:hyperlink>
       <w:r>
         <w:t xml:space="preserve"> </w:t>
-      </w:r>
-      <w:r>
-        <w:t xml:space="preserve">|</w:t>
-      </w:r>
-      <w:r>
-        <w:t xml:space="preserve"> </w:t>
-      </w:r>
-      <w:r>
-        <w:t xml:space="preserve">Word </w:t>
       </w:r>
       <w:hyperlink r:id="rId22">
         <w:r>
           <w:rPr>
             <w:rStyle w:val="Hyperlink"/>
           </w:rPr>
-          <w:t xml:space="preserve">two-col</w:t>
+          <w:t xml:space="preserve">↓ 2-col DOCX</w:t>
         </w:r>
       </w:hyperlink>
       <w:r>
-        <w:t xml:space="preserve"> · </w:t>
+        <w:t xml:space="preserve"> </w:t>
       </w:r>
       <w:hyperlink r:id="rId23">
         <w:r>
           <w:rPr>
             <w:rStyle w:val="Hyperlink"/>
           </w:rPr>
-          <w:t xml:space="preserve">one-col</w:t>
+          <w:t xml:space="preserve">↓ 1-col PDF</w:t>
         </w:r>
       </w:hyperlink>
       <w:r>
         <w:t xml:space="preserve"> </w:t>
-      </w:r>
-      <w:r>
-        <w:t xml:space="preserve">|</w:t>
-      </w:r>
-      <w:r>
-        <w:t xml:space="preserve"> </w:t>
-      </w:r>
-      <w:r>
-        <w:t xml:space="preserve">Web </w:t>
       </w:r>
       <w:hyperlink r:id="rId24">
         <w:r>
           <w:rPr>
             <w:rStyle w:val="Hyperlink"/>
           </w:rPr>
-          <w:t xml:space="preserve">PDF</w:t>
+          <w:t xml:space="preserve">↓ 1-col DOCX</w:t>
         </w:r>
       </w:hyperlink>
+    </w:p>
+    <w:p>
+      <w:pPr>
+        <w:pStyle w:val="BodyText"/>
+      </w:pPr>
+      <w:r>
+        <w:t xml:space="preserve">Preprint</w:t>
+      </w:r>
+    </w:p>
+    <w:bookmarkStart w:id="25" w:name="Xe0b23c8d3b07adb668ac266dbda4e510f440088"/>
+    <w:p>
+      <w:pPr>
+        <w:pStyle w:val="Heading1"/>
+      </w:pPr>
+      <w:r>
+        <w:t xml:space="preserve">Impression Allocation under Campaign Quotas: A Persistence Rule for Segmentation and a Regime Map for Pacing</w:t>
+      </w:r>
+    </w:p>
+    <w:p>
+      <w:pPr>
+        <w:pStyle w:val="FirstParagraph"/>
+      </w:pPr>
+      <w:r>
+        <w:t xml:space="preserve">Alexander Apartsin</w:t>
+      </w:r>
+      <w:r>
+        <w:rPr>
+          <w:vertAlign w:val="superscript"/>
+        </w:rPr>
+        <w:t xml:space="preserve">1</w:t>
+      </w:r>
+      <w:r>
+        <w:t xml:space="preserve"> · Yehudit Aperstein</w:t>
+      </w:r>
+      <w:r>
+        <w:rPr>
+          <w:vertAlign w:val="superscript"/>
+        </w:rPr>
+        <w:t xml:space="preserve">2</w:t>
+      </w:r>
+    </w:p>
+    <w:p>
+      <w:pPr>
+        <w:pStyle w:val="BodyText"/>
+      </w:pPr>
+      <w:r>
+        <w:rPr>
+          <w:vertAlign w:val="superscript"/>
+        </w:rPr>
+        <w:t xml:space="preserve">1</w:t>
+      </w:r>
+      <w:r>
+        <w:t xml:space="preserve">School of Computer Science, Faculty of Sciences, Holon Institute of Technology (HIT), Holon, Israel</w:t>
+      </w:r>
+      <w:r>
+        <w:br/>
+      </w:r>
+      <w:r>
+        <w:rPr>
+          <w:vertAlign w:val="superscript"/>
+        </w:rPr>
+        <w:t xml:space="preserve">2</w:t>
+      </w:r>
+      <w:r>
+        <w:t xml:space="preserve">Intelligent Systems, Afeka Academic College of Engineering, Tel-Aviv, Israel</w:t>
+      </w:r>
     </w:p>
     <w:bookmarkEnd w:id="25"/>
     <w:bookmarkStart w:id="26" w:name="abstract"/>

</xml_diff>

<commit_message>
Clearer, simpler abstract (plain-mechanism phrasing); make scarcity explicit (what is scarce and why)
Abstract rewritten in plain-mechanism terms and the opening now says what is scarce (the most valuable audience segments) and why (fine targeting makes many campaigns compete for the same high-response audiences). Regenerated all formats.

Co-Authored-By: Claude Opus 4.8 <noreply@anthropic.com>
</commit_message>
<xml_diff>
--- a/paper.docx
+++ b/paper.docx
@@ -140,23 +140,7 @@
         <w:pStyle w:val="FirstParagraph"/>
       </w:pPr>
       <w:r>
-        <w:t xml:space="preserve">A platform selling guaranteed impression quotas must decide, for each arriving user, which campaign’s booked impressions to spend, across many fine audience segments and under scarce supply. With quotas fixed, we show that only one quantity can make one allocation beat another: the campaign-by-segment</w:t>
-      </w:r>
-      <w:r>
-        <w:t xml:space="preserve"> </w:t>
-      </w:r>
-      <w:r>
-        <w:rPr>
-          <w:i/>
-          <w:iCs/>
-        </w:rPr>
-        <w:t xml:space="preserve">interaction</w:t>
-      </w:r>
-      <w:r>
-        <w:t xml:space="preserve"> </w:t>
-      </w:r>
-      <w:r>
-        <w:t xml:space="preserve">in click-through rate, what remains after campaign and segment effects wash out, and only where that interaction persists from the planning window to the serving window. This yields a rule an operator can commit to in advance: segment on the axes whose interaction persists, at the depth the per-cell data supports, then plan the allocation as a transportation program and pace by re-solving it.</w:t>
+        <w:t xml:space="preserve">An advertising platform that has sold delivery quotas must decide, for each visitor, which campaign’s impressions to spend across many narrow audience segments. The difficulty is that the most valuable segments are scarce: fine targeting makes many campaigns compete for the same high-response audiences, so an impression given to one campaign is denied to the others. With quotas fixed, what makes one allocation better than another is not how campaigns or audiences perform on average, but how well specific campaign-and-audience pairs fit, and only the part of that fit that stays stable from one time period to the next. This yields a rule a platform can commit to in advance: build segments from the pairings whose fit is stable, at the resolution the data can estimate, then plan the allocation and re-solve it as delivery proceeds.</w:t>
       </w:r>
     </w:p>
     <w:p>
@@ -164,7 +148,7 @@
         <w:pStyle w:val="BodyText"/>
       </w:pPr>
       <w:r>
-        <w:t xml:space="preserve">On three public advertising logs (Taobao, Avazu, Outbrain), under a replay protocol hardened against a self-scoring bias and validated on a known-truth benchmark, the rule picks the segmentation that pays, and the planned allocation beats both greedy serving and online price-learning pacing, which collapses under heavy contention. Contention sets the payoff: an uncontended market yields little to allocate, whatever the segmentation. The result is a three-step recipe: probe persistence to choose the segments, measure contention to decide whether planning is worth it, and solve, and re-solve, for the pacing prices.</w:t>
+        <w:t xml:space="preserve">On three public advertising logs (Taobao, Avazu, Outbrain), with a replay method guarded against grading a plan on its own estimates and verified against a synthetic market whose answer is known, planning this way beats both serving each impression to its best immediate match and learning delivery prices online, which fails under heavy demand. One condition sets the payoff: audiences must be contested; where supply is ample, planning adds little. The recipe is three steps: choose segments by stable fit, measure contention, and obtain prices by solving and re-solving the plan.</w:t>
       </w:r>
     </w:p>
     <w:bookmarkEnd w:id="26"/>

</xml_diff>

<commit_message>
Abstract: add use-case motivation (operator/retail-media, guaranteed delivery), the multiple-audiences-per-visitor setup, and the greedy coordination-failure framing
Co-Authored-By: Claude Opus 4.8 <noreply@anthropic.com>
</commit_message>
<xml_diff>
--- a/paper.docx
+++ b/paper.docx
@@ -140,7 +140,7 @@
         <w:pStyle w:val="FirstParagraph"/>
       </w:pPr>
       <w:r>
-        <w:t xml:space="preserve">An advertising platform that has sold delivery quotas must decide, for each visitor, which campaign’s impressions to spend across many narrow audience segments. The difficulty is that the most valuable segments are scarce: fine targeting makes many campaigns compete for the same high-response audiences, so an impression given to one campaign is denied to the others. With quotas fixed, what makes one allocation better than another is not how campaigns or audiences perform on average, but how well specific campaign-and-audience pairs fit, and only the part of that fit that stays stable from one time period to the next. This yields a rule a platform can commit to in advance: build segments from the pairings whose fit is stable, at the resolution the data can estimate, then plan the allocation and re-solve it as delivery proceeds.</w:t>
+        <w:t xml:space="preserve">On platforms that own rich first-party audience data, a mobile operator or a retail-media network, advertising is sold as guaranteed delivery: each campaign books a fixed number of impressions to a finely targeted audience, and the platform must fill that quota. A single visitor belongs to many of these audiences at once, so several campaigns are eligible for the same impression while only one can be served, and the most valuable audiences are the most contested. Serving each impression to whichever campaign is most likely to click it now spends these scarce, high-response segments on broadly popular campaigns, so campaigns that do well only on those segments are left with a poor match; the loss is a failure to coordinate, not a failure to predict. With the quotas fixed, what makes one allocation better than another is not how campaigns or audiences perform on average, but how well specific campaign-and-audience pairs fit, and only the part of that fit that stays stable from one time period to the next. This yields a rule a platform can commit to in advance: build segments from the pairings whose fit is stable, at the resolution the data can estimate, then plan the allocation and re-solve it as delivery proceeds.</w:t>
       </w:r>
     </w:p>
     <w:p>
@@ -148,7 +148,7 @@
         <w:pStyle w:val="BodyText"/>
       </w:pPr>
       <w:r>
-        <w:t xml:space="preserve">On three public advertising logs (Taobao, Avazu, Outbrain), with a replay method guarded against grading a plan on its own estimates and verified against a synthetic market whose answer is known, planning this way beats both serving each impression to its best immediate match and learning delivery prices online, which fails under heavy demand. One condition sets the payoff: audiences must be contested; where supply is ample, planning adds little. The recipe is three steps: choose segments by stable fit, measure contention, and obtain prices by solving and re-solving the plan.</w:t>
+        <w:t xml:space="preserve">On three public advertising logs (Taobao, Avazu, Outbrain), with a replay method guarded against grading a plan on its own estimates and verified against a synthetic market whose answer is known, planning this way beats both greedy serving and learning delivery prices online, which fails under heavy demand. One condition sets the payoff: audiences must be contested; where supply is ample, planning adds little. The recipe is three steps: choose segments by stable fit, measure contention, and obtain prices by solving and re-solving the plan.</w:t>
       </w:r>
     </w:p>
     <w:bookmarkEnd w:id="26"/>

</xml_diff>